<commit_message>
Permite repetir el número de carnet, recalcula alertas al registrar fechas anteriores, avisa la edad de 5 años y ordena usuarios por rol
Co-Authored-By: Claude Opus 5.5 <noreply@anthropic.com>
</commit_message>
<xml_diff>
--- a/docs/manuales/manual-tecnico.docx
+++ b/docs/manuales/manual-tecnico.docx
@@ -40,7 +40,7 @@
           <w:noProof/>
         </w:rPr>
         <w:drawing>
-          <wp:inline distT="0" distB="0" distL="0" distR="0" wp14:anchorId="4257255D" wp14:editId="244139CD">
+          <wp:inline distT="0" distB="0" distL="0" distR="0" wp14:anchorId="7CFA5954" wp14:editId="2B41DB16">
             <wp:extent cx="1619250" cy="1619250"/>
             <wp:effectExtent l="0" t="0" r="0" b="0"/>
             <wp:docPr id="1" name="Imagen 1"/>
@@ -568,7 +568,7 @@
     <w:sdt>
       <w:sdtPr>
         <w:alias w:val="Índice"/>
-        <w:id w:val="340972454"/>
+        <w:id w:val="-2034181381"/>
       </w:sdtPr>
       <w:sdtEndPr/>
       <w:sdtContent>
@@ -591,7 +591,7 @@
           <w:r>
             <w:fldChar w:fldCharType="separate"/>
           </w:r>
-          <w:hyperlink w:anchor="_Toc243432620" w:history="1">
+          <w:hyperlink w:anchor="_Toc243520959" w:history="1">
             <w:r>
               <w:rPr>
                 <w:rStyle w:val="Hipervnculo"/>
@@ -615,7 +615,7 @@
               <w:rPr>
                 <w:noProof/>
               </w:rPr>
-              <w:instrText xml:space="preserve"> PAGEREF _Toc243432620 \h </w:instrText>
+              <w:instrText xml:space="preserve"> PAGEREF _Toc243520959 \h </w:instrText>
             </w:r>
             <w:r>
               <w:rPr>
@@ -652,7 +652,7 @@
               <w:noProof/>
             </w:rPr>
           </w:pPr>
-          <w:hyperlink w:anchor="_Toc243432621" w:history="1">
+          <w:hyperlink w:anchor="_Toc243520960" w:history="1">
             <w:r>
               <w:rPr>
                 <w:rStyle w:val="Hipervnculo"/>
@@ -676,7 +676,7 @@
               <w:rPr>
                 <w:noProof/>
               </w:rPr>
-              <w:instrText xml:space="preserve"> PAGEREF _Toc243432621 \h </w:instrText>
+              <w:instrText xml:space="preserve"> PAGEREF _Toc243520960 \h </w:instrText>
             </w:r>
             <w:r>
               <w:rPr>
@@ -713,7 +713,7 @@
               <w:noProof/>
             </w:rPr>
           </w:pPr>
-          <w:hyperlink w:anchor="_Toc243432622" w:history="1">
+          <w:hyperlink w:anchor="_Toc243520961" w:history="1">
             <w:r>
               <w:rPr>
                 <w:rStyle w:val="Hipervnculo"/>
@@ -737,7 +737,7 @@
               <w:rPr>
                 <w:noProof/>
               </w:rPr>
-              <w:instrText xml:space="preserve"> PAGEREF _Toc243432622 \h </w:instrText>
+              <w:instrText xml:space="preserve"> PAGEREF _Toc243520961 \h </w:instrText>
             </w:r>
             <w:r>
               <w:rPr>
@@ -774,7 +774,7 @@
               <w:noProof/>
             </w:rPr>
           </w:pPr>
-          <w:hyperlink w:anchor="_Toc243432623" w:history="1">
+          <w:hyperlink w:anchor="_Toc243520962" w:history="1">
             <w:r>
               <w:rPr>
                 <w:rStyle w:val="Hipervnculo"/>
@@ -798,7 +798,7 @@
               <w:rPr>
                 <w:noProof/>
               </w:rPr>
-              <w:instrText xml:space="preserve"> PAGEREF _Toc243432623 \h </w:instrText>
+              <w:instrText xml:space="preserve"> PAGEREF _Toc243520962 \h </w:instrText>
             </w:r>
             <w:r>
               <w:rPr>
@@ -835,7 +835,7 @@
               <w:noProof/>
             </w:rPr>
           </w:pPr>
-          <w:hyperlink w:anchor="_Toc243432624" w:history="1">
+          <w:hyperlink w:anchor="_Toc243520963" w:history="1">
             <w:r>
               <w:rPr>
                 <w:rStyle w:val="Hipervnculo"/>
@@ -859,7 +859,7 @@
               <w:rPr>
                 <w:noProof/>
               </w:rPr>
-              <w:instrText xml:space="preserve"> PAGEREF _Toc243432624 \h </w:instrText>
+              <w:instrText xml:space="preserve"> PAGEREF _Toc243520963 \h </w:instrText>
             </w:r>
             <w:r>
               <w:rPr>
@@ -896,7 +896,7 @@
               <w:noProof/>
             </w:rPr>
           </w:pPr>
-          <w:hyperlink w:anchor="_Toc243432625" w:history="1">
+          <w:hyperlink w:anchor="_Toc243520964" w:history="1">
             <w:r>
               <w:rPr>
                 <w:rStyle w:val="Hipervnculo"/>
@@ -920,7 +920,7 @@
               <w:rPr>
                 <w:noProof/>
               </w:rPr>
-              <w:instrText xml:space="preserve"> PAGEREF _Toc243432625 \h </w:instrText>
+              <w:instrText xml:space="preserve"> PAGEREF _Toc243520964 \h </w:instrText>
             </w:r>
             <w:r>
               <w:rPr>
@@ -957,7 +957,7 @@
               <w:noProof/>
             </w:rPr>
           </w:pPr>
-          <w:hyperlink w:anchor="_Toc243432626" w:history="1">
+          <w:hyperlink w:anchor="_Toc243520965" w:history="1">
             <w:r>
               <w:rPr>
                 <w:rStyle w:val="Hipervnculo"/>
@@ -981,7 +981,7 @@
               <w:rPr>
                 <w:noProof/>
               </w:rPr>
-              <w:instrText xml:space="preserve"> PAGEREF _Toc243432626 \h </w:instrText>
+              <w:instrText xml:space="preserve"> PAGEREF _Toc243520965 \h </w:instrText>
             </w:r>
             <w:r>
               <w:rPr>
@@ -1018,7 +1018,7 @@
               <w:noProof/>
             </w:rPr>
           </w:pPr>
-          <w:hyperlink w:anchor="_Toc243432627" w:history="1">
+          <w:hyperlink w:anchor="_Toc243520966" w:history="1">
             <w:r>
               <w:rPr>
                 <w:rStyle w:val="Hipervnculo"/>
@@ -1042,7 +1042,7 @@
               <w:rPr>
                 <w:noProof/>
               </w:rPr>
-              <w:instrText xml:space="preserve"> PAGEREF _Toc243432627 \h </w:instrText>
+              <w:instrText xml:space="preserve"> PAGEREF _Toc243520966 \h </w:instrText>
             </w:r>
             <w:r>
               <w:rPr>
@@ -1079,7 +1079,7 @@
               <w:noProof/>
             </w:rPr>
           </w:pPr>
-          <w:hyperlink w:anchor="_Toc243432628" w:history="1">
+          <w:hyperlink w:anchor="_Toc243520967" w:history="1">
             <w:r>
               <w:rPr>
                 <w:rStyle w:val="Hipervnculo"/>
@@ -1103,7 +1103,7 @@
               <w:rPr>
                 <w:noProof/>
               </w:rPr>
-              <w:instrText xml:space="preserve"> PAGEREF _Toc243432628 \h </w:instrText>
+              <w:instrText xml:space="preserve"> PAGEREF _Toc243520967 \h </w:instrText>
             </w:r>
             <w:r>
               <w:rPr>
@@ -1140,7 +1140,7 @@
               <w:noProof/>
             </w:rPr>
           </w:pPr>
-          <w:hyperlink w:anchor="_Toc243432629" w:history="1">
+          <w:hyperlink w:anchor="_Toc243520968" w:history="1">
             <w:r>
               <w:rPr>
                 <w:rStyle w:val="Hipervnculo"/>
@@ -1164,7 +1164,7 @@
               <w:rPr>
                 <w:noProof/>
               </w:rPr>
-              <w:instrText xml:space="preserve"> PAGEREF _Toc243432629 \h </w:instrText>
+              <w:instrText xml:space="preserve"> PAGEREF _Toc243520968 \h </w:instrText>
             </w:r>
             <w:r>
               <w:rPr>
@@ -1201,7 +1201,7 @@
               <w:noProof/>
             </w:rPr>
           </w:pPr>
-          <w:hyperlink w:anchor="_Toc243432630" w:history="1">
+          <w:hyperlink w:anchor="_Toc243520969" w:history="1">
             <w:r>
               <w:rPr>
                 <w:rStyle w:val="Hipervnculo"/>
@@ -1225,7 +1225,7 @@
               <w:rPr>
                 <w:noProof/>
               </w:rPr>
-              <w:instrText xml:space="preserve"> PAGEREF _Toc243432630 \h </w:instrText>
+              <w:instrText xml:space="preserve"> PAGEREF _Toc243520969 \h </w:instrText>
             </w:r>
             <w:r>
               <w:rPr>
@@ -1262,7 +1262,7 @@
               <w:noProof/>
             </w:rPr>
           </w:pPr>
-          <w:hyperlink w:anchor="_Toc243432631" w:history="1">
+          <w:hyperlink w:anchor="_Toc243520970" w:history="1">
             <w:r>
               <w:rPr>
                 <w:rStyle w:val="Hipervnculo"/>
@@ -1286,7 +1286,7 @@
               <w:rPr>
                 <w:noProof/>
               </w:rPr>
-              <w:instrText xml:space="preserve"> PAGEREF _Toc243432631 \h </w:instrText>
+              <w:instrText xml:space="preserve"> PAGEREF _Toc243520970 \h </w:instrText>
             </w:r>
             <w:r>
               <w:rPr>
@@ -1323,7 +1323,7 @@
               <w:noProof/>
             </w:rPr>
           </w:pPr>
-          <w:hyperlink w:anchor="_Toc243432632" w:history="1">
+          <w:hyperlink w:anchor="_Toc243520971" w:history="1">
             <w:r>
               <w:rPr>
                 <w:rStyle w:val="Hipervnculo"/>
@@ -1347,7 +1347,7 @@
               <w:rPr>
                 <w:noProof/>
               </w:rPr>
-              <w:instrText xml:space="preserve"> PAGEREF _Toc243432632 \h </w:instrText>
+              <w:instrText xml:space="preserve"> PAGEREF _Toc243520971 \h </w:instrText>
             </w:r>
             <w:r>
               <w:rPr>
@@ -1384,7 +1384,7 @@
               <w:noProof/>
             </w:rPr>
           </w:pPr>
-          <w:hyperlink w:anchor="_Toc243432633" w:history="1">
+          <w:hyperlink w:anchor="_Toc243520972" w:history="1">
             <w:r>
               <w:rPr>
                 <w:rStyle w:val="Hipervnculo"/>
@@ -1408,7 +1408,7 @@
               <w:rPr>
                 <w:noProof/>
               </w:rPr>
-              <w:instrText xml:space="preserve"> PAGEREF _Toc243432633 \h </w:instrText>
+              <w:instrText xml:space="preserve"> PAGEREF _Toc243520972 \h </w:instrText>
             </w:r>
             <w:r>
               <w:rPr>
@@ -1445,7 +1445,7 @@
               <w:noProof/>
             </w:rPr>
           </w:pPr>
-          <w:hyperlink w:anchor="_Toc243432634" w:history="1">
+          <w:hyperlink w:anchor="_Toc243520973" w:history="1">
             <w:r>
               <w:rPr>
                 <w:rStyle w:val="Hipervnculo"/>
@@ -1469,7 +1469,7 @@
               <w:rPr>
                 <w:noProof/>
               </w:rPr>
-              <w:instrText xml:space="preserve"> PAGEREF _Toc243432634 \h </w:instrText>
+              <w:instrText xml:space="preserve"> PAGEREF _Toc243520973 \h </w:instrText>
             </w:r>
             <w:r>
               <w:rPr>
@@ -1506,7 +1506,7 @@
               <w:noProof/>
             </w:rPr>
           </w:pPr>
-          <w:hyperlink w:anchor="_Toc243432635" w:history="1">
+          <w:hyperlink w:anchor="_Toc243520974" w:history="1">
             <w:r>
               <w:rPr>
                 <w:rStyle w:val="Hipervnculo"/>
@@ -1530,7 +1530,7 @@
               <w:rPr>
                 <w:noProof/>
               </w:rPr>
-              <w:instrText xml:space="preserve"> PAGEREF _Toc243432635 \h </w:instrText>
+              <w:instrText xml:space="preserve"> PAGEREF _Toc243520974 \h </w:instrText>
             </w:r>
             <w:r>
               <w:rPr>
@@ -1567,7 +1567,7 @@
               <w:noProof/>
             </w:rPr>
           </w:pPr>
-          <w:hyperlink w:anchor="_Toc243432636" w:history="1">
+          <w:hyperlink w:anchor="_Toc243520975" w:history="1">
             <w:r>
               <w:rPr>
                 <w:rStyle w:val="Hipervnculo"/>
@@ -1591,7 +1591,7 @@
               <w:rPr>
                 <w:noProof/>
               </w:rPr>
-              <w:instrText xml:space="preserve"> PAGEREF _Toc243432636 \h </w:instrText>
+              <w:instrText xml:space="preserve"> PAGEREF _Toc243520975 \h </w:instrText>
             </w:r>
             <w:r>
               <w:rPr>
@@ -1628,7 +1628,7 @@
               <w:noProof/>
             </w:rPr>
           </w:pPr>
-          <w:hyperlink w:anchor="_Toc243432637" w:history="1">
+          <w:hyperlink w:anchor="_Toc243520976" w:history="1">
             <w:r>
               <w:rPr>
                 <w:rStyle w:val="Hipervnculo"/>
@@ -1652,7 +1652,7 @@
               <w:rPr>
                 <w:noProof/>
               </w:rPr>
-              <w:instrText xml:space="preserve"> PAGEREF _Toc243432637 \h </w:instrText>
+              <w:instrText xml:space="preserve"> PAGEREF _Toc243520976 \h </w:instrText>
             </w:r>
             <w:r>
               <w:rPr>
@@ -1689,7 +1689,7 @@
               <w:noProof/>
             </w:rPr>
           </w:pPr>
-          <w:hyperlink w:anchor="_Toc243432638" w:history="1">
+          <w:hyperlink w:anchor="_Toc243520977" w:history="1">
             <w:r>
               <w:rPr>
                 <w:rStyle w:val="Hipervnculo"/>
@@ -1713,7 +1713,7 @@
               <w:rPr>
                 <w:noProof/>
               </w:rPr>
-              <w:instrText xml:space="preserve"> PAGEREF _Toc243432638 \h </w:instrText>
+              <w:instrText xml:space="preserve"> PAGEREF _Toc243520977 \h </w:instrText>
             </w:r>
             <w:r>
               <w:rPr>
@@ -1750,7 +1750,7 @@
               <w:noProof/>
             </w:rPr>
           </w:pPr>
-          <w:hyperlink w:anchor="_Toc243432639" w:history="1">
+          <w:hyperlink w:anchor="_Toc243520978" w:history="1">
             <w:r>
               <w:rPr>
                 <w:rStyle w:val="Hipervnculo"/>
@@ -1774,7 +1774,7 @@
               <w:rPr>
                 <w:noProof/>
               </w:rPr>
-              <w:instrText xml:space="preserve"> PAGEREF _Toc243432639 \h </w:instrText>
+              <w:instrText xml:space="preserve"> PAGEREF _Toc243520978 \h </w:instrText>
             </w:r>
             <w:r>
               <w:rPr>
@@ -1811,7 +1811,7 @@
               <w:noProof/>
             </w:rPr>
           </w:pPr>
-          <w:hyperlink w:anchor="_Toc243432640" w:history="1">
+          <w:hyperlink w:anchor="_Toc243520979" w:history="1">
             <w:r>
               <w:rPr>
                 <w:rStyle w:val="Hipervnculo"/>
@@ -1835,7 +1835,7 @@
               <w:rPr>
                 <w:noProof/>
               </w:rPr>
-              <w:instrText xml:space="preserve"> PAGEREF _Toc243432640 \h </w:instrText>
+              <w:instrText xml:space="preserve"> PAGEREF _Toc243520979 \h </w:instrText>
             </w:r>
             <w:r>
               <w:rPr>
@@ -1872,7 +1872,7 @@
               <w:noProof/>
             </w:rPr>
           </w:pPr>
-          <w:hyperlink w:anchor="_Toc243432641" w:history="1">
+          <w:hyperlink w:anchor="_Toc243520980" w:history="1">
             <w:r>
               <w:rPr>
                 <w:rStyle w:val="Hipervnculo"/>
@@ -1896,7 +1896,7 @@
               <w:rPr>
                 <w:noProof/>
               </w:rPr>
-              <w:instrText xml:space="preserve"> PAGEREF _Toc243432641 \h </w:instrText>
+              <w:instrText xml:space="preserve"> PAGEREF _Toc243520980 \h </w:instrText>
             </w:r>
             <w:r>
               <w:rPr>
@@ -1933,7 +1933,7 @@
               <w:noProof/>
             </w:rPr>
           </w:pPr>
-          <w:hyperlink w:anchor="_Toc243432642" w:history="1">
+          <w:hyperlink w:anchor="_Toc243520981" w:history="1">
             <w:r>
               <w:rPr>
                 <w:rStyle w:val="Hipervnculo"/>
@@ -1957,7 +1957,7 @@
               <w:rPr>
                 <w:noProof/>
               </w:rPr>
-              <w:instrText xml:space="preserve"> PAGEREF _Toc243432642 \h </w:instrText>
+              <w:instrText xml:space="preserve"> PAGEREF _Toc243520981 \h </w:instrText>
             </w:r>
             <w:r>
               <w:rPr>
@@ -1994,7 +1994,7 @@
               <w:noProof/>
             </w:rPr>
           </w:pPr>
-          <w:hyperlink w:anchor="_Toc243432643" w:history="1">
+          <w:hyperlink w:anchor="_Toc243520982" w:history="1">
             <w:r>
               <w:rPr>
                 <w:rStyle w:val="Hipervnculo"/>
@@ -2018,7 +2018,7 @@
               <w:rPr>
                 <w:noProof/>
               </w:rPr>
-              <w:instrText xml:space="preserve"> PAGEREF _Toc243432643 \h </w:instrText>
+              <w:instrText xml:space="preserve"> PAGEREF _Toc243520982 \h </w:instrText>
             </w:r>
             <w:r>
               <w:rPr>
@@ -2055,7 +2055,7 @@
               <w:noProof/>
             </w:rPr>
           </w:pPr>
-          <w:hyperlink w:anchor="_Toc243432644" w:history="1">
+          <w:hyperlink w:anchor="_Toc243520983" w:history="1">
             <w:r>
               <w:rPr>
                 <w:rStyle w:val="Hipervnculo"/>
@@ -2079,7 +2079,7 @@
               <w:rPr>
                 <w:noProof/>
               </w:rPr>
-              <w:instrText xml:space="preserve"> PAGEREF _Toc243432644 \h </w:instrText>
+              <w:instrText xml:space="preserve"> PAGEREF _Toc243520983 \h </w:instrText>
             </w:r>
             <w:r>
               <w:rPr>
@@ -2116,7 +2116,7 @@
               <w:noProof/>
             </w:rPr>
           </w:pPr>
-          <w:hyperlink w:anchor="_Toc243432645" w:history="1">
+          <w:hyperlink w:anchor="_Toc243520984" w:history="1">
             <w:r>
               <w:rPr>
                 <w:rStyle w:val="Hipervnculo"/>
@@ -2140,7 +2140,7 @@
               <w:rPr>
                 <w:noProof/>
               </w:rPr>
-              <w:instrText xml:space="preserve"> PAGEREF _Toc243432645 \h </w:instrText>
+              <w:instrText xml:space="preserve"> PAGEREF _Toc243520984 \h </w:instrText>
             </w:r>
             <w:r>
               <w:rPr>
@@ -2177,7 +2177,7 @@
               <w:noProof/>
             </w:rPr>
           </w:pPr>
-          <w:hyperlink w:anchor="_Toc243432646" w:history="1">
+          <w:hyperlink w:anchor="_Toc243520985" w:history="1">
             <w:r>
               <w:rPr>
                 <w:rStyle w:val="Hipervnculo"/>
@@ -2201,7 +2201,7 @@
               <w:rPr>
                 <w:noProof/>
               </w:rPr>
-              <w:instrText xml:space="preserve"> PAGEREF _Toc243432646 \h </w:instrText>
+              <w:instrText xml:space="preserve"> PAGEREF _Toc243520985 \h </w:instrText>
             </w:r>
             <w:r>
               <w:rPr>
@@ -2238,7 +2238,7 @@
               <w:noProof/>
             </w:rPr>
           </w:pPr>
-          <w:hyperlink w:anchor="_Toc243432647" w:history="1">
+          <w:hyperlink w:anchor="_Toc243520986" w:history="1">
             <w:r>
               <w:rPr>
                 <w:rStyle w:val="Hipervnculo"/>
@@ -2262,7 +2262,7 @@
               <w:rPr>
                 <w:noProof/>
               </w:rPr>
-              <w:instrText xml:space="preserve"> PAGEREF _Toc243432647 \h </w:instrText>
+              <w:instrText xml:space="preserve"> PAGEREF _Toc243520986 \h </w:instrText>
             </w:r>
             <w:r>
               <w:rPr>
@@ -2299,7 +2299,7 @@
               <w:noProof/>
             </w:rPr>
           </w:pPr>
-          <w:hyperlink w:anchor="_Toc243432648" w:history="1">
+          <w:hyperlink w:anchor="_Toc243520987" w:history="1">
             <w:r>
               <w:rPr>
                 <w:rStyle w:val="Hipervnculo"/>
@@ -2323,7 +2323,7 @@
               <w:rPr>
                 <w:noProof/>
               </w:rPr>
-              <w:instrText xml:space="preserve"> PAGEREF _Toc243432648 \h </w:instrText>
+              <w:instrText xml:space="preserve"> PAGEREF _Toc243520987 \h </w:instrText>
             </w:r>
             <w:r>
               <w:rPr>
@@ -2360,7 +2360,7 @@
               <w:noProof/>
             </w:rPr>
           </w:pPr>
-          <w:hyperlink w:anchor="_Toc243432649" w:history="1">
+          <w:hyperlink w:anchor="_Toc243520988" w:history="1">
             <w:r>
               <w:rPr>
                 <w:rStyle w:val="Hipervnculo"/>
@@ -2384,7 +2384,7 @@
               <w:rPr>
                 <w:noProof/>
               </w:rPr>
-              <w:instrText xml:space="preserve"> PAGEREF _Toc243432649 \h </w:instrText>
+              <w:instrText xml:space="preserve"> PAGEREF _Toc243520988 \h </w:instrText>
             </w:r>
             <w:r>
               <w:rPr>
@@ -2421,7 +2421,7 @@
               <w:noProof/>
             </w:rPr>
           </w:pPr>
-          <w:hyperlink w:anchor="_Toc243432650" w:history="1">
+          <w:hyperlink w:anchor="_Toc243520989" w:history="1">
             <w:r>
               <w:rPr>
                 <w:rStyle w:val="Hipervnculo"/>
@@ -2445,7 +2445,7 @@
               <w:rPr>
                 <w:noProof/>
               </w:rPr>
-              <w:instrText xml:space="preserve"> PAGEREF _Toc243432650 \h </w:instrText>
+              <w:instrText xml:space="preserve"> PAGEREF _Toc243520989 \h </w:instrText>
             </w:r>
             <w:r>
               <w:rPr>
@@ -2482,7 +2482,7 @@
               <w:noProof/>
             </w:rPr>
           </w:pPr>
-          <w:hyperlink w:anchor="_Toc243432651" w:history="1">
+          <w:hyperlink w:anchor="_Toc243520990" w:history="1">
             <w:r>
               <w:rPr>
                 <w:rStyle w:val="Hipervnculo"/>
@@ -2506,7 +2506,7 @@
               <w:rPr>
                 <w:noProof/>
               </w:rPr>
-              <w:instrText xml:space="preserve"> PAGEREF _Toc243432651 \h </w:instrText>
+              <w:instrText xml:space="preserve"> PAGEREF _Toc243520990 \h </w:instrText>
             </w:r>
             <w:r>
               <w:rPr>
@@ -2543,7 +2543,7 @@
               <w:noProof/>
             </w:rPr>
           </w:pPr>
-          <w:hyperlink w:anchor="_Toc243432652" w:history="1">
+          <w:hyperlink w:anchor="_Toc243520991" w:history="1">
             <w:r>
               <w:rPr>
                 <w:rStyle w:val="Hipervnculo"/>
@@ -2567,7 +2567,7 @@
               <w:rPr>
                 <w:noProof/>
               </w:rPr>
-              <w:instrText xml:space="preserve"> PAGEREF _Toc243432652 \h </w:instrText>
+              <w:instrText xml:space="preserve"> PAGEREF _Toc243520991 \h </w:instrText>
             </w:r>
             <w:r>
               <w:rPr>
@@ -2604,7 +2604,7 @@
               <w:noProof/>
             </w:rPr>
           </w:pPr>
-          <w:hyperlink w:anchor="_Toc243432653" w:history="1">
+          <w:hyperlink w:anchor="_Toc243520992" w:history="1">
             <w:r>
               <w:rPr>
                 <w:rStyle w:val="Hipervnculo"/>
@@ -2628,7 +2628,7 @@
               <w:rPr>
                 <w:noProof/>
               </w:rPr>
-              <w:instrText xml:space="preserve"> PAGEREF _Toc243432653 \h </w:instrText>
+              <w:instrText xml:space="preserve"> PAGEREF _Toc243520992 \h </w:instrText>
             </w:r>
             <w:r>
               <w:rPr>
@@ -2665,7 +2665,7 @@
               <w:noProof/>
             </w:rPr>
           </w:pPr>
-          <w:hyperlink w:anchor="_Toc243432654" w:history="1">
+          <w:hyperlink w:anchor="_Toc243520993" w:history="1">
             <w:r>
               <w:rPr>
                 <w:rStyle w:val="Hipervnculo"/>
@@ -2689,7 +2689,7 @@
               <w:rPr>
                 <w:noProof/>
               </w:rPr>
-              <w:instrText xml:space="preserve"> PAGEREF _Toc243432654 \h </w:instrText>
+              <w:instrText xml:space="preserve"> PAGEREF _Toc243520993 \h </w:instrText>
             </w:r>
             <w:r>
               <w:rPr>
@@ -2726,7 +2726,7 @@
               <w:noProof/>
             </w:rPr>
           </w:pPr>
-          <w:hyperlink w:anchor="_Toc243432655" w:history="1">
+          <w:hyperlink w:anchor="_Toc243520994" w:history="1">
             <w:r>
               <w:rPr>
                 <w:rStyle w:val="Hipervnculo"/>
@@ -2750,7 +2750,7 @@
               <w:rPr>
                 <w:noProof/>
               </w:rPr>
-              <w:instrText xml:space="preserve"> PAGEREF _Toc243432655 \h </w:instrText>
+              <w:instrText xml:space="preserve"> PAGEREF _Toc243520994 \h </w:instrText>
             </w:r>
             <w:r>
               <w:rPr>
@@ -2787,7 +2787,7 @@
               <w:noProof/>
             </w:rPr>
           </w:pPr>
-          <w:hyperlink w:anchor="_Toc243432656" w:history="1">
+          <w:hyperlink w:anchor="_Toc243520995" w:history="1">
             <w:r>
               <w:rPr>
                 <w:rStyle w:val="Hipervnculo"/>
@@ -2811,7 +2811,7 @@
               <w:rPr>
                 <w:noProof/>
               </w:rPr>
-              <w:instrText xml:space="preserve"> PAGEREF _Toc243432656 \h </w:instrText>
+              <w:instrText xml:space="preserve"> PAGEREF _Toc243520995 \h </w:instrText>
             </w:r>
             <w:r>
               <w:rPr>
@@ -2848,7 +2848,7 @@
               <w:noProof/>
             </w:rPr>
           </w:pPr>
-          <w:hyperlink w:anchor="_Toc243432657" w:history="1">
+          <w:hyperlink w:anchor="_Toc243520996" w:history="1">
             <w:r>
               <w:rPr>
                 <w:rStyle w:val="Hipervnculo"/>
@@ -2872,7 +2872,7 @@
               <w:rPr>
                 <w:noProof/>
               </w:rPr>
-              <w:instrText xml:space="preserve"> PAGEREF _Toc243432657 \h </w:instrText>
+              <w:instrText xml:space="preserve"> PAGEREF _Toc243520996 \h </w:instrText>
             </w:r>
             <w:r>
               <w:rPr>
@@ -2909,7 +2909,7 @@
               <w:noProof/>
             </w:rPr>
           </w:pPr>
-          <w:hyperlink w:anchor="_Toc243432658" w:history="1">
+          <w:hyperlink w:anchor="_Toc243520997" w:history="1">
             <w:r>
               <w:rPr>
                 <w:rStyle w:val="Hipervnculo"/>
@@ -2933,7 +2933,7 @@
               <w:rPr>
                 <w:noProof/>
               </w:rPr>
-              <w:instrText xml:space="preserve"> PAGEREF _Toc243432658 \h </w:instrText>
+              <w:instrText xml:space="preserve"> PAGEREF _Toc243520997 \h </w:instrText>
             </w:r>
             <w:r>
               <w:rPr>
@@ -2970,7 +2970,7 @@
               <w:noProof/>
             </w:rPr>
           </w:pPr>
-          <w:hyperlink w:anchor="_Toc243432659" w:history="1">
+          <w:hyperlink w:anchor="_Toc243520998" w:history="1">
             <w:r>
               <w:rPr>
                 <w:rStyle w:val="Hipervnculo"/>
@@ -2994,7 +2994,7 @@
               <w:rPr>
                 <w:noProof/>
               </w:rPr>
-              <w:instrText xml:space="preserve"> PAGEREF _Toc243432659 \h </w:instrText>
+              <w:instrText xml:space="preserve"> PAGEREF _Toc243520998 \h </w:instrText>
             </w:r>
             <w:r>
               <w:rPr>
@@ -3033,7 +3033,7 @@
         <w:pStyle w:val="Ttulo1"/>
         <w:pageBreakBefore/>
       </w:pPr>
-      <w:bookmarkStart w:id="0" w:name="_Toc243432620"/>
+      <w:bookmarkStart w:id="0" w:name="_Toc243520959"/>
       <w:r>
         <w:t>1. Introducción</w:t>
       </w:r>
@@ -3071,7 +3071,7 @@
       <w:pPr>
         <w:pStyle w:val="Ttulo2"/>
       </w:pPr>
-      <w:bookmarkStart w:id="1" w:name="_Toc243432621"/>
+      <w:bookmarkStart w:id="1" w:name="_Toc243520960"/>
       <w:r>
         <w:t>1.1 Alcance del manual</w:t>
       </w:r>
@@ -3165,7 +3165,7 @@
       <w:pPr>
         <w:pStyle w:val="Ttulo1"/>
       </w:pPr>
-      <w:bookmarkStart w:id="2" w:name="_Toc243432622"/>
+      <w:bookmarkStart w:id="2" w:name="_Toc243520961"/>
       <w:r>
         <w:t>2. Descripción general del sistema</w:t>
       </w:r>
@@ -3194,7 +3194,7 @@
       <w:pPr>
         <w:pStyle w:val="Ttulo2"/>
       </w:pPr>
-      <w:bookmarkStart w:id="3" w:name="_Toc243432623"/>
+      <w:bookmarkStart w:id="3" w:name="_Toc243520962"/>
       <w:r>
         <w:t>2.1 Módulos</w:t>
       </w:r>
@@ -3942,7 +3942,7 @@
       <w:pPr>
         <w:pStyle w:val="Ttulo2"/>
       </w:pPr>
-      <w:bookmarkStart w:id="4" w:name="_Toc243432624"/>
+      <w:bookmarkStart w:id="4" w:name="_Toc243520963"/>
       <w:r>
         <w:t>2.2 Roles</w:t>
       </w:r>
@@ -4292,7 +4292,7 @@
       <w:pPr>
         <w:pStyle w:val="Ttulo1"/>
       </w:pPr>
-      <w:bookmarkStart w:id="5" w:name="_Toc243432625"/>
+      <w:bookmarkStart w:id="5" w:name="_Toc243520964"/>
       <w:r>
         <w:t>3. Requisitos</w:t>
       </w:r>
@@ -4302,7 +4302,7 @@
       <w:pPr>
         <w:pStyle w:val="Ttulo2"/>
       </w:pPr>
-      <w:bookmarkStart w:id="6" w:name="_Toc243432626"/>
+      <w:bookmarkStart w:id="6" w:name="_Toc243520965"/>
       <w:r>
         <w:t>3.1 Servidor</w:t>
       </w:r>
@@ -4974,7 +4974,7 @@
       <w:pPr>
         <w:pStyle w:val="Ttulo2"/>
       </w:pPr>
-      <w:bookmarkStart w:id="7" w:name="_Toc243432627"/>
+      <w:bookmarkStart w:id="7" w:name="_Toc243520966"/>
       <w:r>
         <w:t>3.2 Equipos de los usuarios</w:t>
       </w:r>
@@ -5023,7 +5023,7 @@
       <w:pPr>
         <w:pStyle w:val="Ttulo2"/>
       </w:pPr>
-      <w:bookmarkStart w:id="8" w:name="_Toc243432628"/>
+      <w:bookmarkStart w:id="8" w:name="_Toc243520967"/>
       <w:r>
         <w:t>3.3 Ambiente de desarrollo</w:t>
       </w:r>
@@ -5059,7 +5059,7 @@
       <w:pPr>
         <w:pStyle w:val="Ttulo2"/>
       </w:pPr>
-      <w:bookmarkStart w:id="9" w:name="_Toc243432629"/>
+      <w:bookmarkStart w:id="9" w:name="_Toc243520968"/>
       <w:r>
         <w:t>3.4 Ambientes</w:t>
       </w:r>
@@ -5409,7 +5409,7 @@
       <w:pPr>
         <w:pStyle w:val="Ttulo1"/>
       </w:pPr>
-      <w:bookmarkStart w:id="10" w:name="_Toc243432630"/>
+      <w:bookmarkStart w:id="10" w:name="_Toc243520969"/>
       <w:r>
         <w:t>4. Arquitectura</w:t>
       </w:r>
@@ -5778,7 +5778,7 @@
       <w:pPr>
         <w:pStyle w:val="Ttulo2"/>
       </w:pPr>
-      <w:bookmarkStart w:id="11" w:name="_Toc243432631"/>
+      <w:bookmarkStart w:id="11" w:name="_Toc243520970"/>
       <w:r>
         <w:t>4.1 Controlador frontal</w:t>
       </w:r>
@@ -6029,7 +6029,7 @@
       <w:pPr>
         <w:pStyle w:val="Ttulo2"/>
       </w:pPr>
-      <w:bookmarkStart w:id="12" w:name="_Toc243432632"/>
+      <w:bookmarkStart w:id="12" w:name="_Toc243520971"/>
       <w:r>
         <w:t>4.2 Acciones del controlador</w:t>
       </w:r>
@@ -7506,7 +7506,7 @@
       <w:pPr>
         <w:pStyle w:val="Ttulo1"/>
       </w:pPr>
-      <w:bookmarkStart w:id="13" w:name="_Toc243432633"/>
+      <w:bookmarkStart w:id="13" w:name="_Toc243520972"/>
       <w:r>
         <w:t>5. Estructura del proyecto</w:t>
       </w:r>
@@ -8643,7 +8643,7 @@
       <w:pPr>
         <w:pStyle w:val="Ttulo1"/>
       </w:pPr>
-      <w:bookmarkStart w:id="14" w:name="_Toc243432634"/>
+      <w:bookmarkStart w:id="14" w:name="_Toc243520973"/>
       <w:r>
         <w:t>6. Componentes del código</w:t>
       </w:r>
@@ -9813,7 +9813,7 @@
                 <w:sz w:val="17"/>
                 <w:szCs w:val="17"/>
               </w:rPr>
-              <w:t>crear, actualizar, listar, carnetRepetido, permisoEscritura, egresarPorEdad</w:t>
+              <w:t>crear, actualizar, listar, permisoEscritura, egresarPorEdad</w:t>
             </w:r>
           </w:p>
         </w:tc>
@@ -10110,7 +10110,7 @@
                 <w:sz w:val="17"/>
                 <w:szCs w:val="17"/>
               </w:rPr>
-              <w:t>Nivel de alerta, evolución y panel</w:t>
+              <w:t>Nivel de alerta, evolución y panel; al registrar o anular una medición, vuelve a comparar las posteriores</w:t>
             </w:r>
           </w:p>
         </w:tc>
@@ -10135,7 +10135,7 @@
                 <w:sz w:val="17"/>
                 <w:szCs w:val="17"/>
               </w:rPr>
-              <w:t>generar, panelSeguimiento, resumenNiveles</w:t>
+              <w:t>generar, regenerarPosteriores, panelSeguimiento, resumenNiveles</w:t>
             </w:r>
           </w:p>
         </w:tc>
@@ -10593,7 +10593,7 @@
                 <w:sz w:val="17"/>
                 <w:szCs w:val="17"/>
               </w:rPr>
-              <w:t>Gestión de cuentas</w:t>
+              <w:t>Gestión de cuentas (lista por nombre o por rol)</w:t>
             </w:r>
           </w:p>
         </w:tc>
@@ -10618,7 +10618,7 @@
                 <w:sz w:val="17"/>
                 <w:szCs w:val="17"/>
               </w:rPr>
-              <w:t>crear, actualizar, restablecerContrasena, cambiarEstado</w:t>
+              <w:t>listar, crear, actualizar, restablecerContrasena, cambiarEstado</w:t>
             </w:r>
           </w:p>
         </w:tc>
@@ -10633,7 +10633,7 @@
       <w:pPr>
         <w:pStyle w:val="Ttulo1"/>
       </w:pPr>
-      <w:bookmarkStart w:id="15" w:name="_Toc243432635"/>
+      <w:bookmarkStart w:id="15" w:name="_Toc243520974"/>
       <w:r>
         <w:t>7. Base de datos</w:t>
       </w:r>
@@ -10693,7 +10693,7 @@
       <w:pPr>
         <w:pStyle w:val="Ttulo2"/>
       </w:pPr>
-      <w:bookmarkStart w:id="16" w:name="_Toc243432636"/>
+      <w:bookmarkStart w:id="16" w:name="_Toc243520975"/>
       <w:r>
         <w:t>7.1 Modelo</w:t>
       </w:r>
@@ -10823,7 +10823,7 @@
       <w:pPr>
         <w:pStyle w:val="Ttulo2"/>
       </w:pPr>
-      <w:bookmarkStart w:id="17" w:name="_Toc243432637"/>
+      <w:bookmarkStart w:id="17" w:name="_Toc243520976"/>
       <w:r>
         <w:t>7.2 Reglas de integridad</w:t>
       </w:r>
@@ -10901,7 +10901,7 @@
       <w:pPr>
         <w:pStyle w:val="Ttulo2"/>
       </w:pPr>
-      <w:bookmarkStart w:id="18" w:name="_Toc243432638"/>
+      <w:bookmarkStart w:id="18" w:name="_Toc243520977"/>
       <w:r>
         <w:t>7.3 Diccionario de datos</w:t>
       </w:r>
@@ -20134,7 +20134,7 @@
                 <w:sz w:val="17"/>
                 <w:szCs w:val="17"/>
               </w:rPr>
-              <w:t>Número de carnet del puesto (opcional, único en el puesto); es la historia clínica del SIGSA 3</w:t>
+              <w:t>Número de carnet (opcional): el del cuadernillo y el año, por ejemplo 5-2024; lo comparten varios niños. Es la historia clínica del SIGSA 3</w:t>
             </w:r>
           </w:p>
         </w:tc>
@@ -34682,7 +34682,7 @@
       <w:pPr>
         <w:pStyle w:val="Ttulo1"/>
       </w:pPr>
-      <w:bookmarkStart w:id="19" w:name="_Toc243432639"/>
+      <w:bookmarkStart w:id="19" w:name="_Toc243520978"/>
       <w:r>
         <w:t>8. Motor de cálculo</w:t>
       </w:r>
@@ -34766,7 +34766,7 @@
       <w:pPr>
         <w:pStyle w:val="Ttulo2"/>
       </w:pPr>
-      <w:bookmarkStart w:id="20" w:name="_Toc243432640"/>
+      <w:bookmarkStart w:id="20" w:name="_Toc243520979"/>
       <w:r>
         <w:t>8.1 Reglas de la OMS aplicadas</w:t>
       </w:r>
@@ -34856,7 +34856,7 @@
       <w:pPr>
         <w:pStyle w:val="Ttulo2"/>
       </w:pPr>
-      <w:bookmarkStart w:id="21" w:name="_Toc243432641"/>
+      <w:bookmarkStart w:id="21" w:name="_Toc243520980"/>
       <w:r>
         <w:t>8.2 Clasificación por indicador</w:t>
       </w:r>
@@ -35534,7 +35534,7 @@
       <w:pPr>
         <w:pStyle w:val="Ttulo2"/>
       </w:pPr>
-      <w:bookmarkStart w:id="22" w:name="_Toc243432642"/>
+      <w:bookmarkStart w:id="22" w:name="_Toc243520981"/>
       <w:r>
         <w:t>8.3 Niveles de alerta</w:t>
       </w:r>
@@ -36163,7 +36163,7 @@
       <w:pPr>
         <w:pStyle w:val="Ttulo2"/>
       </w:pPr>
-      <w:bookmarkStart w:id="23" w:name="_Toc243432643"/>
+      <w:bookmarkStart w:id="23" w:name="_Toc243520982"/>
       <w:r>
         <w:t>8.4 Pruebas y recálculo</w:t>
       </w:r>
@@ -36239,7 +36239,7 @@
       <w:pPr>
         <w:pStyle w:val="Ttulo1"/>
       </w:pPr>
-      <w:bookmarkStart w:id="24" w:name="_Toc243432644"/>
+      <w:bookmarkStart w:id="24" w:name="_Toc243520983"/>
       <w:r>
         <w:t>9. Seguridad</w:t>
       </w:r>
@@ -37277,7 +37277,7 @@
       <w:pPr>
         <w:pStyle w:val="Ttulo1"/>
       </w:pPr>
-      <w:bookmarkStart w:id="25" w:name="_Toc243432645"/>
+      <w:bookmarkStart w:id="25" w:name="_Toc243520984"/>
       <w:r>
         <w:t>10. Reportes y formatos</w:t>
       </w:r>
@@ -37438,7 +37438,7 @@
       <w:pPr>
         <w:pStyle w:val="Ttulo1"/>
       </w:pPr>
-      <w:bookmarkStart w:id="26" w:name="_Toc243432646"/>
+      <w:bookmarkStart w:id="26" w:name="_Toc243520985"/>
       <w:r>
         <w:t>11. Instalación y despliegue</w:t>
       </w:r>
@@ -37468,7 +37468,7 @@
       <w:pPr>
         <w:pStyle w:val="Ttulo2"/>
       </w:pPr>
-      <w:bookmarkStart w:id="27" w:name="_Toc243432647"/>
+      <w:bookmarkStart w:id="27" w:name="_Toc243520986"/>
       <w:r>
         <w:t>11.1 Pasos</w:t>
       </w:r>
@@ -37725,7 +37725,7 @@
       <w:pPr>
         <w:pStyle w:val="Ttulo2"/>
       </w:pPr>
-      <w:bookmarkStart w:id="28" w:name="_Toc243432648"/>
+      <w:bookmarkStart w:id="28" w:name="_Toc243520987"/>
       <w:r>
         <w:t>11.2 Configuración (config/config.php)</w:t>
       </w:r>
@@ -38370,7 +38370,7 @@
       <w:pPr>
         <w:pStyle w:val="Ttulo2"/>
       </w:pPr>
-      <w:bookmarkStart w:id="29" w:name="_Toc243432649"/>
+      <w:bookmarkStart w:id="29" w:name="_Toc243520988"/>
       <w:r>
         <w:t>11.3 Ambiente de demostración</w:t>
       </w:r>
@@ -38433,7 +38433,7 @@
       <w:pPr>
         <w:pStyle w:val="Ttulo2"/>
       </w:pPr>
-      <w:bookmarkStart w:id="30" w:name="_Toc243432650"/>
+      <w:bookmarkStart w:id="30" w:name="_Toc243520989"/>
       <w:r>
         <w:t>11.4 Sin consola</w:t>
       </w:r>
@@ -38507,7 +38507,7 @@
       <w:pPr>
         <w:pStyle w:val="Ttulo1"/>
       </w:pPr>
-      <w:bookmarkStart w:id="31" w:name="_Toc243432651"/>
+      <w:bookmarkStart w:id="31" w:name="_Toc243520990"/>
       <w:r>
         <w:t>12. Mantenimiento</w:t>
       </w:r>
@@ -38517,7 +38517,7 @@
       <w:pPr>
         <w:pStyle w:val="Ttulo2"/>
       </w:pPr>
-      <w:bookmarkStart w:id="32" w:name="_Toc243432652"/>
+      <w:bookmarkStart w:id="32" w:name="_Toc243520991"/>
       <w:r>
         <w:t>12.1 Actualizar el sistema</w:t>
       </w:r>
@@ -38663,7 +38663,7 @@
       <w:pPr>
         <w:pStyle w:val="Ttulo2"/>
       </w:pPr>
-      <w:bookmarkStart w:id="33" w:name="_Toc243432653"/>
+      <w:bookmarkStart w:id="33" w:name="_Toc243520992"/>
       <w:r>
         <w:t>12.2 Respaldo de la base de datos</w:t>
       </w:r>
@@ -38699,7 +38699,7 @@
       <w:pPr>
         <w:pStyle w:val="Ttulo2"/>
       </w:pPr>
-      <w:bookmarkStart w:id="34" w:name="_Toc243432654"/>
+      <w:bookmarkStart w:id="34" w:name="_Toc243520993"/>
       <w:r>
         <w:t>12.3 Scripts de línea de comandos</w:t>
       </w:r>
@@ -39225,7 +39225,7 @@
       <w:pPr>
         <w:pStyle w:val="Ttulo2"/>
       </w:pPr>
-      <w:bookmarkStart w:id="35" w:name="_Toc243432655"/>
+      <w:bookmarkStart w:id="35" w:name="_Toc243520994"/>
       <w:r>
         <w:t>12.4 Tareas automáticas</w:t>
       </w:r>
@@ -39255,7 +39255,7 @@
       <w:pPr>
         <w:pStyle w:val="Ttulo2"/>
       </w:pPr>
-      <w:bookmarkStart w:id="36" w:name="_Toc243432656"/>
+      <w:bookmarkStart w:id="36" w:name="_Toc243520995"/>
       <w:r>
         <w:t>12.5 Recuperación de emergencia del administrador</w:t>
       </w:r>
@@ -39285,7 +39285,7 @@
       <w:pPr>
         <w:pStyle w:val="Ttulo2"/>
       </w:pPr>
-      <w:bookmarkStart w:id="37" w:name="_Toc243432657"/>
+      <w:bookmarkStart w:id="37" w:name="_Toc243520996"/>
       <w:r>
         <w:t>12.6 Paso de ambiente de prueba a producción</w:t>
       </w:r>
@@ -39315,7 +39315,7 @@
       <w:pPr>
         <w:pStyle w:val="Ttulo1"/>
       </w:pPr>
-      <w:bookmarkStart w:id="38" w:name="_Toc243432658"/>
+      <w:bookmarkStart w:id="38" w:name="_Toc243520997"/>
       <w:r>
         <w:t>13. Solución de problemas</w:t>
       </w:r>
@@ -40008,7 +40008,7 @@
       <w:pPr>
         <w:pStyle w:val="Ttulo1"/>
       </w:pPr>
-      <w:bookmarkStart w:id="39" w:name="_Toc243432659"/>
+      <w:bookmarkStart w:id="39" w:name="_Toc243520998"/>
       <w:r>
         <w:t>14. Trabajo pendiente</w:t>
       </w:r>
@@ -40178,10 +40178,10 @@
 <file path=word/numbering.xml><?xml version="1.0" encoding="utf-8"?>
 <w:numbering xmlns:wpc="http://schemas.microsoft.com/office/word/2010/wordprocessingCanvas" xmlns:cx="http://schemas.microsoft.com/office/drawing/2014/chartex" xmlns:cx1="http://schemas.microsoft.com/office/drawing/2015/9/8/chartex" xmlns:cx2="http://schemas.microsoft.com/office/drawing/2015/10/21/chartex" xmlns:cx3="http://schemas.microsoft.com/office/drawing/2016/5/9/chartex" xmlns:cx4="http://schemas.microsoft.com/office/drawing/2016/5/10/chartex" xmlns:cx5="http://schemas.microsoft.com/office/drawing/2016/5/11/chartex" xmlns:cx6="http://schemas.microsoft.com/office/drawing/2016/5/12/chartex" xmlns:cx7="http://schemas.microsoft.com/office/drawing/2016/5/13/chartex" xmlns:cx8="http://schemas.microsoft.com/office/drawing/2016/5/14/chartex" xmlns:mc="http://schemas.openxmlformats.org/markup-compatibility/2006" xmlns:aink="http://schemas.microsoft.com/office/drawing/2016/ink" xmlns:am3d="http://schemas.microsoft.com/office/drawing/2017/model3d" xmlns:o="urn:schemas-microsoft-com:office:office" xmlns:oel="http://schemas.microsoft.com/office/2019/extlst" xmlns:r="http://schemas.openxmlformats.org/officeDocument/2006/relationships" xmlns:m="http://schemas.openxmlformats.org/officeDocument/2006/math" xmlns:v="urn:schemas-microsoft-com:vml" xmlns:wp14="http://schemas.microsoft.com/office/word/2010/wordprocessingDrawing" xmlns:wp="http://schemas.openxmlformats.org/drawingml/2006/wordprocessingDrawing" xmlns:w10="urn:schemas-microsoft-com:office:word" xmlns:w="http://schemas.openxmlformats.org/wordprocessingml/2006/main" xmlns:w14="http://schemas.microsoft.com/office/word/2010/wordml" xmlns:w15="http://schemas.microsoft.com/office/word/2012/wordml" xmlns:w16cex="http://schemas.microsoft.com/office/word/2018/wordml/cex" xmlns:w16cid="http://schemas.microsoft.com/office/word/2016/wordml/cid" xmlns:w16="http://schemas.microsoft.com/office/word/2018/wordml" xmlns:w16du="http://schemas.microsoft.com/office/word/2023/wordml/word16du" xmlns:w16sdtdh="http://schemas.microsoft.com/office/word/2020/wordml/sdtdatahash" xmlns:w16sdtfl="http://schemas.microsoft.com/office/word/2024/wordml/sdtformatlock" xmlns:w16se="http://schemas.microsoft.com/office/word/2015/wordml/symex" xmlns:wpg="http://schemas.microsoft.com/office/word/2010/wordprocessingGroup" xmlns:wpi="http://schemas.microsoft.com/office/word/2010/wordprocessingInk" xmlns:wne="http://schemas.microsoft.com/office/word/2006/wordml" xmlns:wps="http://schemas.microsoft.com/office/word/2010/wordprocessingShape" mc:Ignorable="w14 w15 w16se w16cid w16 w16cex w16sdtdh w16sdtfl w16du wp14">
   <w:abstractNum w:abstractNumId="0" w15:restartNumberingAfterBreak="0">
-    <w:nsid w:val="01DD2529"/>
+    <w:nsid w:val="0A8C3B3E"/>
     <w:multiLevelType w:val="hybridMultilevel"/>
-    <w:tmpl w:val="83F0F994"/>
-    <w:lvl w:ilvl="0" w:tplc="3818669E" w:tentative="1">
+    <w:tmpl w:val="03A8B7B6"/>
+    <w:lvl w:ilvl="0" w:tplc="7964587C" w:tentative="1">
       <w:start w:val="1"/>
       <w:numFmt w:val="decimal"/>
       <w:lvlText w:val="%1."/>
@@ -40194,52 +40194,52 @@
         <w:bCs/>
       </w:rPr>
     </w:lvl>
-    <w:lvl w:ilvl="1" w:tplc="197AA582">
+    <w:lvl w:ilvl="1" w:tplc="0B480636">
       <w:numFmt w:val="decimal"/>
       <w:lvlText w:val=""/>
       <w:lvlJc w:val="left"/>
     </w:lvl>
-    <w:lvl w:ilvl="2" w:tplc="E85C9C8A">
+    <w:lvl w:ilvl="2" w:tplc="82C06B14">
       <w:numFmt w:val="decimal"/>
       <w:lvlText w:val=""/>
       <w:lvlJc w:val="left"/>
     </w:lvl>
-    <w:lvl w:ilvl="3" w:tplc="F060490A">
+    <w:lvl w:ilvl="3" w:tplc="3C3C3780">
       <w:numFmt w:val="decimal"/>
       <w:lvlText w:val=""/>
       <w:lvlJc w:val="left"/>
     </w:lvl>
-    <w:lvl w:ilvl="4" w:tplc="6B587560">
+    <w:lvl w:ilvl="4" w:tplc="84A64D34">
       <w:numFmt w:val="decimal"/>
       <w:lvlText w:val=""/>
       <w:lvlJc w:val="left"/>
     </w:lvl>
-    <w:lvl w:ilvl="5" w:tplc="5DBE959C">
+    <w:lvl w:ilvl="5" w:tplc="4BB868F0">
       <w:numFmt w:val="decimal"/>
       <w:lvlText w:val=""/>
       <w:lvlJc w:val="left"/>
     </w:lvl>
-    <w:lvl w:ilvl="6" w:tplc="FE0EE1EE">
+    <w:lvl w:ilvl="6" w:tplc="4EF6ABBA">
       <w:numFmt w:val="decimal"/>
       <w:lvlText w:val=""/>
       <w:lvlJc w:val="left"/>
     </w:lvl>
-    <w:lvl w:ilvl="7" w:tplc="2A2659C4">
+    <w:lvl w:ilvl="7" w:tplc="9654BDAA">
       <w:numFmt w:val="decimal"/>
       <w:lvlText w:val=""/>
       <w:lvlJc w:val="left"/>
     </w:lvl>
-    <w:lvl w:ilvl="8" w:tplc="23E6A764">
+    <w:lvl w:ilvl="8" w:tplc="A260BC02">
       <w:numFmt w:val="decimal"/>
       <w:lvlText w:val=""/>
       <w:lvlJc w:val="left"/>
     </w:lvl>
   </w:abstractNum>
   <w:abstractNum w:abstractNumId="1" w15:restartNumberingAfterBreak="0">
-    <w:nsid w:val="1FDB4057"/>
+    <w:nsid w:val="11C15587"/>
     <w:multiLevelType w:val="hybridMultilevel"/>
-    <w:tmpl w:val="3464479C"/>
-    <w:lvl w:ilvl="0" w:tplc="AF9C910E">
+    <w:tmpl w:val="D13CA024"/>
+    <w:lvl w:ilvl="0" w:tplc="17C2EFDE" w:tentative="1">
       <w:start w:val="1"/>
       <w:numFmt w:val="decimal"/>
       <w:lvlText w:val="%1."/>
@@ -40252,52 +40252,52 @@
         <w:bCs/>
       </w:rPr>
     </w:lvl>
-    <w:lvl w:ilvl="1" w:tplc="44EC7D0A">
+    <w:lvl w:ilvl="1" w:tplc="ABE2B1DA">
       <w:numFmt w:val="decimal"/>
       <w:lvlText w:val=""/>
       <w:lvlJc w:val="left"/>
     </w:lvl>
-    <w:lvl w:ilvl="2" w:tplc="63BEFEE8">
+    <w:lvl w:ilvl="2" w:tplc="9788C99C">
       <w:numFmt w:val="decimal"/>
       <w:lvlText w:val=""/>
       <w:lvlJc w:val="left"/>
     </w:lvl>
-    <w:lvl w:ilvl="3" w:tplc="9886E610">
+    <w:lvl w:ilvl="3" w:tplc="F1CE061C">
       <w:numFmt w:val="decimal"/>
       <w:lvlText w:val=""/>
       <w:lvlJc w:val="left"/>
     </w:lvl>
-    <w:lvl w:ilvl="4" w:tplc="AC5E2696">
+    <w:lvl w:ilvl="4" w:tplc="9BF22AB8">
       <w:numFmt w:val="decimal"/>
       <w:lvlText w:val=""/>
       <w:lvlJc w:val="left"/>
     </w:lvl>
-    <w:lvl w:ilvl="5" w:tplc="C73278F2">
+    <w:lvl w:ilvl="5" w:tplc="2536E06C">
       <w:numFmt w:val="decimal"/>
       <w:lvlText w:val=""/>
       <w:lvlJc w:val="left"/>
     </w:lvl>
-    <w:lvl w:ilvl="6" w:tplc="5164CA64">
+    <w:lvl w:ilvl="6" w:tplc="334C560E">
       <w:numFmt w:val="decimal"/>
       <w:lvlText w:val=""/>
       <w:lvlJc w:val="left"/>
     </w:lvl>
-    <w:lvl w:ilvl="7" w:tplc="1A7A3190">
+    <w:lvl w:ilvl="7" w:tplc="E5BC0862">
       <w:numFmt w:val="decimal"/>
       <w:lvlText w:val=""/>
       <w:lvlJc w:val="left"/>
     </w:lvl>
-    <w:lvl w:ilvl="8" w:tplc="C8E0DAF6">
+    <w:lvl w:ilvl="8" w:tplc="DB26C422">
       <w:numFmt w:val="decimal"/>
       <w:lvlText w:val=""/>
       <w:lvlJc w:val="left"/>
     </w:lvl>
   </w:abstractNum>
   <w:abstractNum w:abstractNumId="2" w15:restartNumberingAfterBreak="0">
-    <w:nsid w:val="2DFE1E3E"/>
+    <w:nsid w:val="15325038"/>
     <w:multiLevelType w:val="hybridMultilevel"/>
-    <w:tmpl w:val="BDAA93BC"/>
-    <w:lvl w:ilvl="0" w:tplc="036E1274" w:tentative="1">
+    <w:tmpl w:val="91222C16"/>
+    <w:lvl w:ilvl="0" w:tplc="D2940F06" w:tentative="1">
       <w:start w:val="1"/>
       <w:numFmt w:val="decimal"/>
       <w:lvlText w:val="%1."/>
@@ -40310,52 +40310,52 @@
         <w:bCs/>
       </w:rPr>
     </w:lvl>
-    <w:lvl w:ilvl="1" w:tplc="539E5760">
+    <w:lvl w:ilvl="1" w:tplc="B6B4907A">
       <w:numFmt w:val="decimal"/>
       <w:lvlText w:val=""/>
       <w:lvlJc w:val="left"/>
     </w:lvl>
-    <w:lvl w:ilvl="2" w:tplc="71F41BE2">
+    <w:lvl w:ilvl="2" w:tplc="403CACF2">
       <w:numFmt w:val="decimal"/>
       <w:lvlText w:val=""/>
       <w:lvlJc w:val="left"/>
     </w:lvl>
-    <w:lvl w:ilvl="3" w:tplc="11BE0562">
+    <w:lvl w:ilvl="3" w:tplc="6B5E6EC4">
       <w:numFmt w:val="decimal"/>
       <w:lvlText w:val=""/>
       <w:lvlJc w:val="left"/>
     </w:lvl>
-    <w:lvl w:ilvl="4" w:tplc="E152AA0A">
+    <w:lvl w:ilvl="4" w:tplc="E4EE2182">
       <w:numFmt w:val="decimal"/>
       <w:lvlText w:val=""/>
       <w:lvlJc w:val="left"/>
     </w:lvl>
-    <w:lvl w:ilvl="5" w:tplc="D5F0EA92">
+    <w:lvl w:ilvl="5" w:tplc="D80A911C">
       <w:numFmt w:val="decimal"/>
       <w:lvlText w:val=""/>
       <w:lvlJc w:val="left"/>
     </w:lvl>
-    <w:lvl w:ilvl="6" w:tplc="77E8A0BA">
+    <w:lvl w:ilvl="6" w:tplc="51C09FE4">
       <w:numFmt w:val="decimal"/>
       <w:lvlText w:val=""/>
       <w:lvlJc w:val="left"/>
     </w:lvl>
-    <w:lvl w:ilvl="7" w:tplc="9F2A95FC">
+    <w:lvl w:ilvl="7" w:tplc="92C640FA">
       <w:numFmt w:val="decimal"/>
       <w:lvlText w:val=""/>
       <w:lvlJc w:val="left"/>
     </w:lvl>
-    <w:lvl w:ilvl="8" w:tplc="7D5EFD96">
+    <w:lvl w:ilvl="8" w:tplc="3BF8F2AC">
       <w:numFmt w:val="decimal"/>
       <w:lvlText w:val=""/>
       <w:lvlJc w:val="left"/>
     </w:lvl>
   </w:abstractNum>
   <w:abstractNum w:abstractNumId="3" w15:restartNumberingAfterBreak="0">
-    <w:nsid w:val="32871E67"/>
+    <w:nsid w:val="20B9098B"/>
     <w:multiLevelType w:val="hybridMultilevel"/>
-    <w:tmpl w:val="3D1001BC"/>
-    <w:lvl w:ilvl="0" w:tplc="CD6C4B90">
+    <w:tmpl w:val="B48CFBE8"/>
+    <w:lvl w:ilvl="0" w:tplc="80641940" w:tentative="1">
       <w:start w:val="1"/>
       <w:numFmt w:val="decimal"/>
       <w:lvlText w:val="%1."/>
@@ -40368,52 +40368,52 @@
         <w:bCs/>
       </w:rPr>
     </w:lvl>
-    <w:lvl w:ilvl="1" w:tplc="38E8AE56">
+    <w:lvl w:ilvl="1" w:tplc="ED1CE4BA">
       <w:numFmt w:val="decimal"/>
       <w:lvlText w:val=""/>
       <w:lvlJc w:val="left"/>
     </w:lvl>
-    <w:lvl w:ilvl="2" w:tplc="C004DB5E">
+    <w:lvl w:ilvl="2" w:tplc="3A9CC54E">
       <w:numFmt w:val="decimal"/>
       <w:lvlText w:val=""/>
       <w:lvlJc w:val="left"/>
     </w:lvl>
-    <w:lvl w:ilvl="3" w:tplc="5638F820">
+    <w:lvl w:ilvl="3" w:tplc="F6C23964">
       <w:numFmt w:val="decimal"/>
       <w:lvlText w:val=""/>
       <w:lvlJc w:val="left"/>
     </w:lvl>
-    <w:lvl w:ilvl="4" w:tplc="8B944D8C">
+    <w:lvl w:ilvl="4" w:tplc="2BACBC1C">
       <w:numFmt w:val="decimal"/>
       <w:lvlText w:val=""/>
       <w:lvlJc w:val="left"/>
     </w:lvl>
-    <w:lvl w:ilvl="5" w:tplc="82D0F3BA">
+    <w:lvl w:ilvl="5" w:tplc="05C00D06">
       <w:numFmt w:val="decimal"/>
       <w:lvlText w:val=""/>
       <w:lvlJc w:val="left"/>
     </w:lvl>
-    <w:lvl w:ilvl="6" w:tplc="D0AAA638">
+    <w:lvl w:ilvl="6" w:tplc="E98AD29C">
       <w:numFmt w:val="decimal"/>
       <w:lvlText w:val=""/>
       <w:lvlJc w:val="left"/>
     </w:lvl>
-    <w:lvl w:ilvl="7" w:tplc="2854892C">
+    <w:lvl w:ilvl="7" w:tplc="6A90A142">
       <w:numFmt w:val="decimal"/>
       <w:lvlText w:val=""/>
       <w:lvlJc w:val="left"/>
     </w:lvl>
-    <w:lvl w:ilvl="8" w:tplc="E6D87F40">
+    <w:lvl w:ilvl="8" w:tplc="D65ABDEA">
       <w:numFmt w:val="decimal"/>
       <w:lvlText w:val=""/>
       <w:lvlJc w:val="left"/>
     </w:lvl>
   </w:abstractNum>
   <w:abstractNum w:abstractNumId="4" w15:restartNumberingAfterBreak="0">
-    <w:nsid w:val="33B446EB"/>
+    <w:nsid w:val="23E40AF3"/>
     <w:multiLevelType w:val="hybridMultilevel"/>
-    <w:tmpl w:val="C76AAC4A"/>
-    <w:lvl w:ilvl="0" w:tplc="10E0E8E0" w:tentative="1">
+    <w:tmpl w:val="588ED40A"/>
+    <w:lvl w:ilvl="0" w:tplc="38A44AEC">
       <w:start w:val="1"/>
       <w:numFmt w:val="decimal"/>
       <w:lvlText w:val="%1."/>
@@ -40426,52 +40426,52 @@
         <w:bCs/>
       </w:rPr>
     </w:lvl>
-    <w:lvl w:ilvl="1" w:tplc="99641CFA">
+    <w:lvl w:ilvl="1" w:tplc="92007F62">
       <w:numFmt w:val="decimal"/>
       <w:lvlText w:val=""/>
       <w:lvlJc w:val="left"/>
     </w:lvl>
-    <w:lvl w:ilvl="2" w:tplc="2ADC9FA6">
+    <w:lvl w:ilvl="2" w:tplc="79F29F36">
       <w:numFmt w:val="decimal"/>
       <w:lvlText w:val=""/>
       <w:lvlJc w:val="left"/>
     </w:lvl>
-    <w:lvl w:ilvl="3" w:tplc="46EC39F8">
+    <w:lvl w:ilvl="3" w:tplc="81FC3870">
       <w:numFmt w:val="decimal"/>
       <w:lvlText w:val=""/>
       <w:lvlJc w:val="left"/>
     </w:lvl>
-    <w:lvl w:ilvl="4" w:tplc="72FE0E76">
+    <w:lvl w:ilvl="4" w:tplc="9E5A7FF2">
       <w:numFmt w:val="decimal"/>
       <w:lvlText w:val=""/>
       <w:lvlJc w:val="left"/>
     </w:lvl>
-    <w:lvl w:ilvl="5" w:tplc="39FE377A">
+    <w:lvl w:ilvl="5" w:tplc="E4005C8E">
       <w:numFmt w:val="decimal"/>
       <w:lvlText w:val=""/>
       <w:lvlJc w:val="left"/>
     </w:lvl>
-    <w:lvl w:ilvl="6" w:tplc="C88E85A2">
+    <w:lvl w:ilvl="6" w:tplc="2C02D296">
       <w:numFmt w:val="decimal"/>
       <w:lvlText w:val=""/>
       <w:lvlJc w:val="left"/>
     </w:lvl>
-    <w:lvl w:ilvl="7" w:tplc="1898C75E">
+    <w:lvl w:ilvl="7" w:tplc="812E364C">
       <w:numFmt w:val="decimal"/>
       <w:lvlText w:val=""/>
       <w:lvlJc w:val="left"/>
     </w:lvl>
-    <w:lvl w:ilvl="8" w:tplc="DE060CD0">
+    <w:lvl w:ilvl="8" w:tplc="49CEEC08">
       <w:numFmt w:val="decimal"/>
       <w:lvlText w:val=""/>
       <w:lvlJc w:val="left"/>
     </w:lvl>
   </w:abstractNum>
   <w:abstractNum w:abstractNumId="5" w15:restartNumberingAfterBreak="0">
-    <w:nsid w:val="38A838DD"/>
+    <w:nsid w:val="438A3855"/>
     <w:multiLevelType w:val="hybridMultilevel"/>
-    <w:tmpl w:val="511C039A"/>
-    <w:lvl w:ilvl="0" w:tplc="9156096A">
+    <w:tmpl w:val="CE309F92"/>
+    <w:lvl w:ilvl="0" w:tplc="15BADBBC" w:tentative="1">
       <w:start w:val="1"/>
       <w:numFmt w:val="decimal"/>
       <w:lvlText w:val="%1."/>
@@ -40484,138 +40484,52 @@
         <w:bCs/>
       </w:rPr>
     </w:lvl>
-    <w:lvl w:ilvl="1" w:tplc="9EF8048A">
+    <w:lvl w:ilvl="1" w:tplc="505A1792">
       <w:numFmt w:val="decimal"/>
       <w:lvlText w:val=""/>
       <w:lvlJc w:val="left"/>
     </w:lvl>
-    <w:lvl w:ilvl="2" w:tplc="5ACE25DC">
+    <w:lvl w:ilvl="2" w:tplc="8BBE688E">
       <w:numFmt w:val="decimal"/>
       <w:lvlText w:val=""/>
       <w:lvlJc w:val="left"/>
     </w:lvl>
-    <w:lvl w:ilvl="3" w:tplc="E2265FD8">
+    <w:lvl w:ilvl="3" w:tplc="AC3CF01A">
       <w:numFmt w:val="decimal"/>
       <w:lvlText w:val=""/>
       <w:lvlJc w:val="left"/>
     </w:lvl>
-    <w:lvl w:ilvl="4" w:tplc="80E410F8">
+    <w:lvl w:ilvl="4" w:tplc="C882D1F0">
       <w:numFmt w:val="decimal"/>
       <w:lvlText w:val=""/>
       <w:lvlJc w:val="left"/>
     </w:lvl>
-    <w:lvl w:ilvl="5" w:tplc="613CCFFA">
+    <w:lvl w:ilvl="5" w:tplc="78A84D8C">
       <w:numFmt w:val="decimal"/>
       <w:lvlText w:val=""/>
       <w:lvlJc w:val="left"/>
     </w:lvl>
-    <w:lvl w:ilvl="6" w:tplc="4B6E1414">
+    <w:lvl w:ilvl="6" w:tplc="56F21DC2">
       <w:numFmt w:val="decimal"/>
       <w:lvlText w:val=""/>
       <w:lvlJc w:val="left"/>
     </w:lvl>
-    <w:lvl w:ilvl="7" w:tplc="8526772E">
+    <w:lvl w:ilvl="7" w:tplc="180258DC">
       <w:numFmt w:val="decimal"/>
       <w:lvlText w:val=""/>
       <w:lvlJc w:val="left"/>
     </w:lvl>
-    <w:lvl w:ilvl="8" w:tplc="9BB29234">
+    <w:lvl w:ilvl="8" w:tplc="5CD6D2D0">
       <w:numFmt w:val="decimal"/>
       <w:lvlText w:val=""/>
       <w:lvlJc w:val="left"/>
     </w:lvl>
   </w:abstractNum>
   <w:abstractNum w:abstractNumId="6" w15:restartNumberingAfterBreak="0">
-    <w:nsid w:val="38BF2DF2"/>
+    <w:nsid w:val="46CF3EFA"/>
     <w:multiLevelType w:val="hybridMultilevel"/>
-    <w:tmpl w:val="F90E5498"/>
-    <w:lvl w:ilvl="0" w:tplc="B55C3EB8" w:tentative="1">
-      <w:start w:val="1"/>
-      <w:numFmt w:val="bullet"/>
-      <w:lvlText w:val="●"/>
-      <w:lvlJc w:val="left"/>
-      <w:pPr>
-        <w:ind w:left="720" w:hanging="360"/>
-      </w:pPr>
-    </w:lvl>
-    <w:lvl w:ilvl="1" w:tplc="957637C6" w:tentative="1">
-      <w:start w:val="1"/>
-      <w:numFmt w:val="bullet"/>
-      <w:lvlText w:val="○"/>
-      <w:lvlJc w:val="left"/>
-      <w:pPr>
-        <w:ind w:left="1440" w:hanging="360"/>
-      </w:pPr>
-    </w:lvl>
-    <w:lvl w:ilvl="2" w:tplc="FC62C334" w:tentative="1">
-      <w:start w:val="1"/>
-      <w:numFmt w:val="bullet"/>
-      <w:lvlText w:val="■"/>
-      <w:lvlJc w:val="left"/>
-      <w:pPr>
-        <w:ind w:left="2160" w:hanging="360"/>
-      </w:pPr>
-    </w:lvl>
-    <w:lvl w:ilvl="3" w:tplc="19FC421A" w:tentative="1">
-      <w:start w:val="1"/>
-      <w:numFmt w:val="bullet"/>
-      <w:lvlText w:val="●"/>
-      <w:lvlJc w:val="left"/>
-      <w:pPr>
-        <w:ind w:left="2880" w:hanging="360"/>
-      </w:pPr>
-    </w:lvl>
-    <w:lvl w:ilvl="4" w:tplc="602E5352" w:tentative="1">
-      <w:start w:val="1"/>
-      <w:numFmt w:val="bullet"/>
-      <w:lvlText w:val="○"/>
-      <w:lvlJc w:val="left"/>
-      <w:pPr>
-        <w:ind w:left="3600" w:hanging="360"/>
-      </w:pPr>
-    </w:lvl>
-    <w:lvl w:ilvl="5" w:tplc="EEE20272" w:tentative="1">
-      <w:start w:val="1"/>
-      <w:numFmt w:val="bullet"/>
-      <w:lvlText w:val="■"/>
-      <w:lvlJc w:val="left"/>
-      <w:pPr>
-        <w:ind w:left="4320" w:hanging="360"/>
-      </w:pPr>
-    </w:lvl>
-    <w:lvl w:ilvl="6" w:tplc="2138B016" w:tentative="1">
-      <w:start w:val="1"/>
-      <w:numFmt w:val="bullet"/>
-      <w:lvlText w:val="●"/>
-      <w:lvlJc w:val="left"/>
-      <w:pPr>
-        <w:ind w:left="5040" w:hanging="360"/>
-      </w:pPr>
-    </w:lvl>
-    <w:lvl w:ilvl="7" w:tplc="F2E61218" w:tentative="1">
-      <w:start w:val="1"/>
-      <w:numFmt w:val="bullet"/>
-      <w:lvlText w:val="●"/>
-      <w:lvlJc w:val="left"/>
-      <w:pPr>
-        <w:ind w:left="5760" w:hanging="360"/>
-      </w:pPr>
-    </w:lvl>
-    <w:lvl w:ilvl="8" w:tplc="7A4C3386" w:tentative="1">
-      <w:start w:val="1"/>
-      <w:numFmt w:val="bullet"/>
-      <w:lvlText w:val="●"/>
-      <w:lvlJc w:val="left"/>
-      <w:pPr>
-        <w:ind w:left="6480" w:hanging="360"/>
-      </w:pPr>
-    </w:lvl>
-  </w:abstractNum>
-  <w:abstractNum w:abstractNumId="7" w15:restartNumberingAfterBreak="0">
-    <w:nsid w:val="3D8262EA"/>
-    <w:multiLevelType w:val="hybridMultilevel"/>
-    <w:tmpl w:val="0A445708"/>
-    <w:lvl w:ilvl="0" w:tplc="6A2A5D64" w:tentative="1">
+    <w:tmpl w:val="9B3CCFEE"/>
+    <w:lvl w:ilvl="0" w:tplc="59683BF4" w:tentative="1">
       <w:start w:val="1"/>
       <w:numFmt w:val="decimal"/>
       <w:lvlText w:val="%1."/>
@@ -40628,52 +40542,52 @@
         <w:bCs/>
       </w:rPr>
     </w:lvl>
-    <w:lvl w:ilvl="1" w:tplc="62D28EBC">
+    <w:lvl w:ilvl="1" w:tplc="51081364">
       <w:numFmt w:val="decimal"/>
       <w:lvlText w:val=""/>
       <w:lvlJc w:val="left"/>
     </w:lvl>
-    <w:lvl w:ilvl="2" w:tplc="38547626">
+    <w:lvl w:ilvl="2" w:tplc="5920AFB2">
       <w:numFmt w:val="decimal"/>
       <w:lvlText w:val=""/>
       <w:lvlJc w:val="left"/>
     </w:lvl>
-    <w:lvl w:ilvl="3" w:tplc="2C40E228">
+    <w:lvl w:ilvl="3" w:tplc="B4CA4D9A">
       <w:numFmt w:val="decimal"/>
       <w:lvlText w:val=""/>
       <w:lvlJc w:val="left"/>
     </w:lvl>
-    <w:lvl w:ilvl="4" w:tplc="CC88FFE0">
+    <w:lvl w:ilvl="4" w:tplc="6BD0AD58">
       <w:numFmt w:val="decimal"/>
       <w:lvlText w:val=""/>
       <w:lvlJc w:val="left"/>
     </w:lvl>
-    <w:lvl w:ilvl="5" w:tplc="D272159C">
+    <w:lvl w:ilvl="5" w:tplc="BF86E96A">
       <w:numFmt w:val="decimal"/>
       <w:lvlText w:val=""/>
       <w:lvlJc w:val="left"/>
     </w:lvl>
-    <w:lvl w:ilvl="6" w:tplc="7600775A">
+    <w:lvl w:ilvl="6" w:tplc="06FA0648">
       <w:numFmt w:val="decimal"/>
       <w:lvlText w:val=""/>
       <w:lvlJc w:val="left"/>
     </w:lvl>
-    <w:lvl w:ilvl="7" w:tplc="36DC2624">
+    <w:lvl w:ilvl="7" w:tplc="334C6B8A">
       <w:numFmt w:val="decimal"/>
       <w:lvlText w:val=""/>
       <w:lvlJc w:val="left"/>
     </w:lvl>
-    <w:lvl w:ilvl="8" w:tplc="B23C59AC">
+    <w:lvl w:ilvl="8" w:tplc="12D4C4B6">
       <w:numFmt w:val="decimal"/>
       <w:lvlText w:val=""/>
       <w:lvlJc w:val="left"/>
     </w:lvl>
   </w:abstractNum>
-  <w:abstractNum w:abstractNumId="8" w15:restartNumberingAfterBreak="0">
-    <w:nsid w:val="47C87456"/>
+  <w:abstractNum w:abstractNumId="7" w15:restartNumberingAfterBreak="0">
+    <w:nsid w:val="4D213E9F"/>
     <w:multiLevelType w:val="hybridMultilevel"/>
-    <w:tmpl w:val="CCF205F6"/>
-    <w:lvl w:ilvl="0" w:tplc="2D242934" w:tentative="1">
+    <w:tmpl w:val="39BC6F20"/>
+    <w:lvl w:ilvl="0" w:tplc="90D25944">
       <w:start w:val="1"/>
       <w:numFmt w:val="decimal"/>
       <w:lvlText w:val="%1."/>
@@ -40686,52 +40600,138 @@
         <w:bCs/>
       </w:rPr>
     </w:lvl>
-    <w:lvl w:ilvl="1" w:tplc="FFD05492">
+    <w:lvl w:ilvl="1" w:tplc="DF4A95F2">
       <w:numFmt w:val="decimal"/>
       <w:lvlText w:val=""/>
       <w:lvlJc w:val="left"/>
     </w:lvl>
-    <w:lvl w:ilvl="2" w:tplc="E03C169E">
+    <w:lvl w:ilvl="2" w:tplc="1354C652">
       <w:numFmt w:val="decimal"/>
       <w:lvlText w:val=""/>
       <w:lvlJc w:val="left"/>
     </w:lvl>
-    <w:lvl w:ilvl="3" w:tplc="2BE41024">
+    <w:lvl w:ilvl="3" w:tplc="D68A09DE">
       <w:numFmt w:val="decimal"/>
       <w:lvlText w:val=""/>
       <w:lvlJc w:val="left"/>
     </w:lvl>
-    <w:lvl w:ilvl="4" w:tplc="AA24A0C6">
+    <w:lvl w:ilvl="4" w:tplc="FEFA7838">
       <w:numFmt w:val="decimal"/>
       <w:lvlText w:val=""/>
       <w:lvlJc w:val="left"/>
     </w:lvl>
-    <w:lvl w:ilvl="5" w:tplc="78A23BF4">
+    <w:lvl w:ilvl="5" w:tplc="89727804">
       <w:numFmt w:val="decimal"/>
       <w:lvlText w:val=""/>
       <w:lvlJc w:val="left"/>
     </w:lvl>
-    <w:lvl w:ilvl="6" w:tplc="547A1F68">
+    <w:lvl w:ilvl="6" w:tplc="BBFE76C4">
       <w:numFmt w:val="decimal"/>
       <w:lvlText w:val=""/>
       <w:lvlJc w:val="left"/>
     </w:lvl>
-    <w:lvl w:ilvl="7" w:tplc="406246D2">
+    <w:lvl w:ilvl="7" w:tplc="B350AAB6">
       <w:numFmt w:val="decimal"/>
       <w:lvlText w:val=""/>
       <w:lvlJc w:val="left"/>
     </w:lvl>
-    <w:lvl w:ilvl="8" w:tplc="3FCCCD84">
+    <w:lvl w:ilvl="8" w:tplc="8B0A73BA">
       <w:numFmt w:val="decimal"/>
       <w:lvlText w:val=""/>
       <w:lvlJc w:val="left"/>
     </w:lvl>
   </w:abstractNum>
+  <w:abstractNum w:abstractNumId="8" w15:restartNumberingAfterBreak="0">
+    <w:nsid w:val="539C4376"/>
+    <w:multiLevelType w:val="hybridMultilevel"/>
+    <w:tmpl w:val="AC3E763C"/>
+    <w:lvl w:ilvl="0" w:tplc="7D80FB90" w:tentative="1">
+      <w:start w:val="1"/>
+      <w:numFmt w:val="bullet"/>
+      <w:lvlText w:val="●"/>
+      <w:lvlJc w:val="left"/>
+      <w:pPr>
+        <w:ind w:left="720" w:hanging="360"/>
+      </w:pPr>
+    </w:lvl>
+    <w:lvl w:ilvl="1" w:tplc="5EB4B982" w:tentative="1">
+      <w:start w:val="1"/>
+      <w:numFmt w:val="bullet"/>
+      <w:lvlText w:val="○"/>
+      <w:lvlJc w:val="left"/>
+      <w:pPr>
+        <w:ind w:left="1440" w:hanging="360"/>
+      </w:pPr>
+    </w:lvl>
+    <w:lvl w:ilvl="2" w:tplc="5646106A" w:tentative="1">
+      <w:start w:val="1"/>
+      <w:numFmt w:val="bullet"/>
+      <w:lvlText w:val="■"/>
+      <w:lvlJc w:val="left"/>
+      <w:pPr>
+        <w:ind w:left="2160" w:hanging="360"/>
+      </w:pPr>
+    </w:lvl>
+    <w:lvl w:ilvl="3" w:tplc="FC421DDA" w:tentative="1">
+      <w:start w:val="1"/>
+      <w:numFmt w:val="bullet"/>
+      <w:lvlText w:val="●"/>
+      <w:lvlJc w:val="left"/>
+      <w:pPr>
+        <w:ind w:left="2880" w:hanging="360"/>
+      </w:pPr>
+    </w:lvl>
+    <w:lvl w:ilvl="4" w:tplc="B082DEA8" w:tentative="1">
+      <w:start w:val="1"/>
+      <w:numFmt w:val="bullet"/>
+      <w:lvlText w:val="○"/>
+      <w:lvlJc w:val="left"/>
+      <w:pPr>
+        <w:ind w:left="3600" w:hanging="360"/>
+      </w:pPr>
+    </w:lvl>
+    <w:lvl w:ilvl="5" w:tplc="66368844" w:tentative="1">
+      <w:start w:val="1"/>
+      <w:numFmt w:val="bullet"/>
+      <w:lvlText w:val="■"/>
+      <w:lvlJc w:val="left"/>
+      <w:pPr>
+        <w:ind w:left="4320" w:hanging="360"/>
+      </w:pPr>
+    </w:lvl>
+    <w:lvl w:ilvl="6" w:tplc="36966D80" w:tentative="1">
+      <w:start w:val="1"/>
+      <w:numFmt w:val="bullet"/>
+      <w:lvlText w:val="●"/>
+      <w:lvlJc w:val="left"/>
+      <w:pPr>
+        <w:ind w:left="5040" w:hanging="360"/>
+      </w:pPr>
+    </w:lvl>
+    <w:lvl w:ilvl="7" w:tplc="576A048A" w:tentative="1">
+      <w:start w:val="1"/>
+      <w:numFmt w:val="bullet"/>
+      <w:lvlText w:val="●"/>
+      <w:lvlJc w:val="left"/>
+      <w:pPr>
+        <w:ind w:left="5760" w:hanging="360"/>
+      </w:pPr>
+    </w:lvl>
+    <w:lvl w:ilvl="8" w:tplc="9B5ED618" w:tentative="1">
+      <w:start w:val="1"/>
+      <w:numFmt w:val="bullet"/>
+      <w:lvlText w:val="●"/>
+      <w:lvlJc w:val="left"/>
+      <w:pPr>
+        <w:ind w:left="6480" w:hanging="360"/>
+      </w:pPr>
+    </w:lvl>
+  </w:abstractNum>
   <w:abstractNum w:abstractNumId="9" w15:restartNumberingAfterBreak="0">
-    <w:nsid w:val="4840760E"/>
+    <w:nsid w:val="65F112F6"/>
     <w:multiLevelType w:val="hybridMultilevel"/>
-    <w:tmpl w:val="6F58040C"/>
-    <w:lvl w:ilvl="0" w:tplc="AD18F50C" w:tentative="1">
+    <w:tmpl w:val="42923850"/>
+    <w:lvl w:ilvl="0" w:tplc="E4A89D7A" w:tentative="1">
       <w:start w:val="1"/>
       <w:numFmt w:val="decimal"/>
       <w:lvlText w:val="%1."/>
@@ -40744,52 +40744,52 @@
         <w:bCs/>
       </w:rPr>
     </w:lvl>
-    <w:lvl w:ilvl="1" w:tplc="7F601826">
+    <w:lvl w:ilvl="1" w:tplc="D6C24CC6">
       <w:numFmt w:val="decimal"/>
       <w:lvlText w:val=""/>
       <w:lvlJc w:val="left"/>
     </w:lvl>
-    <w:lvl w:ilvl="2" w:tplc="C868B99C">
+    <w:lvl w:ilvl="2" w:tplc="CEAE6100">
       <w:numFmt w:val="decimal"/>
       <w:lvlText w:val=""/>
       <w:lvlJc w:val="left"/>
     </w:lvl>
-    <w:lvl w:ilvl="3" w:tplc="4740C49C">
+    <w:lvl w:ilvl="3" w:tplc="A7B08506">
       <w:numFmt w:val="decimal"/>
       <w:lvlText w:val=""/>
       <w:lvlJc w:val="left"/>
     </w:lvl>
-    <w:lvl w:ilvl="4" w:tplc="21F06E74">
+    <w:lvl w:ilvl="4" w:tplc="C630BF24">
       <w:numFmt w:val="decimal"/>
       <w:lvlText w:val=""/>
       <w:lvlJc w:val="left"/>
     </w:lvl>
-    <w:lvl w:ilvl="5" w:tplc="C9AA3892">
+    <w:lvl w:ilvl="5" w:tplc="4408611C">
       <w:numFmt w:val="decimal"/>
       <w:lvlText w:val=""/>
       <w:lvlJc w:val="left"/>
     </w:lvl>
-    <w:lvl w:ilvl="6" w:tplc="C3DED076">
+    <w:lvl w:ilvl="6" w:tplc="01D836F0">
       <w:numFmt w:val="decimal"/>
       <w:lvlText w:val=""/>
       <w:lvlJc w:val="left"/>
     </w:lvl>
-    <w:lvl w:ilvl="7" w:tplc="E5989A94">
+    <w:lvl w:ilvl="7" w:tplc="0396097E">
       <w:numFmt w:val="decimal"/>
       <w:lvlText w:val=""/>
       <w:lvlJc w:val="left"/>
     </w:lvl>
-    <w:lvl w:ilvl="8" w:tplc="AA8EB9BA">
+    <w:lvl w:ilvl="8" w:tplc="7BCCB734">
       <w:numFmt w:val="decimal"/>
       <w:lvlText w:val=""/>
       <w:lvlJc w:val="left"/>
     </w:lvl>
   </w:abstractNum>
   <w:abstractNum w:abstractNumId="10" w15:restartNumberingAfterBreak="0">
-    <w:nsid w:val="617A5C59"/>
+    <w:nsid w:val="721854AF"/>
     <w:multiLevelType w:val="hybridMultilevel"/>
-    <w:tmpl w:val="FB34AB34"/>
-    <w:lvl w:ilvl="0" w:tplc="86281D8E" w:tentative="1">
+    <w:tmpl w:val="F67A2A30"/>
+    <w:lvl w:ilvl="0" w:tplc="C2002D34" w:tentative="1">
       <w:start w:val="1"/>
       <w:numFmt w:val="decimal"/>
       <w:lvlText w:val="%1."/>
@@ -40802,52 +40802,52 @@
         <w:bCs/>
       </w:rPr>
     </w:lvl>
-    <w:lvl w:ilvl="1" w:tplc="28F24F88">
+    <w:lvl w:ilvl="1" w:tplc="90404F8A">
       <w:numFmt w:val="decimal"/>
       <w:lvlText w:val=""/>
       <w:lvlJc w:val="left"/>
     </w:lvl>
-    <w:lvl w:ilvl="2" w:tplc="A12A350C">
+    <w:lvl w:ilvl="2" w:tplc="F3022078">
       <w:numFmt w:val="decimal"/>
       <w:lvlText w:val=""/>
       <w:lvlJc w:val="left"/>
     </w:lvl>
-    <w:lvl w:ilvl="3" w:tplc="9B1CF48E">
+    <w:lvl w:ilvl="3" w:tplc="167E5B20">
       <w:numFmt w:val="decimal"/>
       <w:lvlText w:val=""/>
       <w:lvlJc w:val="left"/>
     </w:lvl>
-    <w:lvl w:ilvl="4" w:tplc="980A4384">
+    <w:lvl w:ilvl="4" w:tplc="58DC4426">
       <w:numFmt w:val="decimal"/>
       <w:lvlText w:val=""/>
       <w:lvlJc w:val="left"/>
     </w:lvl>
-    <w:lvl w:ilvl="5" w:tplc="8194753C">
+    <w:lvl w:ilvl="5" w:tplc="C7A8263E">
       <w:numFmt w:val="decimal"/>
       <w:lvlText w:val=""/>
       <w:lvlJc w:val="left"/>
     </w:lvl>
-    <w:lvl w:ilvl="6" w:tplc="0A3E5060">
+    <w:lvl w:ilvl="6" w:tplc="8ED86B1A">
       <w:numFmt w:val="decimal"/>
       <w:lvlText w:val=""/>
       <w:lvlJc w:val="left"/>
     </w:lvl>
-    <w:lvl w:ilvl="7" w:tplc="DD96465E">
+    <w:lvl w:ilvl="7" w:tplc="32869BB2">
       <w:numFmt w:val="decimal"/>
       <w:lvlText w:val=""/>
       <w:lvlJc w:val="left"/>
     </w:lvl>
-    <w:lvl w:ilvl="8" w:tplc="ECBEFAAC">
+    <w:lvl w:ilvl="8" w:tplc="7D04A110">
       <w:numFmt w:val="decimal"/>
       <w:lvlText w:val=""/>
       <w:lvlJc w:val="left"/>
     </w:lvl>
   </w:abstractNum>
   <w:abstractNum w:abstractNumId="11" w15:restartNumberingAfterBreak="0">
-    <w:nsid w:val="66B336F1"/>
+    <w:nsid w:val="736D79C7"/>
     <w:multiLevelType w:val="hybridMultilevel"/>
-    <w:tmpl w:val="F274D160"/>
-    <w:lvl w:ilvl="0" w:tplc="E4BA6656" w:tentative="1">
+    <w:tmpl w:val="17D47BF8"/>
+    <w:lvl w:ilvl="0" w:tplc="4664C0F2" w:tentative="1">
       <w:start w:val="1"/>
       <w:numFmt w:val="decimal"/>
       <w:lvlText w:val="%1."/>
@@ -40860,110 +40860,52 @@
         <w:bCs/>
       </w:rPr>
     </w:lvl>
-    <w:lvl w:ilvl="1" w:tplc="826CD776">
+    <w:lvl w:ilvl="1" w:tplc="7B2E0786">
       <w:numFmt w:val="decimal"/>
       <w:lvlText w:val=""/>
       <w:lvlJc w:val="left"/>
     </w:lvl>
-    <w:lvl w:ilvl="2" w:tplc="82240F6C">
+    <w:lvl w:ilvl="2" w:tplc="01B624FC">
       <w:numFmt w:val="decimal"/>
       <w:lvlText w:val=""/>
       <w:lvlJc w:val="left"/>
     </w:lvl>
-    <w:lvl w:ilvl="3" w:tplc="00261B78">
+    <w:lvl w:ilvl="3" w:tplc="21BC6F62">
       <w:numFmt w:val="decimal"/>
       <w:lvlText w:val=""/>
       <w:lvlJc w:val="left"/>
     </w:lvl>
-    <w:lvl w:ilvl="4" w:tplc="33000314">
+    <w:lvl w:ilvl="4" w:tplc="90187122">
       <w:numFmt w:val="decimal"/>
       <w:lvlText w:val=""/>
       <w:lvlJc w:val="left"/>
     </w:lvl>
-    <w:lvl w:ilvl="5" w:tplc="4EEAC616">
+    <w:lvl w:ilvl="5" w:tplc="A57894B4">
       <w:numFmt w:val="decimal"/>
       <w:lvlText w:val=""/>
       <w:lvlJc w:val="left"/>
     </w:lvl>
-    <w:lvl w:ilvl="6" w:tplc="E208F39C">
+    <w:lvl w:ilvl="6" w:tplc="2A9E3C5E">
       <w:numFmt w:val="decimal"/>
       <w:lvlText w:val=""/>
       <w:lvlJc w:val="left"/>
     </w:lvl>
-    <w:lvl w:ilvl="7" w:tplc="623C2CD6">
+    <w:lvl w:ilvl="7" w:tplc="63147E28">
       <w:numFmt w:val="decimal"/>
       <w:lvlText w:val=""/>
       <w:lvlJc w:val="left"/>
     </w:lvl>
-    <w:lvl w:ilvl="8" w:tplc="7B9A4AA0">
+    <w:lvl w:ilvl="8" w:tplc="6916D1E8">
       <w:numFmt w:val="decimal"/>
       <w:lvlText w:val=""/>
       <w:lvlJc w:val="left"/>
     </w:lvl>
   </w:abstractNum>
   <w:abstractNum w:abstractNumId="12" w15:restartNumberingAfterBreak="0">
-    <w:nsid w:val="6B8F2698"/>
+    <w:nsid w:val="77F82962"/>
     <w:multiLevelType w:val="hybridMultilevel"/>
-    <w:tmpl w:val="BC48B1F4"/>
-    <w:lvl w:ilvl="0" w:tplc="5D8C5D6C">
-      <w:start w:val="1"/>
-      <w:numFmt w:val="bullet"/>
-      <w:lvlText w:val="•"/>
-      <w:lvlJc w:val="left"/>
-      <w:pPr>
-        <w:ind w:left="500" w:hanging="280"/>
-      </w:pPr>
-    </w:lvl>
-    <w:lvl w:ilvl="1" w:tplc="60040D72" w:tentative="1">
-      <w:start w:val="1"/>
-      <w:numFmt w:val="bullet"/>
-      <w:lvlText w:val="–"/>
-      <w:lvlJc w:val="left"/>
-      <w:pPr>
-        <w:ind w:left="950" w:hanging="280"/>
-      </w:pPr>
-    </w:lvl>
-    <w:lvl w:ilvl="2" w:tplc="22EE8A7E">
-      <w:numFmt w:val="decimal"/>
-      <w:lvlText w:val=""/>
-      <w:lvlJc w:val="left"/>
-    </w:lvl>
-    <w:lvl w:ilvl="3" w:tplc="74901580">
-      <w:numFmt w:val="decimal"/>
-      <w:lvlText w:val=""/>
-      <w:lvlJc w:val="left"/>
-    </w:lvl>
-    <w:lvl w:ilvl="4" w:tplc="56AA4E7E">
-      <w:numFmt w:val="decimal"/>
-      <w:lvlText w:val=""/>
-      <w:lvlJc w:val="left"/>
-    </w:lvl>
-    <w:lvl w:ilvl="5" w:tplc="CEA883E6">
-      <w:numFmt w:val="decimal"/>
-      <w:lvlText w:val=""/>
-      <w:lvlJc w:val="left"/>
-    </w:lvl>
-    <w:lvl w:ilvl="6" w:tplc="821A8212">
-      <w:numFmt w:val="decimal"/>
-      <w:lvlText w:val=""/>
-      <w:lvlJc w:val="left"/>
-    </w:lvl>
-    <w:lvl w:ilvl="7" w:tplc="684ED2C0">
-      <w:numFmt w:val="decimal"/>
-      <w:lvlText w:val=""/>
-      <w:lvlJc w:val="left"/>
-    </w:lvl>
-    <w:lvl w:ilvl="8" w:tplc="99E8D602">
-      <w:numFmt w:val="decimal"/>
-      <w:lvlText w:val=""/>
-      <w:lvlJc w:val="left"/>
-    </w:lvl>
-  </w:abstractNum>
-  <w:abstractNum w:abstractNumId="13" w15:restartNumberingAfterBreak="0">
-    <w:nsid w:val="6D342D89"/>
-    <w:multiLevelType w:val="hybridMultilevel"/>
-    <w:tmpl w:val="32E4D652"/>
-    <w:lvl w:ilvl="0" w:tplc="AE883500" w:tentative="1">
+    <w:tmpl w:val="AD8EA4F4"/>
+    <w:lvl w:ilvl="0" w:tplc="BD2CC3FE" w:tentative="1">
       <w:start w:val="1"/>
       <w:numFmt w:val="decimal"/>
       <w:lvlText w:val="%1."/>
@@ -40976,52 +40918,110 @@
         <w:bCs/>
       </w:rPr>
     </w:lvl>
-    <w:lvl w:ilvl="1" w:tplc="CE227C4A">
+    <w:lvl w:ilvl="1" w:tplc="5C1C17AE">
       <w:numFmt w:val="decimal"/>
       <w:lvlText w:val=""/>
       <w:lvlJc w:val="left"/>
     </w:lvl>
-    <w:lvl w:ilvl="2" w:tplc="C63A3822">
+    <w:lvl w:ilvl="2" w:tplc="E5D495B4">
       <w:numFmt w:val="decimal"/>
       <w:lvlText w:val=""/>
       <w:lvlJc w:val="left"/>
     </w:lvl>
-    <w:lvl w:ilvl="3" w:tplc="ECF62366">
+    <w:lvl w:ilvl="3" w:tplc="B3847306">
       <w:numFmt w:val="decimal"/>
       <w:lvlText w:val=""/>
       <w:lvlJc w:val="left"/>
     </w:lvl>
-    <w:lvl w:ilvl="4" w:tplc="5BE827C8">
+    <w:lvl w:ilvl="4" w:tplc="3B605FE4">
       <w:numFmt w:val="decimal"/>
       <w:lvlText w:val=""/>
       <w:lvlJc w:val="left"/>
     </w:lvl>
-    <w:lvl w:ilvl="5" w:tplc="79F2C874">
+    <w:lvl w:ilvl="5" w:tplc="3566E8CC">
       <w:numFmt w:val="decimal"/>
       <w:lvlText w:val=""/>
       <w:lvlJc w:val="left"/>
     </w:lvl>
-    <w:lvl w:ilvl="6" w:tplc="C680B446">
+    <w:lvl w:ilvl="6" w:tplc="84C4FB78">
       <w:numFmt w:val="decimal"/>
       <w:lvlText w:val=""/>
       <w:lvlJc w:val="left"/>
     </w:lvl>
-    <w:lvl w:ilvl="7" w:tplc="7286F1F4">
+    <w:lvl w:ilvl="7" w:tplc="BA82ACA4">
       <w:numFmt w:val="decimal"/>
       <w:lvlText w:val=""/>
       <w:lvlJc w:val="left"/>
     </w:lvl>
-    <w:lvl w:ilvl="8" w:tplc="B8F2AB9A">
+    <w:lvl w:ilvl="8" w:tplc="BEA0810A">
+      <w:numFmt w:val="decimal"/>
+      <w:lvlText w:val=""/>
+      <w:lvlJc w:val="left"/>
+    </w:lvl>
+  </w:abstractNum>
+  <w:abstractNum w:abstractNumId="13" w15:restartNumberingAfterBreak="0">
+    <w:nsid w:val="792E2B93"/>
+    <w:multiLevelType w:val="hybridMultilevel"/>
+    <w:tmpl w:val="E15C484C"/>
+    <w:lvl w:ilvl="0" w:tplc="1CA2C878">
+      <w:start w:val="1"/>
+      <w:numFmt w:val="bullet"/>
+      <w:lvlText w:val="•"/>
+      <w:lvlJc w:val="left"/>
+      <w:pPr>
+        <w:ind w:left="500" w:hanging="280"/>
+      </w:pPr>
+    </w:lvl>
+    <w:lvl w:ilvl="1" w:tplc="3B269A72" w:tentative="1">
+      <w:start w:val="1"/>
+      <w:numFmt w:val="bullet"/>
+      <w:lvlText w:val="–"/>
+      <w:lvlJc w:val="left"/>
+      <w:pPr>
+        <w:ind w:left="950" w:hanging="280"/>
+      </w:pPr>
+    </w:lvl>
+    <w:lvl w:ilvl="2" w:tplc="9F8C44BE">
+      <w:numFmt w:val="decimal"/>
+      <w:lvlText w:val=""/>
+      <w:lvlJc w:val="left"/>
+    </w:lvl>
+    <w:lvl w:ilvl="3" w:tplc="B054F30A">
+      <w:numFmt w:val="decimal"/>
+      <w:lvlText w:val=""/>
+      <w:lvlJc w:val="left"/>
+    </w:lvl>
+    <w:lvl w:ilvl="4" w:tplc="8ADE105E">
+      <w:numFmt w:val="decimal"/>
+      <w:lvlText w:val=""/>
+      <w:lvlJc w:val="left"/>
+    </w:lvl>
+    <w:lvl w:ilvl="5" w:tplc="410841E6">
+      <w:numFmt w:val="decimal"/>
+      <w:lvlText w:val=""/>
+      <w:lvlJc w:val="left"/>
+    </w:lvl>
+    <w:lvl w:ilvl="6" w:tplc="900CB7DA">
+      <w:numFmt w:val="decimal"/>
+      <w:lvlText w:val=""/>
+      <w:lvlJc w:val="left"/>
+    </w:lvl>
+    <w:lvl w:ilvl="7" w:tplc="C8F63DF8">
+      <w:numFmt w:val="decimal"/>
+      <w:lvlText w:val=""/>
+      <w:lvlJc w:val="left"/>
+    </w:lvl>
+    <w:lvl w:ilvl="8" w:tplc="D0CA6992">
       <w:numFmt w:val="decimal"/>
       <w:lvlText w:val=""/>
       <w:lvlJc w:val="left"/>
     </w:lvl>
   </w:abstractNum>
   <w:abstractNum w:abstractNumId="14" w15:restartNumberingAfterBreak="0">
-    <w:nsid w:val="6FDE6E5F"/>
+    <w:nsid w:val="7C6B586E"/>
     <w:multiLevelType w:val="hybridMultilevel"/>
-    <w:tmpl w:val="027CB3DA"/>
-    <w:lvl w:ilvl="0" w:tplc="40183FC0" w:tentative="1">
+    <w:tmpl w:val="845A05E8"/>
+    <w:lvl w:ilvl="0" w:tplc="E90ABEBE">
       <w:start w:val="1"/>
       <w:numFmt w:val="decimal"/>
       <w:lvlText w:val="%1."/>
@@ -41034,73 +41034,73 @@
         <w:bCs/>
       </w:rPr>
     </w:lvl>
-    <w:lvl w:ilvl="1" w:tplc="011CF01C">
+    <w:lvl w:ilvl="1" w:tplc="13DC39EA">
       <w:numFmt w:val="decimal"/>
       <w:lvlText w:val=""/>
       <w:lvlJc w:val="left"/>
     </w:lvl>
-    <w:lvl w:ilvl="2" w:tplc="2AC67558">
+    <w:lvl w:ilvl="2" w:tplc="1804AADA">
       <w:numFmt w:val="decimal"/>
       <w:lvlText w:val=""/>
       <w:lvlJc w:val="left"/>
     </w:lvl>
-    <w:lvl w:ilvl="3" w:tplc="0ABC232E">
+    <w:lvl w:ilvl="3" w:tplc="0810B7A2">
       <w:numFmt w:val="decimal"/>
       <w:lvlText w:val=""/>
       <w:lvlJc w:val="left"/>
     </w:lvl>
-    <w:lvl w:ilvl="4" w:tplc="28408EA4">
+    <w:lvl w:ilvl="4" w:tplc="49688F84">
       <w:numFmt w:val="decimal"/>
       <w:lvlText w:val=""/>
       <w:lvlJc w:val="left"/>
     </w:lvl>
-    <w:lvl w:ilvl="5" w:tplc="AF389500">
+    <w:lvl w:ilvl="5" w:tplc="4F283972">
       <w:numFmt w:val="decimal"/>
       <w:lvlText w:val=""/>
       <w:lvlJc w:val="left"/>
     </w:lvl>
-    <w:lvl w:ilvl="6" w:tplc="94784F06">
+    <w:lvl w:ilvl="6" w:tplc="596A9CCA">
       <w:numFmt w:val="decimal"/>
       <w:lvlText w:val=""/>
       <w:lvlJc w:val="left"/>
     </w:lvl>
-    <w:lvl w:ilvl="7" w:tplc="F85450B4">
+    <w:lvl w:ilvl="7" w:tplc="839A115E">
       <w:numFmt w:val="decimal"/>
       <w:lvlText w:val=""/>
       <w:lvlJc w:val="left"/>
     </w:lvl>
-    <w:lvl w:ilvl="8" w:tplc="99C80BA0">
+    <w:lvl w:ilvl="8" w:tplc="B7C6AD9A">
       <w:numFmt w:val="decimal"/>
       <w:lvlText w:val=""/>
       <w:lvlJc w:val="left"/>
     </w:lvl>
   </w:abstractNum>
-  <w:num w:numId="1" w16cid:durableId="632756736">
-    <w:abstractNumId w:val="6"/>
+  <w:num w:numId="1" w16cid:durableId="1526821988">
+    <w:abstractNumId w:val="8"/>
     <w:lvlOverride w:ilvl="0">
       <w:startOverride w:val="1"/>
     </w:lvlOverride>
   </w:num>
-  <w:num w:numId="2" w16cid:durableId="21173927">
-    <w:abstractNumId w:val="12"/>
+  <w:num w:numId="2" w16cid:durableId="842865855">
+    <w:abstractNumId w:val="13"/>
     <w:lvlOverride w:ilvl="0">
       <w:startOverride w:val="1"/>
     </w:lvlOverride>
   </w:num>
-  <w:num w:numId="3" w16cid:durableId="1579630901">
-    <w:abstractNumId w:val="5"/>
+  <w:num w:numId="3" w16cid:durableId="1998071476">
+    <w:abstractNumId w:val="14"/>
     <w:lvlOverride w:ilvl="0">
       <w:startOverride w:val="1"/>
     </w:lvlOverride>
   </w:num>
-  <w:num w:numId="4" w16cid:durableId="1224172118">
-    <w:abstractNumId w:val="3"/>
+  <w:num w:numId="4" w16cid:durableId="615063490">
+    <w:abstractNumId w:val="7"/>
     <w:lvlOverride w:ilvl="0">
       <w:startOverride w:val="1"/>
     </w:lvlOverride>
   </w:num>
-  <w:num w:numId="5" w16cid:durableId="776946427">
-    <w:abstractNumId w:val="1"/>
+  <w:num w:numId="5" w16cid:durableId="402457102">
+    <w:abstractNumId w:val="4"/>
     <w:lvlOverride w:ilvl="0">
       <w:startOverride w:val="1"/>
     </w:lvlOverride>
@@ -41798,7 +41798,7 @@
     <w:autoRedefine/>
     <w:uiPriority w:val="39"/>
     <w:unhideWhenUsed/>
-    <w:rsid w:val="00735E9F"/>
+    <w:rsid w:val="00597628"/>
     <w:pPr>
       <w:spacing w:after="100"/>
     </w:pPr>
@@ -41810,7 +41810,7 @@
     <w:autoRedefine/>
     <w:uiPriority w:val="39"/>
     <w:unhideWhenUsed/>
-    <w:rsid w:val="00735E9F"/>
+    <w:rsid w:val="00597628"/>
     <w:pPr>
       <w:spacing w:after="100"/>
       <w:ind w:left="220"/>

</xml_diff>

<commit_message>
Agrega la instalación de la aplicación a los manuales 1.2 y a la guía rápida
Co-Authored-By: Claude Opus 5.5 <noreply@anthropic.com>
</commit_message>
<xml_diff>
--- a/docs/manuales/manual-tecnico.docx
+++ b/docs/manuales/manual-tecnico.docx
@@ -40,7 +40,7 @@
           <w:noProof/>
         </w:rPr>
         <w:drawing>
-          <wp:inline distT="0" distB="0" distL="0" distR="0" wp14:anchorId="7CFA5954" wp14:editId="2B41DB16">
+          <wp:inline distT="0" distB="0" distL="0" distR="0">
             <wp:extent cx="1619250" cy="1619250"/>
             <wp:effectExtent l="0" t="0" r="0" b="0"/>
             <wp:docPr id="1" name="Imagen 1"/>
@@ -145,7 +145,7 @@
           <w:sz w:val="20"/>
           <w:szCs w:val="20"/>
         </w:rPr>
-        <w:t>Versión 1.1</w:t>
+        <w:t>Versión 1.2</w:t>
       </w:r>
     </w:p>
     <w:p>
@@ -319,6 +319,7 @@
                 <w:sz w:val="19"/>
                 <w:szCs w:val="19"/>
               </w:rPr>
+              <w:lastRenderedPageBreak/>
               <w:t>Versión</w:t>
             </w:r>
           </w:p>
@@ -531,6 +532,87 @@
                 <w:szCs w:val="19"/>
               </w:rPr>
               <w:t>Código de ingreso y recuperación de contraseña por correo (RF-13); corregir y anular registros; registrar varias vacunas a la vez; número de carnet; catálogo de suplementos; editar usuarios y enfermería de apoyo; ambientes de producción y demostración; scripts de demostración, limpieza y prueba de correo.</w:t>
+            </w:r>
+          </w:p>
+        </w:tc>
+      </w:tr>
+      <w:tr>
+        <w:trPr>
+          <w:cnfStyle w:val="000000100000" w:firstRow="0" w:lastRow="0" w:firstColumn="0" w:lastColumn="0" w:oddVBand="0" w:evenVBand="0" w:oddHBand="1" w:evenHBand="0" w:firstRowFirstColumn="0" w:firstRowLastColumn="0" w:lastRowFirstColumn="0" w:lastRowLastColumn="0"/>
+          <w:cantSplit/>
+        </w:trPr>
+        <w:tc>
+          <w:tcPr>
+            <w:cnfStyle w:val="001000000000" w:firstRow="0" w:lastRow="0" w:firstColumn="1" w:lastColumn="0" w:oddVBand="0" w:evenVBand="0" w:oddHBand="0" w:evenHBand="0" w:firstRowFirstColumn="0" w:firstRowLastColumn="0" w:lastRowFirstColumn="0" w:lastRowLastColumn="0"/>
+            <w:tcW w:w="1200" w:type="dxa"/>
+            <w:tcMar>
+              <w:top w:w="60" w:type="dxa"/>
+              <w:left w:w="100" w:type="dxa"/>
+              <w:bottom w:w="60" w:type="dxa"/>
+              <w:right w:w="100" w:type="dxa"/>
+            </w:tcMar>
+            <w:vAlign w:val="center"/>
+          </w:tcPr>
+          <w:p>
+            <w:pPr>
+              <w:spacing w:line="260" w:lineRule="auto"/>
+            </w:pPr>
+            <w:r>
+              <w:rPr>
+                <w:sz w:val="19"/>
+                <w:szCs w:val="19"/>
+              </w:rPr>
+              <w:t>1.2</w:t>
+            </w:r>
+          </w:p>
+        </w:tc>
+        <w:tc>
+          <w:tcPr>
+            <w:tcW w:w="2400" w:type="dxa"/>
+            <w:tcMar>
+              <w:top w:w="60" w:type="dxa"/>
+              <w:left w:w="100" w:type="dxa"/>
+              <w:bottom w:w="60" w:type="dxa"/>
+              <w:right w:w="100" w:type="dxa"/>
+            </w:tcMar>
+            <w:vAlign w:val="center"/>
+          </w:tcPr>
+          <w:p>
+            <w:pPr>
+              <w:spacing w:line="260" w:lineRule="auto"/>
+              <w:cnfStyle w:val="000000100000" w:firstRow="0" w:lastRow="0" w:firstColumn="0" w:lastColumn="0" w:oddVBand="0" w:evenVBand="0" w:oddHBand="1" w:evenHBand="0" w:firstRowFirstColumn="0" w:firstRowLastColumn="0" w:lastRowFirstColumn="0" w:lastRowLastColumn="0"/>
+            </w:pPr>
+            <w:r>
+              <w:rPr>
+                <w:sz w:val="19"/>
+                <w:szCs w:val="19"/>
+              </w:rPr>
+              <w:t>27 de octubre de 2026</w:t>
+            </w:r>
+          </w:p>
+        </w:tc>
+        <w:tc>
+          <w:tcPr>
+            <w:tcW w:w="5760" w:type="dxa"/>
+            <w:tcMar>
+              <w:top w:w="60" w:type="dxa"/>
+              <w:left w:w="100" w:type="dxa"/>
+              <w:bottom w:w="60" w:type="dxa"/>
+              <w:right w:w="100" w:type="dxa"/>
+            </w:tcMar>
+            <w:vAlign w:val="center"/>
+          </w:tcPr>
+          <w:p>
+            <w:pPr>
+              <w:spacing w:line="260" w:lineRule="auto"/>
+              <w:cnfStyle w:val="000000100000" w:firstRow="0" w:lastRow="0" w:firstColumn="0" w:lastColumn="0" w:oddVBand="0" w:evenVBand="0" w:oddHBand="1" w:evenHBand="0" w:firstRowFirstColumn="0" w:firstRowLastColumn="0" w:lastRowFirstColumn="0" w:lastRowLastColumn="0"/>
+            </w:pPr>
+            <w:r>
+              <w:rPr>
+                <w:sz w:val="19"/>
+                <w:szCs w:val="19"/>
+              </w:rPr>
+              <w:t>Aplicación instalable (PWA): manifiesto, service worker y página sin conexión; número de carnet compartido; alertas que se vuelven a comparar al registrar fechas anteriores; aviso desde los 5 años; usuarios por rol; actualizaciones de seguridad de PHP.</w:t>
             </w:r>
           </w:p>
         </w:tc>
@@ -568,7 +650,7 @@
     <w:sdt>
       <w:sdtPr>
         <w:alias w:val="Índice"/>
-        <w:id w:val="-2034181381"/>
+        <w:id w:val="1070069264"/>
       </w:sdtPr>
       <w:sdtEndPr/>
       <w:sdtContent>
@@ -591,7 +673,7 @@
           <w:r>
             <w:fldChar w:fldCharType="separate"/>
           </w:r>
-          <w:hyperlink w:anchor="_Toc243520959" w:history="1">
+          <w:hyperlink w:anchor="_Toc243993187" w:history="1">
             <w:r>
               <w:rPr>
                 <w:rStyle w:val="Hipervnculo"/>
@@ -615,7 +697,7 @@
               <w:rPr>
                 <w:noProof/>
               </w:rPr>
-              <w:instrText xml:space="preserve"> PAGEREF _Toc243520959 \h </w:instrText>
+              <w:instrText xml:space="preserve"> PAGEREF _Toc243993187 \h </w:instrText>
             </w:r>
             <w:r>
               <w:rPr>
@@ -652,7 +734,7 @@
               <w:noProof/>
             </w:rPr>
           </w:pPr>
-          <w:hyperlink w:anchor="_Toc243520960" w:history="1">
+          <w:hyperlink w:anchor="_Toc243993188" w:history="1">
             <w:r>
               <w:rPr>
                 <w:rStyle w:val="Hipervnculo"/>
@@ -676,7 +758,7 @@
               <w:rPr>
                 <w:noProof/>
               </w:rPr>
-              <w:instrText xml:space="preserve"> PAGEREF _Toc243520960 \h </w:instrText>
+              <w:instrText xml:space="preserve"> PAGEREF _Toc243993188 \h </w:instrText>
             </w:r>
             <w:r>
               <w:rPr>
@@ -713,7 +795,7 @@
               <w:noProof/>
             </w:rPr>
           </w:pPr>
-          <w:hyperlink w:anchor="_Toc243520961" w:history="1">
+          <w:hyperlink w:anchor="_Toc243993189" w:history="1">
             <w:r>
               <w:rPr>
                 <w:rStyle w:val="Hipervnculo"/>
@@ -737,7 +819,7 @@
               <w:rPr>
                 <w:noProof/>
               </w:rPr>
-              <w:instrText xml:space="preserve"> PAGEREF _Toc243520961 \h </w:instrText>
+              <w:instrText xml:space="preserve"> PAGEREF _Toc243993189 \h </w:instrText>
             </w:r>
             <w:r>
               <w:rPr>
@@ -774,7 +856,7 @@
               <w:noProof/>
             </w:rPr>
           </w:pPr>
-          <w:hyperlink w:anchor="_Toc243520962" w:history="1">
+          <w:hyperlink w:anchor="_Toc243993190" w:history="1">
             <w:r>
               <w:rPr>
                 <w:rStyle w:val="Hipervnculo"/>
@@ -798,7 +880,7 @@
               <w:rPr>
                 <w:noProof/>
               </w:rPr>
-              <w:instrText xml:space="preserve"> PAGEREF _Toc243520962 \h </w:instrText>
+              <w:instrText xml:space="preserve"> PAGEREF _Toc243993190 \h </w:instrText>
             </w:r>
             <w:r>
               <w:rPr>
@@ -835,7 +917,7 @@
               <w:noProof/>
             </w:rPr>
           </w:pPr>
-          <w:hyperlink w:anchor="_Toc243520963" w:history="1">
+          <w:hyperlink w:anchor="_Toc243993191" w:history="1">
             <w:r>
               <w:rPr>
                 <w:rStyle w:val="Hipervnculo"/>
@@ -859,7 +941,7 @@
               <w:rPr>
                 <w:noProof/>
               </w:rPr>
-              <w:instrText xml:space="preserve"> PAGEREF _Toc243520963 \h </w:instrText>
+              <w:instrText xml:space="preserve"> PAGEREF _Toc243993191 \h </w:instrText>
             </w:r>
             <w:r>
               <w:rPr>
@@ -896,7 +978,7 @@
               <w:noProof/>
             </w:rPr>
           </w:pPr>
-          <w:hyperlink w:anchor="_Toc243520964" w:history="1">
+          <w:hyperlink w:anchor="_Toc243993192" w:history="1">
             <w:r>
               <w:rPr>
                 <w:rStyle w:val="Hipervnculo"/>
@@ -920,7 +1002,7 @@
               <w:rPr>
                 <w:noProof/>
               </w:rPr>
-              <w:instrText xml:space="preserve"> PAGEREF _Toc243520964 \h </w:instrText>
+              <w:instrText xml:space="preserve"> PAGEREF _Toc243993192 \h </w:instrText>
             </w:r>
             <w:r>
               <w:rPr>
@@ -957,7 +1039,7 @@
               <w:noProof/>
             </w:rPr>
           </w:pPr>
-          <w:hyperlink w:anchor="_Toc243520965" w:history="1">
+          <w:hyperlink w:anchor="_Toc243993193" w:history="1">
             <w:r>
               <w:rPr>
                 <w:rStyle w:val="Hipervnculo"/>
@@ -981,7 +1063,7 @@
               <w:rPr>
                 <w:noProof/>
               </w:rPr>
-              <w:instrText xml:space="preserve"> PAGEREF _Toc243520965 \h </w:instrText>
+              <w:instrText xml:space="preserve"> PAGEREF _Toc243993193 \h </w:instrText>
             </w:r>
             <w:r>
               <w:rPr>
@@ -1018,7 +1100,7 @@
               <w:noProof/>
             </w:rPr>
           </w:pPr>
-          <w:hyperlink w:anchor="_Toc243520966" w:history="1">
+          <w:hyperlink w:anchor="_Toc243993194" w:history="1">
             <w:r>
               <w:rPr>
                 <w:rStyle w:val="Hipervnculo"/>
@@ -1042,7 +1124,7 @@
               <w:rPr>
                 <w:noProof/>
               </w:rPr>
-              <w:instrText xml:space="preserve"> PAGEREF _Toc243520966 \h </w:instrText>
+              <w:instrText xml:space="preserve"> PAGEREF _Toc243993194 \h </w:instrText>
             </w:r>
             <w:r>
               <w:rPr>
@@ -1079,7 +1161,7 @@
               <w:noProof/>
             </w:rPr>
           </w:pPr>
-          <w:hyperlink w:anchor="_Toc243520967" w:history="1">
+          <w:hyperlink w:anchor="_Toc243993195" w:history="1">
             <w:r>
               <w:rPr>
                 <w:rStyle w:val="Hipervnculo"/>
@@ -1103,7 +1185,7 @@
               <w:rPr>
                 <w:noProof/>
               </w:rPr>
-              <w:instrText xml:space="preserve"> PAGEREF _Toc243520967 \h </w:instrText>
+              <w:instrText xml:space="preserve"> PAGEREF _Toc243993195 \h </w:instrText>
             </w:r>
             <w:r>
               <w:rPr>
@@ -1140,7 +1222,7 @@
               <w:noProof/>
             </w:rPr>
           </w:pPr>
-          <w:hyperlink w:anchor="_Toc243520968" w:history="1">
+          <w:hyperlink w:anchor="_Toc243993196" w:history="1">
             <w:r>
               <w:rPr>
                 <w:rStyle w:val="Hipervnculo"/>
@@ -1164,7 +1246,7 @@
               <w:rPr>
                 <w:noProof/>
               </w:rPr>
-              <w:instrText xml:space="preserve"> PAGEREF _Toc243520968 \h </w:instrText>
+              <w:instrText xml:space="preserve"> PAGEREF _Toc243993196 \h </w:instrText>
             </w:r>
             <w:r>
               <w:rPr>
@@ -1201,7 +1283,7 @@
               <w:noProof/>
             </w:rPr>
           </w:pPr>
-          <w:hyperlink w:anchor="_Toc243520969" w:history="1">
+          <w:hyperlink w:anchor="_Toc243993197" w:history="1">
             <w:r>
               <w:rPr>
                 <w:rStyle w:val="Hipervnculo"/>
@@ -1225,7 +1307,7 @@
               <w:rPr>
                 <w:noProof/>
               </w:rPr>
-              <w:instrText xml:space="preserve"> PAGEREF _Toc243520969 \h </w:instrText>
+              <w:instrText xml:space="preserve"> PAGEREF _Toc243993197 \h </w:instrText>
             </w:r>
             <w:r>
               <w:rPr>
@@ -1262,7 +1344,7 @@
               <w:noProof/>
             </w:rPr>
           </w:pPr>
-          <w:hyperlink w:anchor="_Toc243520970" w:history="1">
+          <w:hyperlink w:anchor="_Toc243993198" w:history="1">
             <w:r>
               <w:rPr>
                 <w:rStyle w:val="Hipervnculo"/>
@@ -1286,7 +1368,7 @@
               <w:rPr>
                 <w:noProof/>
               </w:rPr>
-              <w:instrText xml:space="preserve"> PAGEREF _Toc243520970 \h </w:instrText>
+              <w:instrText xml:space="preserve"> PAGEREF _Toc243993198 \h </w:instrText>
             </w:r>
             <w:r>
               <w:rPr>
@@ -1323,7 +1405,7 @@
               <w:noProof/>
             </w:rPr>
           </w:pPr>
-          <w:hyperlink w:anchor="_Toc243520971" w:history="1">
+          <w:hyperlink w:anchor="_Toc243993199" w:history="1">
             <w:r>
               <w:rPr>
                 <w:rStyle w:val="Hipervnculo"/>
@@ -1347,7 +1429,7 @@
               <w:rPr>
                 <w:noProof/>
               </w:rPr>
-              <w:instrText xml:space="preserve"> PAGEREF _Toc243520971 \h </w:instrText>
+              <w:instrText xml:space="preserve"> PAGEREF _Toc243993199 \h </w:instrText>
             </w:r>
             <w:r>
               <w:rPr>
@@ -1384,7 +1466,7 @@
               <w:noProof/>
             </w:rPr>
           </w:pPr>
-          <w:hyperlink w:anchor="_Toc243520972" w:history="1">
+          <w:hyperlink w:anchor="_Toc243993200" w:history="1">
             <w:r>
               <w:rPr>
                 <w:rStyle w:val="Hipervnculo"/>
@@ -1408,7 +1490,7 @@
               <w:rPr>
                 <w:noProof/>
               </w:rPr>
-              <w:instrText xml:space="preserve"> PAGEREF _Toc243520972 \h </w:instrText>
+              <w:instrText xml:space="preserve"> PAGEREF _Toc243993200 \h </w:instrText>
             </w:r>
             <w:r>
               <w:rPr>
@@ -1445,7 +1527,7 @@
               <w:noProof/>
             </w:rPr>
           </w:pPr>
-          <w:hyperlink w:anchor="_Toc243520973" w:history="1">
+          <w:hyperlink w:anchor="_Toc243993201" w:history="1">
             <w:r>
               <w:rPr>
                 <w:rStyle w:val="Hipervnculo"/>
@@ -1469,7 +1551,7 @@
               <w:rPr>
                 <w:noProof/>
               </w:rPr>
-              <w:instrText xml:space="preserve"> PAGEREF _Toc243520973 \h </w:instrText>
+              <w:instrText xml:space="preserve"> PAGEREF _Toc243993201 \h </w:instrText>
             </w:r>
             <w:r>
               <w:rPr>
@@ -1506,7 +1588,7 @@
               <w:noProof/>
             </w:rPr>
           </w:pPr>
-          <w:hyperlink w:anchor="_Toc243520974" w:history="1">
+          <w:hyperlink w:anchor="_Toc243993202" w:history="1">
             <w:r>
               <w:rPr>
                 <w:rStyle w:val="Hipervnculo"/>
@@ -1530,7 +1612,7 @@
               <w:rPr>
                 <w:noProof/>
               </w:rPr>
-              <w:instrText xml:space="preserve"> PAGEREF _Toc243520974 \h </w:instrText>
+              <w:instrText xml:space="preserve"> PAGEREF _Toc243993202 \h </w:instrText>
             </w:r>
             <w:r>
               <w:rPr>
@@ -1567,7 +1649,7 @@
               <w:noProof/>
             </w:rPr>
           </w:pPr>
-          <w:hyperlink w:anchor="_Toc243520975" w:history="1">
+          <w:hyperlink w:anchor="_Toc243993203" w:history="1">
             <w:r>
               <w:rPr>
                 <w:rStyle w:val="Hipervnculo"/>
@@ -1591,7 +1673,7 @@
               <w:rPr>
                 <w:noProof/>
               </w:rPr>
-              <w:instrText xml:space="preserve"> PAGEREF _Toc243520975 \h </w:instrText>
+              <w:instrText xml:space="preserve"> PAGEREF _Toc243993203 \h </w:instrText>
             </w:r>
             <w:r>
               <w:rPr>
@@ -1628,7 +1710,7 @@
               <w:noProof/>
             </w:rPr>
           </w:pPr>
-          <w:hyperlink w:anchor="_Toc243520976" w:history="1">
+          <w:hyperlink w:anchor="_Toc243993204" w:history="1">
             <w:r>
               <w:rPr>
                 <w:rStyle w:val="Hipervnculo"/>
@@ -1652,7 +1734,7 @@
               <w:rPr>
                 <w:noProof/>
               </w:rPr>
-              <w:instrText xml:space="preserve"> PAGEREF _Toc243520976 \h </w:instrText>
+              <w:instrText xml:space="preserve"> PAGEREF _Toc243993204 \h </w:instrText>
             </w:r>
             <w:r>
               <w:rPr>
@@ -1669,7 +1751,7 @@
               <w:rPr>
                 <w:noProof/>
               </w:rPr>
-              <w:t>9</w:t>
+              <w:t>10</w:t>
             </w:r>
             <w:r>
               <w:rPr>
@@ -1689,7 +1771,7 @@
               <w:noProof/>
             </w:rPr>
           </w:pPr>
-          <w:hyperlink w:anchor="_Toc243520977" w:history="1">
+          <w:hyperlink w:anchor="_Toc243993205" w:history="1">
             <w:r>
               <w:rPr>
                 <w:rStyle w:val="Hipervnculo"/>
@@ -1713,7 +1795,7 @@
               <w:rPr>
                 <w:noProof/>
               </w:rPr>
-              <w:instrText xml:space="preserve"> PAGEREF _Toc243520977 \h </w:instrText>
+              <w:instrText xml:space="preserve"> PAGEREF _Toc243993205 \h </w:instrText>
             </w:r>
             <w:r>
               <w:rPr>
@@ -1750,7 +1832,7 @@
               <w:noProof/>
             </w:rPr>
           </w:pPr>
-          <w:hyperlink w:anchor="_Toc243520978" w:history="1">
+          <w:hyperlink w:anchor="_Toc243993206" w:history="1">
             <w:r>
               <w:rPr>
                 <w:rStyle w:val="Hipervnculo"/>
@@ -1774,7 +1856,7 @@
               <w:rPr>
                 <w:noProof/>
               </w:rPr>
-              <w:instrText xml:space="preserve"> PAGEREF _Toc243520978 \h </w:instrText>
+              <w:instrText xml:space="preserve"> PAGEREF _Toc243993206 \h </w:instrText>
             </w:r>
             <w:r>
               <w:rPr>
@@ -1791,7 +1873,7 @@
               <w:rPr>
                 <w:noProof/>
               </w:rPr>
-              <w:t>17</w:t>
+              <w:t>18</w:t>
             </w:r>
             <w:r>
               <w:rPr>
@@ -1811,7 +1893,7 @@
               <w:noProof/>
             </w:rPr>
           </w:pPr>
-          <w:hyperlink w:anchor="_Toc243520979" w:history="1">
+          <w:hyperlink w:anchor="_Toc243993207" w:history="1">
             <w:r>
               <w:rPr>
                 <w:rStyle w:val="Hipervnculo"/>
@@ -1835,7 +1917,7 @@
               <w:rPr>
                 <w:noProof/>
               </w:rPr>
-              <w:instrText xml:space="preserve"> PAGEREF _Toc243520979 \h </w:instrText>
+              <w:instrText xml:space="preserve"> PAGEREF _Toc243993207 \h </w:instrText>
             </w:r>
             <w:r>
               <w:rPr>
@@ -1872,7 +1954,7 @@
               <w:noProof/>
             </w:rPr>
           </w:pPr>
-          <w:hyperlink w:anchor="_Toc243520980" w:history="1">
+          <w:hyperlink w:anchor="_Toc243993208" w:history="1">
             <w:r>
               <w:rPr>
                 <w:rStyle w:val="Hipervnculo"/>
@@ -1896,7 +1978,7 @@
               <w:rPr>
                 <w:noProof/>
               </w:rPr>
-              <w:instrText xml:space="preserve"> PAGEREF _Toc243520980 \h </w:instrText>
+              <w:instrText xml:space="preserve"> PAGEREF _Toc243993208 \h </w:instrText>
             </w:r>
             <w:r>
               <w:rPr>
@@ -1933,7 +2015,7 @@
               <w:noProof/>
             </w:rPr>
           </w:pPr>
-          <w:hyperlink w:anchor="_Toc243520981" w:history="1">
+          <w:hyperlink w:anchor="_Toc243993209" w:history="1">
             <w:r>
               <w:rPr>
                 <w:rStyle w:val="Hipervnculo"/>
@@ -1957,7 +2039,7 @@
               <w:rPr>
                 <w:noProof/>
               </w:rPr>
-              <w:instrText xml:space="preserve"> PAGEREF _Toc243520981 \h </w:instrText>
+              <w:instrText xml:space="preserve"> PAGEREF _Toc243993209 \h </w:instrText>
             </w:r>
             <w:r>
               <w:rPr>
@@ -1974,7 +2056,7 @@
               <w:rPr>
                 <w:noProof/>
               </w:rPr>
-              <w:t>18</w:t>
+              <w:t>19</w:t>
             </w:r>
             <w:r>
               <w:rPr>
@@ -1994,7 +2076,7 @@
               <w:noProof/>
             </w:rPr>
           </w:pPr>
-          <w:hyperlink w:anchor="_Toc243520982" w:history="1">
+          <w:hyperlink w:anchor="_Toc243993210" w:history="1">
             <w:r>
               <w:rPr>
                 <w:rStyle w:val="Hipervnculo"/>
@@ -2018,7 +2100,7 @@
               <w:rPr>
                 <w:noProof/>
               </w:rPr>
-              <w:instrText xml:space="preserve"> PAGEREF _Toc243520982 \h </w:instrText>
+              <w:instrText xml:space="preserve"> PAGEREF _Toc243993210 \h </w:instrText>
             </w:r>
             <w:r>
               <w:rPr>
@@ -2055,7 +2137,7 @@
               <w:noProof/>
             </w:rPr>
           </w:pPr>
-          <w:hyperlink w:anchor="_Toc243520983" w:history="1">
+          <w:hyperlink w:anchor="_Toc243993211" w:history="1">
             <w:r>
               <w:rPr>
                 <w:rStyle w:val="Hipervnculo"/>
@@ -2079,7 +2161,7 @@
               <w:rPr>
                 <w:noProof/>
               </w:rPr>
-              <w:instrText xml:space="preserve"> PAGEREF _Toc243520983 \h </w:instrText>
+              <w:instrText xml:space="preserve"> PAGEREF _Toc243993211 \h </w:instrText>
             </w:r>
             <w:r>
               <w:rPr>
@@ -2116,7 +2198,7 @@
               <w:noProof/>
             </w:rPr>
           </w:pPr>
-          <w:hyperlink w:anchor="_Toc243520984" w:history="1">
+          <w:hyperlink w:anchor="_Toc243993212" w:history="1">
             <w:r>
               <w:rPr>
                 <w:rStyle w:val="Hipervnculo"/>
@@ -2140,7 +2222,7 @@
               <w:rPr>
                 <w:noProof/>
               </w:rPr>
-              <w:instrText xml:space="preserve"> PAGEREF _Toc243520984 \h </w:instrText>
+              <w:instrText xml:space="preserve"> PAGEREF _Toc243993212 \h </w:instrText>
             </w:r>
             <w:r>
               <w:rPr>
@@ -2177,7 +2259,7 @@
               <w:noProof/>
             </w:rPr>
           </w:pPr>
-          <w:hyperlink w:anchor="_Toc243520985" w:history="1">
+          <w:hyperlink w:anchor="_Toc243993213" w:history="1">
             <w:r>
               <w:rPr>
                 <w:rStyle w:val="Hipervnculo"/>
@@ -2201,7 +2283,7 @@
               <w:rPr>
                 <w:noProof/>
               </w:rPr>
-              <w:instrText xml:space="preserve"> PAGEREF _Toc243520985 \h </w:instrText>
+              <w:instrText xml:space="preserve"> PAGEREF _Toc243993213 \h </w:instrText>
             </w:r>
             <w:r>
               <w:rPr>
@@ -2218,7 +2300,7 @@
               <w:rPr>
                 <w:noProof/>
               </w:rPr>
-              <w:t>20</w:t>
+              <w:t>21</w:t>
             </w:r>
             <w:r>
               <w:rPr>
@@ -2238,7 +2320,7 @@
               <w:noProof/>
             </w:rPr>
           </w:pPr>
-          <w:hyperlink w:anchor="_Toc243520986" w:history="1">
+          <w:hyperlink w:anchor="_Toc243993214" w:history="1">
             <w:r>
               <w:rPr>
                 <w:rStyle w:val="Hipervnculo"/>
@@ -2262,7 +2344,7 @@
               <w:rPr>
                 <w:noProof/>
               </w:rPr>
-              <w:instrText xml:space="preserve"> PAGEREF _Toc243520986 \h </w:instrText>
+              <w:instrText xml:space="preserve"> PAGEREF _Toc243993214 \h </w:instrText>
             </w:r>
             <w:r>
               <w:rPr>
@@ -2279,7 +2361,7 @@
               <w:rPr>
                 <w:noProof/>
               </w:rPr>
-              <w:t>20</w:t>
+              <w:t>21</w:t>
             </w:r>
             <w:r>
               <w:rPr>
@@ -2299,7 +2381,7 @@
               <w:noProof/>
             </w:rPr>
           </w:pPr>
-          <w:hyperlink w:anchor="_Toc243520987" w:history="1">
+          <w:hyperlink w:anchor="_Toc243993215" w:history="1">
             <w:r>
               <w:rPr>
                 <w:rStyle w:val="Hipervnculo"/>
@@ -2323,7 +2405,7 @@
               <w:rPr>
                 <w:noProof/>
               </w:rPr>
-              <w:instrText xml:space="preserve"> PAGEREF _Toc243520987 \h </w:instrText>
+              <w:instrText xml:space="preserve"> PAGEREF _Toc243993215 \h </w:instrText>
             </w:r>
             <w:r>
               <w:rPr>
@@ -2360,7 +2442,7 @@
               <w:noProof/>
             </w:rPr>
           </w:pPr>
-          <w:hyperlink w:anchor="_Toc243520988" w:history="1">
+          <w:hyperlink w:anchor="_Toc243993216" w:history="1">
             <w:r>
               <w:rPr>
                 <w:rStyle w:val="Hipervnculo"/>
@@ -2384,7 +2466,7 @@
               <w:rPr>
                 <w:noProof/>
               </w:rPr>
-              <w:instrText xml:space="preserve"> PAGEREF _Toc243520988 \h </w:instrText>
+              <w:instrText xml:space="preserve"> PAGEREF _Toc243993216 \h </w:instrText>
             </w:r>
             <w:r>
               <w:rPr>
@@ -2421,7 +2503,7 @@
               <w:noProof/>
             </w:rPr>
           </w:pPr>
-          <w:hyperlink w:anchor="_Toc243520989" w:history="1">
+          <w:hyperlink w:anchor="_Toc243993217" w:history="1">
             <w:r>
               <w:rPr>
                 <w:rStyle w:val="Hipervnculo"/>
@@ -2445,7 +2527,7 @@
               <w:rPr>
                 <w:noProof/>
               </w:rPr>
-              <w:instrText xml:space="preserve"> PAGEREF _Toc243520989 \h </w:instrText>
+              <w:instrText xml:space="preserve"> PAGEREF _Toc243993217 \h </w:instrText>
             </w:r>
             <w:r>
               <w:rPr>
@@ -2482,7 +2564,7 @@
               <w:noProof/>
             </w:rPr>
           </w:pPr>
-          <w:hyperlink w:anchor="_Toc243520990" w:history="1">
+          <w:hyperlink w:anchor="_Toc243993218" w:history="1">
             <w:r>
               <w:rPr>
                 <w:rStyle w:val="Hipervnculo"/>
@@ -2506,7 +2588,7 @@
               <w:rPr>
                 <w:noProof/>
               </w:rPr>
-              <w:instrText xml:space="preserve"> PAGEREF _Toc243520990 \h </w:instrText>
+              <w:instrText xml:space="preserve"> PAGEREF _Toc243993218 \h </w:instrText>
             </w:r>
             <w:r>
               <w:rPr>
@@ -2543,7 +2625,7 @@
               <w:noProof/>
             </w:rPr>
           </w:pPr>
-          <w:hyperlink w:anchor="_Toc243520991" w:history="1">
+          <w:hyperlink w:anchor="_Toc243993219" w:history="1">
             <w:r>
               <w:rPr>
                 <w:rStyle w:val="Hipervnculo"/>
@@ -2567,7 +2649,7 @@
               <w:rPr>
                 <w:noProof/>
               </w:rPr>
-              <w:instrText xml:space="preserve"> PAGEREF _Toc243520991 \h </w:instrText>
+              <w:instrText xml:space="preserve"> PAGEREF _Toc243993219 \h </w:instrText>
             </w:r>
             <w:r>
               <w:rPr>
@@ -2604,7 +2686,7 @@
               <w:noProof/>
             </w:rPr>
           </w:pPr>
-          <w:hyperlink w:anchor="_Toc243520992" w:history="1">
+          <w:hyperlink w:anchor="_Toc243993220" w:history="1">
             <w:r>
               <w:rPr>
                 <w:rStyle w:val="Hipervnculo"/>
@@ -2628,7 +2710,7 @@
               <w:rPr>
                 <w:noProof/>
               </w:rPr>
-              <w:instrText xml:space="preserve"> PAGEREF _Toc243520992 \h </w:instrText>
+              <w:instrText xml:space="preserve"> PAGEREF _Toc243993220 \h </w:instrText>
             </w:r>
             <w:r>
               <w:rPr>
@@ -2645,7 +2727,7 @@
               <w:rPr>
                 <w:noProof/>
               </w:rPr>
-              <w:t>22</w:t>
+              <w:t>23</w:t>
             </w:r>
             <w:r>
               <w:rPr>
@@ -2665,7 +2747,7 @@
               <w:noProof/>
             </w:rPr>
           </w:pPr>
-          <w:hyperlink w:anchor="_Toc243520993" w:history="1">
+          <w:hyperlink w:anchor="_Toc243993221" w:history="1">
             <w:r>
               <w:rPr>
                 <w:rStyle w:val="Hipervnculo"/>
@@ -2689,7 +2771,7 @@
               <w:rPr>
                 <w:noProof/>
               </w:rPr>
-              <w:instrText xml:space="preserve"> PAGEREF _Toc243520993 \h </w:instrText>
+              <w:instrText xml:space="preserve"> PAGEREF _Toc243993221 \h </w:instrText>
             </w:r>
             <w:r>
               <w:rPr>
@@ -2706,7 +2788,7 @@
               <w:rPr>
                 <w:noProof/>
               </w:rPr>
-              <w:t>22</w:t>
+              <w:t>23</w:t>
             </w:r>
             <w:r>
               <w:rPr>
@@ -2726,7 +2808,7 @@
               <w:noProof/>
             </w:rPr>
           </w:pPr>
-          <w:hyperlink w:anchor="_Toc243520994" w:history="1">
+          <w:hyperlink w:anchor="_Toc243993222" w:history="1">
             <w:r>
               <w:rPr>
                 <w:rStyle w:val="Hipervnculo"/>
@@ -2750,7 +2832,7 @@
               <w:rPr>
                 <w:noProof/>
               </w:rPr>
-              <w:instrText xml:space="preserve"> PAGEREF _Toc243520994 \h </w:instrText>
+              <w:instrText xml:space="preserve"> PAGEREF _Toc243993222 \h </w:instrText>
             </w:r>
             <w:r>
               <w:rPr>
@@ -2787,7 +2869,7 @@
               <w:noProof/>
             </w:rPr>
           </w:pPr>
-          <w:hyperlink w:anchor="_Toc243520995" w:history="1">
+          <w:hyperlink w:anchor="_Toc243993223" w:history="1">
             <w:r>
               <w:rPr>
                 <w:rStyle w:val="Hipervnculo"/>
@@ -2811,7 +2893,7 @@
               <w:rPr>
                 <w:noProof/>
               </w:rPr>
-              <w:instrText xml:space="preserve"> PAGEREF _Toc243520995 \h </w:instrText>
+              <w:instrText xml:space="preserve"> PAGEREF _Toc243993223 \h </w:instrText>
             </w:r>
             <w:r>
               <w:rPr>
@@ -2848,7 +2930,7 @@
               <w:noProof/>
             </w:rPr>
           </w:pPr>
-          <w:hyperlink w:anchor="_Toc243520996" w:history="1">
+          <w:hyperlink w:anchor="_Toc243993224" w:history="1">
             <w:r>
               <w:rPr>
                 <w:rStyle w:val="Hipervnculo"/>
@@ -2872,7 +2954,7 @@
               <w:rPr>
                 <w:noProof/>
               </w:rPr>
-              <w:instrText xml:space="preserve"> PAGEREF _Toc243520996 \h </w:instrText>
+              <w:instrText xml:space="preserve"> PAGEREF _Toc243993224 \h </w:instrText>
             </w:r>
             <w:r>
               <w:rPr>
@@ -2889,7 +2971,68 @@
               <w:rPr>
                 <w:noProof/>
               </w:rPr>
-              <w:t>23</w:t>
+              <w:t>24</w:t>
+            </w:r>
+            <w:r>
+              <w:rPr>
+                <w:noProof/>
+              </w:rPr>
+              <w:fldChar w:fldCharType="end"/>
+            </w:r>
+          </w:hyperlink>
+        </w:p>
+        <w:p>
+          <w:pPr>
+            <w:pStyle w:val="TDC2"/>
+            <w:tabs>
+              <w:tab w:val="right" w:leader="dot" w:pos="9350"/>
+            </w:tabs>
+            <w:rPr>
+              <w:noProof/>
+            </w:rPr>
+          </w:pPr>
+          <w:hyperlink w:anchor="_Toc243993225" w:history="1">
+            <w:r>
+              <w:rPr>
+                <w:rStyle w:val="Hipervnculo"/>
+                <w:noProof/>
+              </w:rPr>
+              <w:t>12.7 Actualizaciones de seguridad de PHP</w:t>
+            </w:r>
+            <w:r>
+              <w:rPr>
+                <w:noProof/>
+              </w:rPr>
+              <w:tab/>
+            </w:r>
+            <w:r>
+              <w:rPr>
+                <w:noProof/>
+              </w:rPr>
+              <w:fldChar w:fldCharType="begin"/>
+            </w:r>
+            <w:r>
+              <w:rPr>
+                <w:noProof/>
+              </w:rPr>
+              <w:instrText xml:space="preserve"> PAGEREF _Toc243993225 \h </w:instrText>
+            </w:r>
+            <w:r>
+              <w:rPr>
+                <w:noProof/>
+              </w:rPr>
+            </w:r>
+            <w:r>
+              <w:rPr>
+                <w:noProof/>
+              </w:rPr>
+              <w:fldChar w:fldCharType="separate"/>
+            </w:r>
+            <w:r>
+              <w:rPr>
+                <w:noProof/>
+              </w:rPr>
+              <w:t>24</w:t>
             </w:r>
             <w:r>
               <w:rPr>
@@ -2909,7 +3052,7 @@
               <w:noProof/>
             </w:rPr>
           </w:pPr>
-          <w:hyperlink w:anchor="_Toc243520997" w:history="1">
+          <w:hyperlink w:anchor="_Toc243993226" w:history="1">
             <w:r>
               <w:rPr>
                 <w:rStyle w:val="Hipervnculo"/>
@@ -2933,7 +3076,7 @@
               <w:rPr>
                 <w:noProof/>
               </w:rPr>
-              <w:instrText xml:space="preserve"> PAGEREF _Toc243520997 \h </w:instrText>
+              <w:instrText xml:space="preserve"> PAGEREF _Toc243993226 \h </w:instrText>
             </w:r>
             <w:r>
               <w:rPr>
@@ -2950,7 +3093,7 @@
               <w:rPr>
                 <w:noProof/>
               </w:rPr>
-              <w:t>23</w:t>
+              <w:t>24</w:t>
             </w:r>
             <w:r>
               <w:rPr>
@@ -2970,7 +3113,7 @@
               <w:noProof/>
             </w:rPr>
           </w:pPr>
-          <w:hyperlink w:anchor="_Toc243520998" w:history="1">
+          <w:hyperlink w:anchor="_Toc243993227" w:history="1">
             <w:r>
               <w:rPr>
                 <w:rStyle w:val="Hipervnculo"/>
@@ -2994,7 +3137,7 @@
               <w:rPr>
                 <w:noProof/>
               </w:rPr>
-              <w:instrText xml:space="preserve"> PAGEREF _Toc243520998 \h </w:instrText>
+              <w:instrText xml:space="preserve"> PAGEREF _Toc243993227 \h </w:instrText>
             </w:r>
             <w:r>
               <w:rPr>
@@ -3011,7 +3154,7 @@
               <w:rPr>
                 <w:noProof/>
               </w:rPr>
-              <w:t>24</w:t>
+              <w:t>25</w:t>
             </w:r>
             <w:r>
               <w:rPr>
@@ -3033,7 +3176,7 @@
         <w:pStyle w:val="Ttulo1"/>
         <w:pageBreakBefore/>
       </w:pPr>
-      <w:bookmarkStart w:id="0" w:name="_Toc243520959"/>
+      <w:bookmarkStart w:id="0" w:name="_Toc243993187"/>
       <w:r>
         <w:t>1. Introducción</w:t>
       </w:r>
@@ -3071,7 +3214,7 @@
       <w:pPr>
         <w:pStyle w:val="Ttulo2"/>
       </w:pPr>
-      <w:bookmarkStart w:id="1" w:name="_Toc243520960"/>
+      <w:bookmarkStart w:id="1" w:name="_Toc243993188"/>
       <w:r>
         <w:t>1.1 Alcance del manual</w:t>
       </w:r>
@@ -3165,7 +3308,7 @@
       <w:pPr>
         <w:pStyle w:val="Ttulo1"/>
       </w:pPr>
-      <w:bookmarkStart w:id="2" w:name="_Toc243520961"/>
+      <w:bookmarkStart w:id="2" w:name="_Toc243993189"/>
       <w:r>
         <w:t>2. Descripción general del sistema</w:t>
       </w:r>
@@ -3194,7 +3337,7 @@
       <w:pPr>
         <w:pStyle w:val="Ttulo2"/>
       </w:pPr>
-      <w:bookmarkStart w:id="3" w:name="_Toc243520962"/>
+      <w:bookmarkStart w:id="3" w:name="_Toc243993190"/>
       <w:r>
         <w:t>2.1 Módulos</w:t>
       </w:r>
@@ -3942,7 +4085,7 @@
       <w:pPr>
         <w:pStyle w:val="Ttulo2"/>
       </w:pPr>
-      <w:bookmarkStart w:id="4" w:name="_Toc243520963"/>
+      <w:bookmarkStart w:id="4" w:name="_Toc243993191"/>
       <w:r>
         <w:t>2.2 Roles</w:t>
       </w:r>
@@ -4292,7 +4435,7 @@
       <w:pPr>
         <w:pStyle w:val="Ttulo1"/>
       </w:pPr>
-      <w:bookmarkStart w:id="5" w:name="_Toc243520964"/>
+      <w:bookmarkStart w:id="5" w:name="_Toc243993192"/>
       <w:r>
         <w:t>3. Requisitos</w:t>
       </w:r>
@@ -4302,7 +4445,7 @@
       <w:pPr>
         <w:pStyle w:val="Ttulo2"/>
       </w:pPr>
-      <w:bookmarkStart w:id="6" w:name="_Toc243520965"/>
+      <w:bookmarkStart w:id="6" w:name="_Toc243993193"/>
       <w:r>
         <w:t>3.1 Servidor</w:t>
       </w:r>
@@ -4974,7 +5117,7 @@
       <w:pPr>
         <w:pStyle w:val="Ttulo2"/>
       </w:pPr>
-      <w:bookmarkStart w:id="7" w:name="_Toc243520966"/>
+      <w:bookmarkStart w:id="7" w:name="_Toc243993194"/>
       <w:r>
         <w:t>3.2 Equipos de los usuarios</w:t>
       </w:r>
@@ -5016,6 +5159,19 @@
         <w:spacing w:after="70" w:line="290" w:lineRule="auto"/>
       </w:pPr>
       <w:r>
+        <w:t>En el teléfono se puede instalar como aplicación (PWA), sin tienda de aplicaciones: Chrome en Android (menú, Instalar aplicación) o Safari en iPhone (Compartir, Agregar a inicio).</w:t>
+      </w:r>
+    </w:p>
+    <w:p>
+      <w:pPr>
+        <w:pStyle w:val="Prrafodelista"/>
+        <w:numPr>
+          <w:ilvl w:val="0"/>
+          <w:numId w:val="2"/>
+        </w:numPr>
+        <w:spacing w:after="70" w:line="290" w:lineRule="auto"/>
+      </w:pPr>
+      <w:r>
         <w:t>Conexión a internet. Las gráficas usan Chart.js 4.4.1 desde cdnjs; los iconos están incrustados y no dependen de servicios externos.</w:t>
       </w:r>
     </w:p>
@@ -5023,7 +5179,7 @@
       <w:pPr>
         <w:pStyle w:val="Ttulo2"/>
       </w:pPr>
-      <w:bookmarkStart w:id="8" w:name="_Toc243520967"/>
+      <w:bookmarkStart w:id="8" w:name="_Toc243993195"/>
       <w:r>
         <w:t>3.3 Ambiente de desarrollo</w:t>
       </w:r>
@@ -5059,7 +5215,7 @@
       <w:pPr>
         <w:pStyle w:val="Ttulo2"/>
       </w:pPr>
-      <w:bookmarkStart w:id="9" w:name="_Toc243520968"/>
+      <w:bookmarkStart w:id="9" w:name="_Toc243993196"/>
       <w:r>
         <w:t>3.4 Ambientes</w:t>
       </w:r>
@@ -5409,7 +5565,7 @@
       <w:pPr>
         <w:pStyle w:val="Ttulo1"/>
       </w:pPr>
-      <w:bookmarkStart w:id="10" w:name="_Toc243520969"/>
+      <w:bookmarkStart w:id="10" w:name="_Toc243993197"/>
       <w:r>
         <w:t>4. Arquitectura</w:t>
       </w:r>
@@ -5778,7 +5934,7 @@
       <w:pPr>
         <w:pStyle w:val="Ttulo2"/>
       </w:pPr>
-      <w:bookmarkStart w:id="11" w:name="_Toc243520970"/>
+      <w:bookmarkStart w:id="11" w:name="_Toc243993198"/>
       <w:r>
         <w:t>4.1 Controlador frontal</w:t>
       </w:r>
@@ -6029,7 +6185,7 @@
       <w:pPr>
         <w:pStyle w:val="Ttulo2"/>
       </w:pPr>
-      <w:bookmarkStart w:id="12" w:name="_Toc243520971"/>
+      <w:bookmarkStart w:id="12" w:name="_Toc243993199"/>
       <w:r>
         <w:t>4.2 Acciones del controlador</w:t>
       </w:r>
@@ -7506,7 +7662,7 @@
       <w:pPr>
         <w:pStyle w:val="Ttulo1"/>
       </w:pPr>
-      <w:bookmarkStart w:id="13" w:name="_Toc243520972"/>
+      <w:bookmarkStart w:id="13" w:name="_Toc243993200"/>
       <w:r>
         <w:t>5. Estructura del proyecto</w:t>
       </w:r>
@@ -8128,7 +8284,7 @@
                 <w:sz w:val="19"/>
                 <w:szCs w:val="19"/>
               </w:rPr>
-              <w:t>Única carpeta visible desde el navegador: index.php, .htaccess, css/, js/ y assets/.</w:t>
+              <w:t>Única carpeta visible desde el navegador: index.php, .htaccess, css/, js/, manifest.php y sw.php (aplicación instalable), sin-conexion.html y assets/pwa/ (íconos de la aplicación: verdes en producción, naranjas en la demostración).</w:t>
             </w:r>
           </w:p>
         </w:tc>
@@ -8184,7 +8340,7 @@
                 <w:sz w:val="19"/>
                 <w:szCs w:val="19"/>
               </w:rPr>
-              <w:t>Vistas por módulo: auth, layouts, ninos, mediciones, alertas, carnet, usuarios y reportes.</w:t>
+              <w:t>Vistas por módulo: auth, layouts, ninos, mediciones, alertas, carnet, usuarios y reportes. layouts/pwa.php lleva al encabezado de cada página el manifiesto, los íconos y el registro del service worker.</w:t>
             </w:r>
           </w:p>
         </w:tc>
@@ -8643,7 +8799,7 @@
       <w:pPr>
         <w:pStyle w:val="Ttulo1"/>
       </w:pPr>
-      <w:bookmarkStart w:id="14" w:name="_Toc243520973"/>
+      <w:bookmarkStart w:id="14" w:name="_Toc243993201"/>
       <w:r>
         <w:t>6. Componentes del código</w:t>
       </w:r>
@@ -10633,7 +10789,7 @@
       <w:pPr>
         <w:pStyle w:val="Ttulo1"/>
       </w:pPr>
-      <w:bookmarkStart w:id="15" w:name="_Toc243520974"/>
+      <w:bookmarkStart w:id="15" w:name="_Toc243993202"/>
       <w:r>
         <w:t>7. Base de datos</w:t>
       </w:r>
@@ -10693,7 +10849,7 @@
       <w:pPr>
         <w:pStyle w:val="Ttulo2"/>
       </w:pPr>
-      <w:bookmarkStart w:id="16" w:name="_Toc243520975"/>
+      <w:bookmarkStart w:id="16" w:name="_Toc243993203"/>
       <w:r>
         <w:t>7.1 Modelo</w:t>
       </w:r>
@@ -10823,7 +10979,7 @@
       <w:pPr>
         <w:pStyle w:val="Ttulo2"/>
       </w:pPr>
-      <w:bookmarkStart w:id="17" w:name="_Toc243520976"/>
+      <w:bookmarkStart w:id="17" w:name="_Toc243993204"/>
       <w:r>
         <w:t>7.2 Reglas de integridad</w:t>
       </w:r>
@@ -10901,7 +11057,7 @@
       <w:pPr>
         <w:pStyle w:val="Ttulo2"/>
       </w:pPr>
-      <w:bookmarkStart w:id="18" w:name="_Toc243520977"/>
+      <w:bookmarkStart w:id="18" w:name="_Toc243993205"/>
       <w:r>
         <w:t>7.3 Diccionario de datos</w:t>
       </w:r>
@@ -34682,7 +34838,7 @@
       <w:pPr>
         <w:pStyle w:val="Ttulo1"/>
       </w:pPr>
-      <w:bookmarkStart w:id="19" w:name="_Toc243520978"/>
+      <w:bookmarkStart w:id="19" w:name="_Toc243993206"/>
       <w:r>
         <w:t>8. Motor de cálculo</w:t>
       </w:r>
@@ -34766,7 +34922,7 @@
       <w:pPr>
         <w:pStyle w:val="Ttulo2"/>
       </w:pPr>
-      <w:bookmarkStart w:id="20" w:name="_Toc243520979"/>
+      <w:bookmarkStart w:id="20" w:name="_Toc243993207"/>
       <w:r>
         <w:t>8.1 Reglas de la OMS aplicadas</w:t>
       </w:r>
@@ -34856,7 +35012,7 @@
       <w:pPr>
         <w:pStyle w:val="Ttulo2"/>
       </w:pPr>
-      <w:bookmarkStart w:id="21" w:name="_Toc243520980"/>
+      <w:bookmarkStart w:id="21" w:name="_Toc243993208"/>
       <w:r>
         <w:t>8.2 Clasificación por indicador</w:t>
       </w:r>
@@ -35534,7 +35690,7 @@
       <w:pPr>
         <w:pStyle w:val="Ttulo2"/>
       </w:pPr>
-      <w:bookmarkStart w:id="22" w:name="_Toc243520981"/>
+      <w:bookmarkStart w:id="22" w:name="_Toc243993209"/>
       <w:r>
         <w:t>8.3 Niveles de alerta</w:t>
       </w:r>
@@ -36163,7 +36319,7 @@
       <w:pPr>
         <w:pStyle w:val="Ttulo2"/>
       </w:pPr>
-      <w:bookmarkStart w:id="23" w:name="_Toc243520982"/>
+      <w:bookmarkStart w:id="23" w:name="_Toc243993210"/>
       <w:r>
         <w:t>8.4 Pruebas y recálculo</w:t>
       </w:r>
@@ -36239,7 +36395,7 @@
       <w:pPr>
         <w:pStyle w:val="Ttulo1"/>
       </w:pPr>
-      <w:bookmarkStart w:id="24" w:name="_Toc243520983"/>
+      <w:bookmarkStart w:id="24" w:name="_Toc243993211"/>
       <w:r>
         <w:t>9. Seguridad</w:t>
       </w:r>
@@ -37195,6 +37351,117 @@
                 <w:szCs w:val="18"/>
               </w:rPr>
               <w:t>En producción no se muestran errores técnicos; se guardan en errores_php.log.</w:t>
+            </w:r>
+          </w:p>
+        </w:tc>
+      </w:tr>
+      <w:tr>
+        <w:trPr>
+          <w:cnfStyle w:val="000000100000" w:firstRow="0" w:lastRow="0" w:firstColumn="0" w:lastColumn="0" w:oddVBand="0" w:evenVBand="0" w:oddHBand="1" w:evenHBand="0" w:firstRowFirstColumn="0" w:firstRowLastColumn="0" w:lastRowFirstColumn="0" w:lastRowLastColumn="0"/>
+          <w:cantSplit/>
+        </w:trPr>
+        <w:tc>
+          <w:tcPr>
+            <w:cnfStyle w:val="001000000000" w:firstRow="0" w:lastRow="0" w:firstColumn="1" w:lastColumn="0" w:oddVBand="0" w:evenVBand="0" w:oddHBand="0" w:evenHBand="0" w:firstRowFirstColumn="0" w:firstRowLastColumn="0" w:lastRowFirstColumn="0" w:lastRowLastColumn="0"/>
+            <w:tcW w:w="2300" w:type="dxa"/>
+            <w:tcMar>
+              <w:top w:w="60" w:type="dxa"/>
+              <w:left w:w="100" w:type="dxa"/>
+              <w:bottom w:w="60" w:type="dxa"/>
+              <w:right w:w="100" w:type="dxa"/>
+            </w:tcMar>
+            <w:vAlign w:val="center"/>
+          </w:tcPr>
+          <w:p>
+            <w:pPr>
+              <w:spacing w:line="260" w:lineRule="auto"/>
+            </w:pPr>
+            <w:r>
+              <w:rPr>
+                <w:sz w:val="18"/>
+                <w:szCs w:val="18"/>
+              </w:rPr>
+              <w:t>Aplicación instalable</w:t>
+            </w:r>
+          </w:p>
+        </w:tc>
+        <w:tc>
+          <w:tcPr>
+            <w:tcW w:w="7060" w:type="dxa"/>
+            <w:tcMar>
+              <w:top w:w="60" w:type="dxa"/>
+              <w:left w:w="100" w:type="dxa"/>
+              <w:bottom w:w="60" w:type="dxa"/>
+              <w:right w:w="100" w:type="dxa"/>
+            </w:tcMar>
+            <w:vAlign w:val="center"/>
+          </w:tcPr>
+          <w:p>
+            <w:pPr>
+              <w:spacing w:line="260" w:lineRule="auto"/>
+              <w:cnfStyle w:val="000000100000" w:firstRow="0" w:lastRow="0" w:firstColumn="0" w:lastColumn="0" w:oddVBand="0" w:evenVBand="0" w:oddHBand="1" w:evenHBand="0" w:firstRowFirstColumn="0" w:firstRowLastColumn="0" w:lastRowFirstColumn="0" w:lastRowLastColumn="0"/>
+            </w:pPr>
+            <w:r>
+              <w:rPr>
+                <w:sz w:val="18"/>
+                <w:szCs w:val="18"/>
+              </w:rPr>
+              <w:t>El service worker no guarda en caché ninguna página del sistema (datos de salud de menores y teléfonos compartidos) ni interviene en formularios y descargas; solo muestra un aviso cuando no hay conexión. Manifiesto y service worker son PHP para que el CDN del hosting no los guarde.</w:t>
+            </w:r>
+          </w:p>
+        </w:tc>
+      </w:tr>
+      <w:tr>
+        <w:trPr>
+          <w:cantSplit/>
+        </w:trPr>
+        <w:tc>
+          <w:tcPr>
+            <w:cnfStyle w:val="001000000000" w:firstRow="0" w:lastRow="0" w:firstColumn="1" w:lastColumn="0" w:oddVBand="0" w:evenVBand="0" w:oddHBand="0" w:evenHBand="0" w:firstRowFirstColumn="0" w:firstRowLastColumn="0" w:lastRowFirstColumn="0" w:lastRowLastColumn="0"/>
+            <w:tcW w:w="2300" w:type="dxa"/>
+            <w:tcMar>
+              <w:top w:w="60" w:type="dxa"/>
+              <w:left w:w="100" w:type="dxa"/>
+              <w:bottom w:w="60" w:type="dxa"/>
+              <w:right w:w="100" w:type="dxa"/>
+            </w:tcMar>
+            <w:vAlign w:val="center"/>
+          </w:tcPr>
+          <w:p>
+            <w:pPr>
+              <w:spacing w:line="260" w:lineRule="auto"/>
+            </w:pPr>
+            <w:r>
+              <w:rPr>
+                <w:sz w:val="18"/>
+                <w:szCs w:val="18"/>
+              </w:rPr>
+              <w:t>Versión de PHP</w:t>
+            </w:r>
+          </w:p>
+        </w:tc>
+        <w:tc>
+          <w:tcPr>
+            <w:tcW w:w="7060" w:type="dxa"/>
+            <w:tcMar>
+              <w:top w:w="60" w:type="dxa"/>
+              <w:left w:w="100" w:type="dxa"/>
+              <w:bottom w:w="60" w:type="dxa"/>
+              <w:right w:w="100" w:type="dxa"/>
+            </w:tcMar>
+            <w:vAlign w:val="center"/>
+          </w:tcPr>
+          <w:p>
+            <w:pPr>
+              <w:spacing w:line="260" w:lineRule="auto"/>
+              <w:cnfStyle w:val="000000000000" w:firstRow="0" w:lastRow="0" w:firstColumn="0" w:lastColumn="0" w:oddVBand="0" w:evenVBand="0" w:oddHBand="0" w:evenHBand="0" w:firstRowFirstColumn="0" w:firstRowLastColumn="0" w:lastRowFirstColumn="0" w:lastRowLastColumn="0"/>
+            </w:pPr>
+            <w:r>
+              <w:rPr>
+                <w:sz w:val="18"/>
+                <w:szCs w:val="18"/>
+              </w:rPr>
+              <w:t>Las fallas de PHP las corrige el hosting. La versión que ve el navegador (encabezado X-Powered-By) puede no cambiar con un parche: se comprueba la fecha de compilación (sección 12.7).</w:t>
             </w:r>
           </w:p>
         </w:tc>
@@ -37277,7 +37544,7 @@
       <w:pPr>
         <w:pStyle w:val="Ttulo1"/>
       </w:pPr>
-      <w:bookmarkStart w:id="25" w:name="_Toc243520984"/>
+      <w:bookmarkStart w:id="25" w:name="_Toc243993212"/>
       <w:r>
         <w:t>10. Reportes y formatos</w:t>
       </w:r>
@@ -37438,7 +37705,7 @@
       <w:pPr>
         <w:pStyle w:val="Ttulo1"/>
       </w:pPr>
-      <w:bookmarkStart w:id="26" w:name="_Toc243520985"/>
+      <w:bookmarkStart w:id="26" w:name="_Toc243993213"/>
       <w:r>
         <w:t>11. Instalación y despliegue</w:t>
       </w:r>
@@ -37468,7 +37735,7 @@
       <w:pPr>
         <w:pStyle w:val="Ttulo2"/>
       </w:pPr>
-      <w:bookmarkStart w:id="27" w:name="_Toc243520986"/>
+      <w:bookmarkStart w:id="27" w:name="_Toc243993214"/>
       <w:r>
         <w:t>11.1 Pasos</w:t>
       </w:r>
@@ -37725,7 +37992,7 @@
       <w:pPr>
         <w:pStyle w:val="Ttulo2"/>
       </w:pPr>
-      <w:bookmarkStart w:id="28" w:name="_Toc243520987"/>
+      <w:bookmarkStart w:id="28" w:name="_Toc243993215"/>
       <w:r>
         <w:t>11.2 Configuración (config/config.php)</w:t>
       </w:r>
@@ -38370,7 +38637,7 @@
       <w:pPr>
         <w:pStyle w:val="Ttulo2"/>
       </w:pPr>
-      <w:bookmarkStart w:id="29" w:name="_Toc243520988"/>
+      <w:bookmarkStart w:id="29" w:name="_Toc243993216"/>
       <w:r>
         <w:t>11.3 Ambiente de demostración</w:t>
       </w:r>
@@ -38433,7 +38700,7 @@
       <w:pPr>
         <w:pStyle w:val="Ttulo2"/>
       </w:pPr>
-      <w:bookmarkStart w:id="30" w:name="_Toc243520989"/>
+      <w:bookmarkStart w:id="30" w:name="_Toc243993217"/>
       <w:r>
         <w:t>11.4 Sin consola</w:t>
       </w:r>
@@ -38507,7 +38774,7 @@
       <w:pPr>
         <w:pStyle w:val="Ttulo1"/>
       </w:pPr>
-      <w:bookmarkStart w:id="31" w:name="_Toc243520990"/>
+      <w:bookmarkStart w:id="31" w:name="_Toc243993218"/>
       <w:r>
         <w:t>12. Mantenimiento</w:t>
       </w:r>
@@ -38517,7 +38784,7 @@
       <w:pPr>
         <w:pStyle w:val="Ttulo2"/>
       </w:pPr>
-      <w:bookmarkStart w:id="32" w:name="_Toc243520991"/>
+      <w:bookmarkStart w:id="32" w:name="_Toc243993219"/>
       <w:r>
         <w:t>12.1 Actualizar el sistema</w:t>
       </w:r>
@@ -38663,7 +38930,7 @@
       <w:pPr>
         <w:pStyle w:val="Ttulo2"/>
       </w:pPr>
-      <w:bookmarkStart w:id="33" w:name="_Toc243520992"/>
+      <w:bookmarkStart w:id="33" w:name="_Toc243993220"/>
       <w:r>
         <w:t>12.2 Respaldo de la base de datos</w:t>
       </w:r>
@@ -38699,7 +38966,7 @@
       <w:pPr>
         <w:pStyle w:val="Ttulo2"/>
       </w:pPr>
-      <w:bookmarkStart w:id="34" w:name="_Toc243520993"/>
+      <w:bookmarkStart w:id="34" w:name="_Toc243993221"/>
       <w:r>
         <w:t>12.3 Scripts de línea de comandos</w:t>
       </w:r>
@@ -39225,7 +39492,7 @@
       <w:pPr>
         <w:pStyle w:val="Ttulo2"/>
       </w:pPr>
-      <w:bookmarkStart w:id="35" w:name="_Toc243520994"/>
+      <w:bookmarkStart w:id="35" w:name="_Toc243993222"/>
       <w:r>
         <w:t>12.4 Tareas automáticas</w:t>
       </w:r>
@@ -39255,7 +39522,7 @@
       <w:pPr>
         <w:pStyle w:val="Ttulo2"/>
       </w:pPr>
-      <w:bookmarkStart w:id="36" w:name="_Toc243520995"/>
+      <w:bookmarkStart w:id="36" w:name="_Toc243993223"/>
       <w:r>
         <w:t>12.5 Recuperación de emergencia del administrador</w:t>
       </w:r>
@@ -39285,7 +39552,7 @@
       <w:pPr>
         <w:pStyle w:val="Ttulo2"/>
       </w:pPr>
-      <w:bookmarkStart w:id="37" w:name="_Toc243520996"/>
+      <w:bookmarkStart w:id="37" w:name="_Toc243993224"/>
       <w:r>
         <w:t>12.6 Paso de ambiente de prueba a producción</w:t>
       </w:r>
@@ -39313,13 +39580,156 @@
     </w:p>
     <w:p>
       <w:pPr>
+        <w:pStyle w:val="Ttulo2"/>
+      </w:pPr>
+      <w:bookmarkStart w:id="38" w:name="_Toc243993225"/>
+      <w:r>
+        <w:t>12.7 Actualizaciones de seguridad de PHP</w:t>
+      </w:r>
+      <w:bookmarkEnd w:id="38"/>
+    </w:p>
+    <w:p>
+      <w:pPr>
+        <w:spacing w:after="140" w:line="300" w:lineRule="auto"/>
+        <w:jc w:val="both"/>
+      </w:pPr>
+      <w:r>
+        <w:t>En un hosting compartido, PHP lo actualiza el proveedor. Cuando se publique una falla de PHP:</w:t>
+      </w:r>
+    </w:p>
+    <w:p>
+      <w:pPr>
+        <w:pStyle w:val="Prrafodelista"/>
+        <w:numPr>
+          <w:ilvl w:val="0"/>
+          <w:numId w:val="2"/>
+        </w:numPr>
+        <w:spacing w:after="70" w:line="290" w:lineRule="auto"/>
+      </w:pPr>
+      <w:r>
+        <w:t xml:space="preserve">Comprobar el parche en el panel: sitio, PHP Info, línea </w:t>
+      </w:r>
+      <w:r>
+        <w:rPr>
+          <w:b/>
+          <w:bCs/>
+        </w:rPr>
+        <w:t>Build Date</w:t>
+      </w:r>
+      <w:r>
+        <w:t>. Debe ser igual o posterior a la fecha de la corrección. Así se confirmó, el 23 de octubre de 2026, el parche de las fallas CVE-2026-109618 y CVE-2026-109619 (fecha de compilación del 21 de octubre), aunque el número de versión siguió en 8.2.34.</w:t>
+      </w:r>
+    </w:p>
+    <w:p>
+      <w:pPr>
+        <w:pStyle w:val="Prrafodelista"/>
+        <w:numPr>
+          <w:ilvl w:val="0"/>
+          <w:numId w:val="2"/>
+        </w:numPr>
+        <w:spacing w:after="70" w:line="290" w:lineRule="auto"/>
+      </w:pPr>
+      <w:r>
+        <w:t xml:space="preserve">Revisar que nadie haya dejado archivos en el servidor: </w:t>
+      </w:r>
+      <w:r>
+        <w:rPr>
+          <w:rFonts w:ascii="Consolas" w:eastAsia="Consolas" w:hAnsi="Consolas" w:cs="Consolas"/>
+          <w:sz w:val="20"/>
+          <w:szCs w:val="20"/>
+        </w:rPr>
+        <w:t>git status ‑‑short ‑‑ignored</w:t>
+      </w:r>
+      <w:r>
+        <w:t xml:space="preserve"> en las carpetas de producción y de la demostración. Solo deben aparecer </w:t>
+      </w:r>
+      <w:r>
+        <w:rPr>
+          <w:rFonts w:ascii="Consolas" w:eastAsia="Consolas" w:hAnsi="Consolas" w:cs="Consolas"/>
+          <w:sz w:val="20"/>
+          <w:szCs w:val="20"/>
+        </w:rPr>
+        <w:t>config/config.php</w:t>
+      </w:r>
+      <w:r>
+        <w:t xml:space="preserve"> y, en producción, el enlace </w:t>
+      </w:r>
+      <w:r>
+        <w:rPr>
+          <w:rFonts w:ascii="Consolas" w:eastAsia="Consolas" w:hAnsi="Consolas" w:cs="Consolas"/>
+          <w:sz w:val="20"/>
+          <w:szCs w:val="20"/>
+        </w:rPr>
+        <w:t>public/pruebas</w:t>
+      </w:r>
+      <w:r>
+        <w:t>.</w:t>
+      </w:r>
+    </w:p>
+    <w:p>
+      <w:pPr>
+        <w:pStyle w:val="Prrafodelista"/>
+        <w:numPr>
+          <w:ilvl w:val="0"/>
+          <w:numId w:val="2"/>
+        </w:numPr>
+        <w:spacing w:after="70" w:line="290" w:lineRule="auto"/>
+      </w:pPr>
+      <w:r>
+        <w:rPr>
+          <w:b/>
+          <w:bCs/>
+        </w:rPr>
+        <w:t>PHP 8.2 deja de recibir correcciones el 31 de diciembre de 2026.</w:t>
+      </w:r>
+      <w:r>
+        <w:t xml:space="preserve"> Antes de esa fecha, cambiar la versión en el panel (Avanzado, Configuración de PHP) a 8.3 o superior: primero en la demostración, revisar las pantallas principales, y después en producción, fuera del horario del puesto.</w:t>
+      </w:r>
+    </w:p>
+    <w:p>
+      <w:pPr>
+        <w:pStyle w:val="Prrafodelista"/>
+        <w:numPr>
+          <w:ilvl w:val="0"/>
+          <w:numId w:val="2"/>
+        </w:numPr>
+        <w:spacing w:after="70" w:line="290" w:lineRule="auto"/>
+      </w:pPr>
+      <w:r>
+        <w:t>Si se cambia la página sin conexión, subir la versión (</w:t>
+      </w:r>
+      <w:r>
+        <w:rPr>
+          <w:rFonts w:ascii="Consolas" w:eastAsia="Consolas" w:hAnsi="Consolas" w:cs="Consolas"/>
+          <w:sz w:val="20"/>
+          <w:szCs w:val="20"/>
+        </w:rPr>
+        <w:t>VERSION</w:t>
+      </w:r>
+      <w:r>
+        <w:t xml:space="preserve">) en </w:t>
+      </w:r>
+      <w:r>
+        <w:rPr>
+          <w:rFonts w:ascii="Consolas" w:eastAsia="Consolas" w:hAnsi="Consolas" w:cs="Consolas"/>
+          <w:sz w:val="20"/>
+          <w:szCs w:val="20"/>
+        </w:rPr>
+        <w:t>public/sw.php</w:t>
+      </w:r>
+      <w:r>
+        <w:t xml:space="preserve"> para que los teléfonos la descarguen de nuevo.</w:t>
+      </w:r>
+    </w:p>
+    <w:p>
+      <w:pPr>
         <w:pStyle w:val="Ttulo1"/>
       </w:pPr>
-      <w:bookmarkStart w:id="38" w:name="_Toc243520997"/>
+      <w:bookmarkStart w:id="39" w:name="_Toc243993226"/>
       <w:r>
         <w:t>13. Solución de problemas</w:t>
       </w:r>
-      <w:bookmarkEnd w:id="38"/>
+      <w:bookmarkEnd w:id="39"/>
     </w:p>
     <w:tbl>
       <w:tblPr>
@@ -39912,7 +40322,7 @@
                 <w:sz w:val="18"/>
                 <w:szCs w:val="18"/>
               </w:rPr>
-              <w:t>No llega el código o el enlace</w:t>
+              <w:t>Chrome no ofrece Instalar aplicación</w:t>
             </w:r>
           </w:p>
         </w:tc>
@@ -39937,7 +40347,7 @@
                 <w:sz w:val="18"/>
                 <w:szCs w:val="18"/>
               </w:rPr>
-              <w:t>Revisar la carpeta de spam y el correo registrado en Usuarios. Probar el envío con php scripts/probar_correo.php; los errores de envío quedan en la bitácora (error_correo) y en errores_php.log.</w:t>
+              <w:t>Debe abrirse por https, con manifest.php y sw.php respondiendo y los íconos de assets/pwa/ en el servidor. En las herramientas de desarrollador de Chrome, pestaña Application, Manifest muestra la causa.</w:t>
             </w:r>
           </w:p>
         </w:tc>
@@ -39968,6 +40378,61 @@
                 <w:sz w:val="18"/>
                 <w:szCs w:val="18"/>
               </w:rPr>
+              <w:t>No llega el código o el enlace</w:t>
+            </w:r>
+          </w:p>
+        </w:tc>
+        <w:tc>
+          <w:tcPr>
+            <w:tcW w:w="6060" w:type="dxa"/>
+            <w:tcMar>
+              <w:top w:w="60" w:type="dxa"/>
+              <w:left w:w="100" w:type="dxa"/>
+              <w:bottom w:w="60" w:type="dxa"/>
+              <w:right w:w="100" w:type="dxa"/>
+            </w:tcMar>
+            <w:vAlign w:val="center"/>
+          </w:tcPr>
+          <w:p>
+            <w:pPr>
+              <w:spacing w:line="260" w:lineRule="auto"/>
+              <w:cnfStyle w:val="000000100000" w:firstRow="0" w:lastRow="0" w:firstColumn="0" w:lastColumn="0" w:oddVBand="0" w:evenVBand="0" w:oddHBand="1" w:evenHBand="0" w:firstRowFirstColumn="0" w:firstRowLastColumn="0" w:lastRowFirstColumn="0" w:lastRowLastColumn="0"/>
+            </w:pPr>
+            <w:r>
+              <w:rPr>
+                <w:sz w:val="18"/>
+                <w:szCs w:val="18"/>
+              </w:rPr>
+              <w:t>Revisar la carpeta de spam y el correo registrado en Usuarios. Probar el envío con php scripts/probar_correo.php; los errores de envío quedan en la bitácora (error_correo) y en errores_php.log.</w:t>
+            </w:r>
+          </w:p>
+        </w:tc>
+      </w:tr>
+      <w:tr>
+        <w:trPr>
+          <w:cantSplit/>
+        </w:trPr>
+        <w:tc>
+          <w:tcPr>
+            <w:cnfStyle w:val="001000000000" w:firstRow="0" w:lastRow="0" w:firstColumn="1" w:lastColumn="0" w:oddVBand="0" w:evenVBand="0" w:oddHBand="0" w:evenHBand="0" w:firstRowFirstColumn="0" w:firstRowLastColumn="0" w:lastRowFirstColumn="0" w:lastRowLastColumn="0"/>
+            <w:tcW w:w="3300" w:type="dxa"/>
+            <w:tcMar>
+              <w:top w:w="60" w:type="dxa"/>
+              <w:left w:w="100" w:type="dxa"/>
+              <w:bottom w:w="60" w:type="dxa"/>
+              <w:right w:w="100" w:type="dxa"/>
+            </w:tcMar>
+            <w:vAlign w:val="center"/>
+          </w:tcPr>
+          <w:p>
+            <w:pPr>
+              <w:spacing w:line="260" w:lineRule="auto"/>
+            </w:pPr>
+            <w:r>
+              <w:rPr>
+                <w:sz w:val="18"/>
+                <w:szCs w:val="18"/>
+              </w:rPr>
               <w:t>"MySQL server has gone away" en un script</w:t>
             </w:r>
           </w:p>
@@ -39986,7 +40451,7 @@
           <w:p>
             <w:pPr>
               <w:spacing w:line="260" w:lineRule="auto"/>
-              <w:cnfStyle w:val="000000100000" w:firstRow="0" w:lastRow="0" w:firstColumn="0" w:lastColumn="0" w:oddVBand="0" w:evenVBand="0" w:oddHBand="1" w:evenHBand="0" w:firstRowFirstColumn="0" w:firstRowLastColumn="0" w:lastRowFirstColumn="0" w:lastRowLastColumn="0"/>
+              <w:cnfStyle w:val="000000000000" w:firstRow="0" w:lastRow="0" w:firstColumn="0" w:lastColumn="0" w:oddVBand="0" w:evenVBand="0" w:oddHBand="0" w:evenHBand="0" w:firstRowFirstColumn="0" w:firstRowLastColumn="0" w:lastRowFirstColumn="0" w:lastRowLastColumn="0"/>
             </w:pPr>
             <w:r>
               <w:rPr>
@@ -40008,11 +40473,11 @@
       <w:pPr>
         <w:pStyle w:val="Ttulo1"/>
       </w:pPr>
-      <w:bookmarkStart w:id="39" w:name="_Toc243520998"/>
+      <w:bookmarkStart w:id="40" w:name="_Toc243993227"/>
       <w:r>
         <w:t>14. Trabajo pendiente</w:t>
       </w:r>
-      <w:bookmarkEnd w:id="39"/>
+      <w:bookmarkEnd w:id="40"/>
     </w:p>
     <w:p>
       <w:pPr>
@@ -40051,6 +40516,19 @@
       </w:pPr>
       <w:r>
         <w:t>Integración con SIGSA Web, cuando el Ministerio lo permita.</w:t>
+      </w:r>
+    </w:p>
+    <w:p>
+      <w:pPr>
+        <w:pStyle w:val="Prrafodelista"/>
+        <w:numPr>
+          <w:ilvl w:val="0"/>
+          <w:numId w:val="2"/>
+        </w:numPr>
+        <w:spacing w:after="70" w:line="290" w:lineRule="auto"/>
+      </w:pPr>
+      <w:r>
+        <w:t>Cambiar a PHP 8.3 o superior antes del 31 de diciembre de 2026 (sección 12.7).</w:t>
       </w:r>
     </w:p>
     <w:p>
@@ -40178,10 +40656,10 @@
 <file path=word/numbering.xml><?xml version="1.0" encoding="utf-8"?>
 <w:numbering xmlns:wpc="http://schemas.microsoft.com/office/word/2010/wordprocessingCanvas" xmlns:cx="http://schemas.microsoft.com/office/drawing/2014/chartex" xmlns:cx1="http://schemas.microsoft.com/office/drawing/2015/9/8/chartex" xmlns:cx2="http://schemas.microsoft.com/office/drawing/2015/10/21/chartex" xmlns:cx3="http://schemas.microsoft.com/office/drawing/2016/5/9/chartex" xmlns:cx4="http://schemas.microsoft.com/office/drawing/2016/5/10/chartex" xmlns:cx5="http://schemas.microsoft.com/office/drawing/2016/5/11/chartex" xmlns:cx6="http://schemas.microsoft.com/office/drawing/2016/5/12/chartex" xmlns:cx7="http://schemas.microsoft.com/office/drawing/2016/5/13/chartex" xmlns:cx8="http://schemas.microsoft.com/office/drawing/2016/5/14/chartex" xmlns:mc="http://schemas.openxmlformats.org/markup-compatibility/2006" xmlns:aink="http://schemas.microsoft.com/office/drawing/2016/ink" xmlns:am3d="http://schemas.microsoft.com/office/drawing/2017/model3d" xmlns:o="urn:schemas-microsoft-com:office:office" xmlns:oel="http://schemas.microsoft.com/office/2019/extlst" xmlns:r="http://schemas.openxmlformats.org/officeDocument/2006/relationships" xmlns:m="http://schemas.openxmlformats.org/officeDocument/2006/math" xmlns:v="urn:schemas-microsoft-com:vml" xmlns:wp14="http://schemas.microsoft.com/office/word/2010/wordprocessingDrawing" xmlns:wp="http://schemas.openxmlformats.org/drawingml/2006/wordprocessingDrawing" xmlns:w10="urn:schemas-microsoft-com:office:word" xmlns:w="http://schemas.openxmlformats.org/wordprocessingml/2006/main" xmlns:w14="http://schemas.microsoft.com/office/word/2010/wordml" xmlns:w15="http://schemas.microsoft.com/office/word/2012/wordml" xmlns:w16cex="http://schemas.microsoft.com/office/word/2018/wordml/cex" xmlns:w16cid="http://schemas.microsoft.com/office/word/2016/wordml/cid" xmlns:w16="http://schemas.microsoft.com/office/word/2018/wordml" xmlns:w16du="http://schemas.microsoft.com/office/word/2023/wordml/word16du" xmlns:w16sdtdh="http://schemas.microsoft.com/office/word/2020/wordml/sdtdatahash" xmlns:w16sdtfl="http://schemas.microsoft.com/office/word/2024/wordml/sdtformatlock" xmlns:w16se="http://schemas.microsoft.com/office/word/2015/wordml/symex" xmlns:wpg="http://schemas.microsoft.com/office/word/2010/wordprocessingGroup" xmlns:wpi="http://schemas.microsoft.com/office/word/2010/wordprocessingInk" xmlns:wne="http://schemas.microsoft.com/office/word/2006/wordml" xmlns:wps="http://schemas.microsoft.com/office/word/2010/wordprocessingShape" mc:Ignorable="w14 w15 w16se w16cid w16 w16cex w16sdtdh w16sdtfl w16du wp14">
   <w:abstractNum w:abstractNumId="0" w15:restartNumberingAfterBreak="0">
-    <w:nsid w:val="0A8C3B3E"/>
+    <w:nsid w:val="063A023A"/>
     <w:multiLevelType w:val="hybridMultilevel"/>
-    <w:tmpl w:val="03A8B7B6"/>
-    <w:lvl w:ilvl="0" w:tplc="7964587C" w:tentative="1">
+    <w:tmpl w:val="1E56307A"/>
+    <w:lvl w:ilvl="0" w:tplc="42FE7186">
       <w:start w:val="1"/>
       <w:numFmt w:val="decimal"/>
       <w:lvlText w:val="%1."/>
@@ -40194,52 +40672,52 @@
         <w:bCs/>
       </w:rPr>
     </w:lvl>
-    <w:lvl w:ilvl="1" w:tplc="0B480636">
+    <w:lvl w:ilvl="1" w:tplc="A32EAC58">
       <w:numFmt w:val="decimal"/>
       <w:lvlText w:val=""/>
       <w:lvlJc w:val="left"/>
     </w:lvl>
-    <w:lvl w:ilvl="2" w:tplc="82C06B14">
+    <w:lvl w:ilvl="2" w:tplc="3806C852">
       <w:numFmt w:val="decimal"/>
       <w:lvlText w:val=""/>
       <w:lvlJc w:val="left"/>
     </w:lvl>
-    <w:lvl w:ilvl="3" w:tplc="3C3C3780">
+    <w:lvl w:ilvl="3" w:tplc="83B4146C">
       <w:numFmt w:val="decimal"/>
       <w:lvlText w:val=""/>
       <w:lvlJc w:val="left"/>
     </w:lvl>
-    <w:lvl w:ilvl="4" w:tplc="84A64D34">
+    <w:lvl w:ilvl="4" w:tplc="D66C99E2">
       <w:numFmt w:val="decimal"/>
       <w:lvlText w:val=""/>
       <w:lvlJc w:val="left"/>
     </w:lvl>
-    <w:lvl w:ilvl="5" w:tplc="4BB868F0">
+    <w:lvl w:ilvl="5" w:tplc="D7628C6C">
       <w:numFmt w:val="decimal"/>
       <w:lvlText w:val=""/>
       <w:lvlJc w:val="left"/>
     </w:lvl>
-    <w:lvl w:ilvl="6" w:tplc="4EF6ABBA">
+    <w:lvl w:ilvl="6" w:tplc="969AF79C">
       <w:numFmt w:val="decimal"/>
       <w:lvlText w:val=""/>
       <w:lvlJc w:val="left"/>
     </w:lvl>
-    <w:lvl w:ilvl="7" w:tplc="9654BDAA">
+    <w:lvl w:ilvl="7" w:tplc="C7244528">
       <w:numFmt w:val="decimal"/>
       <w:lvlText w:val=""/>
       <w:lvlJc w:val="left"/>
     </w:lvl>
-    <w:lvl w:ilvl="8" w:tplc="A260BC02">
+    <w:lvl w:ilvl="8" w:tplc="99EEEBCE">
       <w:numFmt w:val="decimal"/>
       <w:lvlText w:val=""/>
       <w:lvlJc w:val="left"/>
     </w:lvl>
   </w:abstractNum>
   <w:abstractNum w:abstractNumId="1" w15:restartNumberingAfterBreak="0">
-    <w:nsid w:val="11C15587"/>
+    <w:nsid w:val="0FB07F5C"/>
     <w:multiLevelType w:val="hybridMultilevel"/>
-    <w:tmpl w:val="D13CA024"/>
-    <w:lvl w:ilvl="0" w:tplc="17C2EFDE" w:tentative="1">
+    <w:tmpl w:val="77E06276"/>
+    <w:lvl w:ilvl="0" w:tplc="B770B466" w:tentative="1">
       <w:start w:val="1"/>
       <w:numFmt w:val="decimal"/>
       <w:lvlText w:val="%1."/>
@@ -40252,52 +40730,110 @@
         <w:bCs/>
       </w:rPr>
     </w:lvl>
-    <w:lvl w:ilvl="1" w:tplc="ABE2B1DA">
+    <w:lvl w:ilvl="1" w:tplc="507E4D30">
       <w:numFmt w:val="decimal"/>
       <w:lvlText w:val=""/>
       <w:lvlJc w:val="left"/>
     </w:lvl>
-    <w:lvl w:ilvl="2" w:tplc="9788C99C">
+    <w:lvl w:ilvl="2" w:tplc="A148E132">
       <w:numFmt w:val="decimal"/>
       <w:lvlText w:val=""/>
       <w:lvlJc w:val="left"/>
     </w:lvl>
-    <w:lvl w:ilvl="3" w:tplc="F1CE061C">
+    <w:lvl w:ilvl="3" w:tplc="CAC0A440">
       <w:numFmt w:val="decimal"/>
       <w:lvlText w:val=""/>
       <w:lvlJc w:val="left"/>
     </w:lvl>
-    <w:lvl w:ilvl="4" w:tplc="9BF22AB8">
+    <w:lvl w:ilvl="4" w:tplc="C9346C3C">
       <w:numFmt w:val="decimal"/>
       <w:lvlText w:val=""/>
       <w:lvlJc w:val="left"/>
     </w:lvl>
-    <w:lvl w:ilvl="5" w:tplc="2536E06C">
+    <w:lvl w:ilvl="5" w:tplc="D24067E0">
       <w:numFmt w:val="decimal"/>
       <w:lvlText w:val=""/>
       <w:lvlJc w:val="left"/>
     </w:lvl>
-    <w:lvl w:ilvl="6" w:tplc="334C560E">
+    <w:lvl w:ilvl="6" w:tplc="622491C2">
       <w:numFmt w:val="decimal"/>
       <w:lvlText w:val=""/>
       <w:lvlJc w:val="left"/>
     </w:lvl>
-    <w:lvl w:ilvl="7" w:tplc="E5BC0862">
+    <w:lvl w:ilvl="7" w:tplc="5DBE9C92">
       <w:numFmt w:val="decimal"/>
       <w:lvlText w:val=""/>
       <w:lvlJc w:val="left"/>
     </w:lvl>
-    <w:lvl w:ilvl="8" w:tplc="DB26C422">
+    <w:lvl w:ilvl="8" w:tplc="0DBE74E4">
       <w:numFmt w:val="decimal"/>
       <w:lvlText w:val=""/>
       <w:lvlJc w:val="left"/>
     </w:lvl>
   </w:abstractNum>
   <w:abstractNum w:abstractNumId="2" w15:restartNumberingAfterBreak="0">
-    <w:nsid w:val="15325038"/>
+    <w:nsid w:val="13915F92"/>
     <w:multiLevelType w:val="hybridMultilevel"/>
-    <w:tmpl w:val="91222C16"/>
-    <w:lvl w:ilvl="0" w:tplc="D2940F06" w:tentative="1">
+    <w:tmpl w:val="71703370"/>
+    <w:lvl w:ilvl="0" w:tplc="B4BC26B8">
+      <w:start w:val="1"/>
+      <w:numFmt w:val="bullet"/>
+      <w:lvlText w:val="•"/>
+      <w:lvlJc w:val="left"/>
+      <w:pPr>
+        <w:ind w:left="500" w:hanging="280"/>
+      </w:pPr>
+    </w:lvl>
+    <w:lvl w:ilvl="1" w:tplc="A588F118" w:tentative="1">
+      <w:start w:val="1"/>
+      <w:numFmt w:val="bullet"/>
+      <w:lvlText w:val="–"/>
+      <w:lvlJc w:val="left"/>
+      <w:pPr>
+        <w:ind w:left="950" w:hanging="280"/>
+      </w:pPr>
+    </w:lvl>
+    <w:lvl w:ilvl="2" w:tplc="E7F65974">
+      <w:numFmt w:val="decimal"/>
+      <w:lvlText w:val=""/>
+      <w:lvlJc w:val="left"/>
+    </w:lvl>
+    <w:lvl w:ilvl="3" w:tplc="0CE2804E">
+      <w:numFmt w:val="decimal"/>
+      <w:lvlText w:val=""/>
+      <w:lvlJc w:val="left"/>
+    </w:lvl>
+    <w:lvl w:ilvl="4" w:tplc="9DA2F6B4">
+      <w:numFmt w:val="decimal"/>
+      <w:lvlText w:val=""/>
+      <w:lvlJc w:val="left"/>
+    </w:lvl>
+    <w:lvl w:ilvl="5" w:tplc="FA623BF2">
+      <w:numFmt w:val="decimal"/>
+      <w:lvlText w:val=""/>
+      <w:lvlJc w:val="left"/>
+    </w:lvl>
+    <w:lvl w:ilvl="6" w:tplc="3316447C">
+      <w:numFmt w:val="decimal"/>
+      <w:lvlText w:val=""/>
+      <w:lvlJc w:val="left"/>
+    </w:lvl>
+    <w:lvl w:ilvl="7" w:tplc="9B2A10E4">
+      <w:numFmt w:val="decimal"/>
+      <w:lvlText w:val=""/>
+      <w:lvlJc w:val="left"/>
+    </w:lvl>
+    <w:lvl w:ilvl="8" w:tplc="69D81868">
+      <w:numFmt w:val="decimal"/>
+      <w:lvlText w:val=""/>
+      <w:lvlJc w:val="left"/>
+    </w:lvl>
+  </w:abstractNum>
+  <w:abstractNum w:abstractNumId="3" w15:restartNumberingAfterBreak="0">
+    <w:nsid w:val="14B768B4"/>
+    <w:multiLevelType w:val="hybridMultilevel"/>
+    <w:tmpl w:val="21AC04E8"/>
+    <w:lvl w:ilvl="0" w:tplc="87EC0DC6" w:tentative="1">
       <w:start w:val="1"/>
       <w:numFmt w:val="decimal"/>
       <w:lvlText w:val="%1."/>
@@ -40310,52 +40846,52 @@
         <w:bCs/>
       </w:rPr>
     </w:lvl>
-    <w:lvl w:ilvl="1" w:tplc="B6B4907A">
+    <w:lvl w:ilvl="1" w:tplc="B5004C42">
       <w:numFmt w:val="decimal"/>
       <w:lvlText w:val=""/>
       <w:lvlJc w:val="left"/>
     </w:lvl>
-    <w:lvl w:ilvl="2" w:tplc="403CACF2">
+    <w:lvl w:ilvl="2" w:tplc="D1FA1772">
       <w:numFmt w:val="decimal"/>
       <w:lvlText w:val=""/>
       <w:lvlJc w:val="left"/>
     </w:lvl>
-    <w:lvl w:ilvl="3" w:tplc="6B5E6EC4">
+    <w:lvl w:ilvl="3" w:tplc="EA6495CA">
       <w:numFmt w:val="decimal"/>
       <w:lvlText w:val=""/>
       <w:lvlJc w:val="left"/>
     </w:lvl>
-    <w:lvl w:ilvl="4" w:tplc="E4EE2182">
+    <w:lvl w:ilvl="4" w:tplc="0414CA48">
       <w:numFmt w:val="decimal"/>
       <w:lvlText w:val=""/>
       <w:lvlJc w:val="left"/>
     </w:lvl>
-    <w:lvl w:ilvl="5" w:tplc="D80A911C">
+    <w:lvl w:ilvl="5" w:tplc="BC5A78FE">
       <w:numFmt w:val="decimal"/>
       <w:lvlText w:val=""/>
       <w:lvlJc w:val="left"/>
     </w:lvl>
-    <w:lvl w:ilvl="6" w:tplc="51C09FE4">
+    <w:lvl w:ilvl="6" w:tplc="06B81698">
       <w:numFmt w:val="decimal"/>
       <w:lvlText w:val=""/>
       <w:lvlJc w:val="left"/>
     </w:lvl>
-    <w:lvl w:ilvl="7" w:tplc="92C640FA">
+    <w:lvl w:ilvl="7" w:tplc="209C5E6E">
       <w:numFmt w:val="decimal"/>
       <w:lvlText w:val=""/>
       <w:lvlJc w:val="left"/>
     </w:lvl>
-    <w:lvl w:ilvl="8" w:tplc="3BF8F2AC">
+    <w:lvl w:ilvl="8" w:tplc="1EA61900">
       <w:numFmt w:val="decimal"/>
       <w:lvlText w:val=""/>
       <w:lvlJc w:val="left"/>
     </w:lvl>
   </w:abstractNum>
-  <w:abstractNum w:abstractNumId="3" w15:restartNumberingAfterBreak="0">
-    <w:nsid w:val="20B9098B"/>
+  <w:abstractNum w:abstractNumId="4" w15:restartNumberingAfterBreak="0">
+    <w:nsid w:val="2573739F"/>
     <w:multiLevelType w:val="hybridMultilevel"/>
-    <w:tmpl w:val="B48CFBE8"/>
-    <w:lvl w:ilvl="0" w:tplc="80641940" w:tentative="1">
+    <w:tmpl w:val="F55ECA58"/>
+    <w:lvl w:ilvl="0" w:tplc="46ACC120" w:tentative="1">
       <w:start w:val="1"/>
       <w:numFmt w:val="decimal"/>
       <w:lvlText w:val="%1."/>
@@ -40368,52 +40904,52 @@
         <w:bCs/>
       </w:rPr>
     </w:lvl>
-    <w:lvl w:ilvl="1" w:tplc="ED1CE4BA">
+    <w:lvl w:ilvl="1" w:tplc="8B0AA40E">
       <w:numFmt w:val="decimal"/>
       <w:lvlText w:val=""/>
       <w:lvlJc w:val="left"/>
     </w:lvl>
-    <w:lvl w:ilvl="2" w:tplc="3A9CC54E">
+    <w:lvl w:ilvl="2" w:tplc="3C24A2FA">
       <w:numFmt w:val="decimal"/>
       <w:lvlText w:val=""/>
       <w:lvlJc w:val="left"/>
     </w:lvl>
-    <w:lvl w:ilvl="3" w:tplc="F6C23964">
+    <w:lvl w:ilvl="3" w:tplc="DA269472">
       <w:numFmt w:val="decimal"/>
       <w:lvlText w:val=""/>
       <w:lvlJc w:val="left"/>
     </w:lvl>
-    <w:lvl w:ilvl="4" w:tplc="2BACBC1C">
+    <w:lvl w:ilvl="4" w:tplc="88941ABA">
       <w:numFmt w:val="decimal"/>
       <w:lvlText w:val=""/>
       <w:lvlJc w:val="left"/>
     </w:lvl>
-    <w:lvl w:ilvl="5" w:tplc="05C00D06">
+    <w:lvl w:ilvl="5" w:tplc="9FDE8A38">
       <w:numFmt w:val="decimal"/>
       <w:lvlText w:val=""/>
       <w:lvlJc w:val="left"/>
     </w:lvl>
-    <w:lvl w:ilvl="6" w:tplc="E98AD29C">
+    <w:lvl w:ilvl="6" w:tplc="F4D64626">
       <w:numFmt w:val="decimal"/>
       <w:lvlText w:val=""/>
       <w:lvlJc w:val="left"/>
     </w:lvl>
-    <w:lvl w:ilvl="7" w:tplc="6A90A142">
+    <w:lvl w:ilvl="7" w:tplc="708AD628">
       <w:numFmt w:val="decimal"/>
       <w:lvlText w:val=""/>
       <w:lvlJc w:val="left"/>
     </w:lvl>
-    <w:lvl w:ilvl="8" w:tplc="D65ABDEA">
+    <w:lvl w:ilvl="8" w:tplc="75F487D0">
       <w:numFmt w:val="decimal"/>
       <w:lvlText w:val=""/>
       <w:lvlJc w:val="left"/>
     </w:lvl>
   </w:abstractNum>
-  <w:abstractNum w:abstractNumId="4" w15:restartNumberingAfterBreak="0">
-    <w:nsid w:val="23E40AF3"/>
+  <w:abstractNum w:abstractNumId="5" w15:restartNumberingAfterBreak="0">
+    <w:nsid w:val="3EB02996"/>
     <w:multiLevelType w:val="hybridMultilevel"/>
-    <w:tmpl w:val="588ED40A"/>
-    <w:lvl w:ilvl="0" w:tplc="38A44AEC">
+    <w:tmpl w:val="24287B3C"/>
+    <w:lvl w:ilvl="0" w:tplc="24509376" w:tentative="1">
       <w:start w:val="1"/>
       <w:numFmt w:val="decimal"/>
       <w:lvlText w:val="%1."/>
@@ -40426,52 +40962,52 @@
         <w:bCs/>
       </w:rPr>
     </w:lvl>
-    <w:lvl w:ilvl="1" w:tplc="92007F62">
+    <w:lvl w:ilvl="1" w:tplc="B66CD1CC">
       <w:numFmt w:val="decimal"/>
       <w:lvlText w:val=""/>
       <w:lvlJc w:val="left"/>
     </w:lvl>
-    <w:lvl w:ilvl="2" w:tplc="79F29F36">
+    <w:lvl w:ilvl="2" w:tplc="23584A48">
       <w:numFmt w:val="decimal"/>
       <w:lvlText w:val=""/>
       <w:lvlJc w:val="left"/>
     </w:lvl>
-    <w:lvl w:ilvl="3" w:tplc="81FC3870">
+    <w:lvl w:ilvl="3" w:tplc="2E306606">
       <w:numFmt w:val="decimal"/>
       <w:lvlText w:val=""/>
       <w:lvlJc w:val="left"/>
     </w:lvl>
-    <w:lvl w:ilvl="4" w:tplc="9E5A7FF2">
+    <w:lvl w:ilvl="4" w:tplc="533A5D5A">
       <w:numFmt w:val="decimal"/>
       <w:lvlText w:val=""/>
       <w:lvlJc w:val="left"/>
     </w:lvl>
-    <w:lvl w:ilvl="5" w:tplc="E4005C8E">
+    <w:lvl w:ilvl="5" w:tplc="D3423896">
       <w:numFmt w:val="decimal"/>
       <w:lvlText w:val=""/>
       <w:lvlJc w:val="left"/>
     </w:lvl>
-    <w:lvl w:ilvl="6" w:tplc="2C02D296">
+    <w:lvl w:ilvl="6" w:tplc="27CE8B86">
       <w:numFmt w:val="decimal"/>
       <w:lvlText w:val=""/>
       <w:lvlJc w:val="left"/>
     </w:lvl>
-    <w:lvl w:ilvl="7" w:tplc="812E364C">
+    <w:lvl w:ilvl="7" w:tplc="2E5E3984">
       <w:numFmt w:val="decimal"/>
       <w:lvlText w:val=""/>
       <w:lvlJc w:val="left"/>
     </w:lvl>
-    <w:lvl w:ilvl="8" w:tplc="49CEEC08">
+    <w:lvl w:ilvl="8" w:tplc="E7347BBE">
       <w:numFmt w:val="decimal"/>
       <w:lvlText w:val=""/>
       <w:lvlJc w:val="left"/>
     </w:lvl>
   </w:abstractNum>
-  <w:abstractNum w:abstractNumId="5" w15:restartNumberingAfterBreak="0">
-    <w:nsid w:val="438A3855"/>
+  <w:abstractNum w:abstractNumId="6" w15:restartNumberingAfterBreak="0">
+    <w:nsid w:val="42CF4746"/>
     <w:multiLevelType w:val="hybridMultilevel"/>
-    <w:tmpl w:val="CE309F92"/>
-    <w:lvl w:ilvl="0" w:tplc="15BADBBC" w:tentative="1">
+    <w:tmpl w:val="08DEA0C0"/>
+    <w:lvl w:ilvl="0" w:tplc="5CCC797C">
       <w:start w:val="1"/>
       <w:numFmt w:val="decimal"/>
       <w:lvlText w:val="%1."/>
@@ -40484,52 +41020,52 @@
         <w:bCs/>
       </w:rPr>
     </w:lvl>
-    <w:lvl w:ilvl="1" w:tplc="505A1792">
+    <w:lvl w:ilvl="1" w:tplc="F82C7BD6">
       <w:numFmt w:val="decimal"/>
       <w:lvlText w:val=""/>
       <w:lvlJc w:val="left"/>
     </w:lvl>
-    <w:lvl w:ilvl="2" w:tplc="8BBE688E">
+    <w:lvl w:ilvl="2" w:tplc="30E42B62">
       <w:numFmt w:val="decimal"/>
       <w:lvlText w:val=""/>
       <w:lvlJc w:val="left"/>
     </w:lvl>
-    <w:lvl w:ilvl="3" w:tplc="AC3CF01A">
+    <w:lvl w:ilvl="3" w:tplc="B916EF86">
       <w:numFmt w:val="decimal"/>
       <w:lvlText w:val=""/>
       <w:lvlJc w:val="left"/>
     </w:lvl>
-    <w:lvl w:ilvl="4" w:tplc="C882D1F0">
+    <w:lvl w:ilvl="4" w:tplc="944A4748">
       <w:numFmt w:val="decimal"/>
       <w:lvlText w:val=""/>
       <w:lvlJc w:val="left"/>
     </w:lvl>
-    <w:lvl w:ilvl="5" w:tplc="78A84D8C">
+    <w:lvl w:ilvl="5" w:tplc="F30CAD36">
       <w:numFmt w:val="decimal"/>
       <w:lvlText w:val=""/>
       <w:lvlJc w:val="left"/>
     </w:lvl>
-    <w:lvl w:ilvl="6" w:tplc="56F21DC2">
+    <w:lvl w:ilvl="6" w:tplc="603C521E">
       <w:numFmt w:val="decimal"/>
       <w:lvlText w:val=""/>
       <w:lvlJc w:val="left"/>
     </w:lvl>
-    <w:lvl w:ilvl="7" w:tplc="180258DC">
+    <w:lvl w:ilvl="7" w:tplc="C6C6337E">
       <w:numFmt w:val="decimal"/>
       <w:lvlText w:val=""/>
       <w:lvlJc w:val="left"/>
     </w:lvl>
-    <w:lvl w:ilvl="8" w:tplc="5CD6D2D0">
+    <w:lvl w:ilvl="8" w:tplc="E46801E0">
       <w:numFmt w:val="decimal"/>
       <w:lvlText w:val=""/>
       <w:lvlJc w:val="left"/>
     </w:lvl>
   </w:abstractNum>
-  <w:abstractNum w:abstractNumId="6" w15:restartNumberingAfterBreak="0">
-    <w:nsid w:val="46CF3EFA"/>
+  <w:abstractNum w:abstractNumId="7" w15:restartNumberingAfterBreak="0">
+    <w:nsid w:val="438B628A"/>
     <w:multiLevelType w:val="hybridMultilevel"/>
-    <w:tmpl w:val="9B3CCFEE"/>
-    <w:lvl w:ilvl="0" w:tplc="59683BF4" w:tentative="1">
+    <w:tmpl w:val="39DAABF8"/>
+    <w:lvl w:ilvl="0" w:tplc="BF72E88A" w:tentative="1">
       <w:start w:val="1"/>
       <w:numFmt w:val="decimal"/>
       <w:lvlText w:val="%1."/>
@@ -40542,52 +41078,52 @@
         <w:bCs/>
       </w:rPr>
     </w:lvl>
-    <w:lvl w:ilvl="1" w:tplc="51081364">
+    <w:lvl w:ilvl="1" w:tplc="B9EC4BE2">
       <w:numFmt w:val="decimal"/>
       <w:lvlText w:val=""/>
       <w:lvlJc w:val="left"/>
     </w:lvl>
-    <w:lvl w:ilvl="2" w:tplc="5920AFB2">
+    <w:lvl w:ilvl="2" w:tplc="97621F58">
       <w:numFmt w:val="decimal"/>
       <w:lvlText w:val=""/>
       <w:lvlJc w:val="left"/>
     </w:lvl>
-    <w:lvl w:ilvl="3" w:tplc="B4CA4D9A">
+    <w:lvl w:ilvl="3" w:tplc="C3BED718">
       <w:numFmt w:val="decimal"/>
       <w:lvlText w:val=""/>
       <w:lvlJc w:val="left"/>
     </w:lvl>
-    <w:lvl w:ilvl="4" w:tplc="6BD0AD58">
+    <w:lvl w:ilvl="4" w:tplc="65F865EE">
       <w:numFmt w:val="decimal"/>
       <w:lvlText w:val=""/>
       <w:lvlJc w:val="left"/>
     </w:lvl>
-    <w:lvl w:ilvl="5" w:tplc="BF86E96A">
+    <w:lvl w:ilvl="5" w:tplc="E1646FAE">
       <w:numFmt w:val="decimal"/>
       <w:lvlText w:val=""/>
       <w:lvlJc w:val="left"/>
     </w:lvl>
-    <w:lvl w:ilvl="6" w:tplc="06FA0648">
+    <w:lvl w:ilvl="6" w:tplc="F3326C00">
       <w:numFmt w:val="decimal"/>
       <w:lvlText w:val=""/>
       <w:lvlJc w:val="left"/>
     </w:lvl>
-    <w:lvl w:ilvl="7" w:tplc="334C6B8A">
+    <w:lvl w:ilvl="7" w:tplc="9AFA0E9C">
       <w:numFmt w:val="decimal"/>
       <w:lvlText w:val=""/>
       <w:lvlJc w:val="left"/>
     </w:lvl>
-    <w:lvl w:ilvl="8" w:tplc="12D4C4B6">
+    <w:lvl w:ilvl="8" w:tplc="E1ECADE6">
       <w:numFmt w:val="decimal"/>
       <w:lvlText w:val=""/>
       <w:lvlJc w:val="left"/>
     </w:lvl>
   </w:abstractNum>
-  <w:abstractNum w:abstractNumId="7" w15:restartNumberingAfterBreak="0">
-    <w:nsid w:val="4D213E9F"/>
+  <w:abstractNum w:abstractNumId="8" w15:restartNumberingAfterBreak="0">
+    <w:nsid w:val="4B485A9A"/>
     <w:multiLevelType w:val="hybridMultilevel"/>
-    <w:tmpl w:val="39BC6F20"/>
-    <w:lvl w:ilvl="0" w:tplc="90D25944">
+    <w:tmpl w:val="315CF77C"/>
+    <w:lvl w:ilvl="0" w:tplc="1C5E9D7A">
       <w:start w:val="1"/>
       <w:numFmt w:val="decimal"/>
       <w:lvlText w:val="%1."/>
@@ -40600,138 +41136,52 @@
         <w:bCs/>
       </w:rPr>
     </w:lvl>
-    <w:lvl w:ilvl="1" w:tplc="DF4A95F2">
+    <w:lvl w:ilvl="1" w:tplc="F7A65566">
       <w:numFmt w:val="decimal"/>
       <w:lvlText w:val=""/>
       <w:lvlJc w:val="left"/>
     </w:lvl>
-    <w:lvl w:ilvl="2" w:tplc="1354C652">
+    <w:lvl w:ilvl="2" w:tplc="7AB03A8A">
       <w:numFmt w:val="decimal"/>
       <w:lvlText w:val=""/>
       <w:lvlJc w:val="left"/>
     </w:lvl>
-    <w:lvl w:ilvl="3" w:tplc="D68A09DE">
+    <w:lvl w:ilvl="3" w:tplc="1EA64E58">
       <w:numFmt w:val="decimal"/>
       <w:lvlText w:val=""/>
       <w:lvlJc w:val="left"/>
     </w:lvl>
-    <w:lvl w:ilvl="4" w:tplc="FEFA7838">
+    <w:lvl w:ilvl="4" w:tplc="17CEB7B0">
       <w:numFmt w:val="decimal"/>
       <w:lvlText w:val=""/>
       <w:lvlJc w:val="left"/>
     </w:lvl>
-    <w:lvl w:ilvl="5" w:tplc="89727804">
+    <w:lvl w:ilvl="5" w:tplc="66540324">
       <w:numFmt w:val="decimal"/>
       <w:lvlText w:val=""/>
       <w:lvlJc w:val="left"/>
     </w:lvl>
-    <w:lvl w:ilvl="6" w:tplc="BBFE76C4">
+    <w:lvl w:ilvl="6" w:tplc="D954F77E">
       <w:numFmt w:val="decimal"/>
       <w:lvlText w:val=""/>
       <w:lvlJc w:val="left"/>
     </w:lvl>
-    <w:lvl w:ilvl="7" w:tplc="B350AAB6">
+    <w:lvl w:ilvl="7" w:tplc="1D2C8E66">
       <w:numFmt w:val="decimal"/>
       <w:lvlText w:val=""/>
       <w:lvlJc w:val="left"/>
     </w:lvl>
-    <w:lvl w:ilvl="8" w:tplc="8B0A73BA">
+    <w:lvl w:ilvl="8" w:tplc="5A74AAAE">
       <w:numFmt w:val="decimal"/>
       <w:lvlText w:val=""/>
       <w:lvlJc w:val="left"/>
     </w:lvl>
   </w:abstractNum>
-  <w:abstractNum w:abstractNumId="8" w15:restartNumberingAfterBreak="0">
-    <w:nsid w:val="539C4376"/>
+  <w:abstractNum w:abstractNumId="9" w15:restartNumberingAfterBreak="0">
+    <w:nsid w:val="55C83486"/>
     <w:multiLevelType w:val="hybridMultilevel"/>
-    <w:tmpl w:val="AC3E763C"/>
-    <w:lvl w:ilvl="0" w:tplc="7D80FB90" w:tentative="1">
-      <w:start w:val="1"/>
-      <w:numFmt w:val="bullet"/>
-      <w:lvlText w:val="●"/>
-      <w:lvlJc w:val="left"/>
-      <w:pPr>
-        <w:ind w:left="720" w:hanging="360"/>
-      </w:pPr>
-    </w:lvl>
-    <w:lvl w:ilvl="1" w:tplc="5EB4B982" w:tentative="1">
-      <w:start w:val="1"/>
-      <w:numFmt w:val="bullet"/>
-      <w:lvlText w:val="○"/>
-      <w:lvlJc w:val="left"/>
-      <w:pPr>
-        <w:ind w:left="1440" w:hanging="360"/>
-      </w:pPr>
-    </w:lvl>
-    <w:lvl w:ilvl="2" w:tplc="5646106A" w:tentative="1">
-      <w:start w:val="1"/>
-      <w:numFmt w:val="bullet"/>
-      <w:lvlText w:val="■"/>
-      <w:lvlJc w:val="left"/>
-      <w:pPr>
-        <w:ind w:left="2160" w:hanging="360"/>
-      </w:pPr>
-    </w:lvl>
-    <w:lvl w:ilvl="3" w:tplc="FC421DDA" w:tentative="1">
-      <w:start w:val="1"/>
-      <w:numFmt w:val="bullet"/>
-      <w:lvlText w:val="●"/>
-      <w:lvlJc w:val="left"/>
-      <w:pPr>
-        <w:ind w:left="2880" w:hanging="360"/>
-      </w:pPr>
-    </w:lvl>
-    <w:lvl w:ilvl="4" w:tplc="B082DEA8" w:tentative="1">
-      <w:start w:val="1"/>
-      <w:numFmt w:val="bullet"/>
-      <w:lvlText w:val="○"/>
-      <w:lvlJc w:val="left"/>
-      <w:pPr>
-        <w:ind w:left="3600" w:hanging="360"/>
-      </w:pPr>
-    </w:lvl>
-    <w:lvl w:ilvl="5" w:tplc="66368844" w:tentative="1">
-      <w:start w:val="1"/>
-      <w:numFmt w:val="bullet"/>
-      <w:lvlText w:val="■"/>
-      <w:lvlJc w:val="left"/>
-      <w:pPr>
-        <w:ind w:left="4320" w:hanging="360"/>
-      </w:pPr>
-    </w:lvl>
-    <w:lvl w:ilvl="6" w:tplc="36966D80" w:tentative="1">
-      <w:start w:val="1"/>
-      <w:numFmt w:val="bullet"/>
-      <w:lvlText w:val="●"/>
-      <w:lvlJc w:val="left"/>
-      <w:pPr>
-        <w:ind w:left="5040" w:hanging="360"/>
-      </w:pPr>
-    </w:lvl>
-    <w:lvl w:ilvl="7" w:tplc="576A048A" w:tentative="1">
-      <w:start w:val="1"/>
-      <w:numFmt w:val="bullet"/>
-      <w:lvlText w:val="●"/>
-      <w:lvlJc w:val="left"/>
-      <w:pPr>
-        <w:ind w:left="5760" w:hanging="360"/>
-      </w:pPr>
-    </w:lvl>
-    <w:lvl w:ilvl="8" w:tplc="9B5ED618" w:tentative="1">
-      <w:start w:val="1"/>
-      <w:numFmt w:val="bullet"/>
-      <w:lvlText w:val="●"/>
-      <w:lvlJc w:val="left"/>
-      <w:pPr>
-        <w:ind w:left="6480" w:hanging="360"/>
-      </w:pPr>
-    </w:lvl>
-  </w:abstractNum>
-  <w:abstractNum w:abstractNumId="9" w15:restartNumberingAfterBreak="0">
-    <w:nsid w:val="65F112F6"/>
-    <w:multiLevelType w:val="hybridMultilevel"/>
-    <w:tmpl w:val="42923850"/>
-    <w:lvl w:ilvl="0" w:tplc="E4A89D7A" w:tentative="1">
+    <w:tmpl w:val="55F03CD8"/>
+    <w:lvl w:ilvl="0" w:tplc="7CE85E2A" w:tentative="1">
       <w:start w:val="1"/>
       <w:numFmt w:val="decimal"/>
       <w:lvlText w:val="%1."/>
@@ -40744,52 +41194,52 @@
         <w:bCs/>
       </w:rPr>
     </w:lvl>
-    <w:lvl w:ilvl="1" w:tplc="D6C24CC6">
+    <w:lvl w:ilvl="1" w:tplc="F078EC86">
       <w:numFmt w:val="decimal"/>
       <w:lvlText w:val=""/>
       <w:lvlJc w:val="left"/>
     </w:lvl>
-    <w:lvl w:ilvl="2" w:tplc="CEAE6100">
+    <w:lvl w:ilvl="2" w:tplc="96AA92B0">
       <w:numFmt w:val="decimal"/>
       <w:lvlText w:val=""/>
       <w:lvlJc w:val="left"/>
     </w:lvl>
-    <w:lvl w:ilvl="3" w:tplc="A7B08506">
+    <w:lvl w:ilvl="3" w:tplc="D4E85C96">
       <w:numFmt w:val="decimal"/>
       <w:lvlText w:val=""/>
       <w:lvlJc w:val="left"/>
     </w:lvl>
-    <w:lvl w:ilvl="4" w:tplc="C630BF24">
+    <w:lvl w:ilvl="4" w:tplc="5A9C68B4">
       <w:numFmt w:val="decimal"/>
       <w:lvlText w:val=""/>
       <w:lvlJc w:val="left"/>
     </w:lvl>
-    <w:lvl w:ilvl="5" w:tplc="4408611C">
+    <w:lvl w:ilvl="5" w:tplc="364C88CE">
       <w:numFmt w:val="decimal"/>
       <w:lvlText w:val=""/>
       <w:lvlJc w:val="left"/>
     </w:lvl>
-    <w:lvl w:ilvl="6" w:tplc="01D836F0">
+    <w:lvl w:ilvl="6" w:tplc="D42C4A74">
       <w:numFmt w:val="decimal"/>
       <w:lvlText w:val=""/>
       <w:lvlJc w:val="left"/>
     </w:lvl>
-    <w:lvl w:ilvl="7" w:tplc="0396097E">
+    <w:lvl w:ilvl="7" w:tplc="B8DEB608">
       <w:numFmt w:val="decimal"/>
       <w:lvlText w:val=""/>
       <w:lvlJc w:val="left"/>
     </w:lvl>
-    <w:lvl w:ilvl="8" w:tplc="7BCCB734">
+    <w:lvl w:ilvl="8" w:tplc="CE0AF0B8">
       <w:numFmt w:val="decimal"/>
       <w:lvlText w:val=""/>
       <w:lvlJc w:val="left"/>
     </w:lvl>
   </w:abstractNum>
   <w:abstractNum w:abstractNumId="10" w15:restartNumberingAfterBreak="0">
-    <w:nsid w:val="721854AF"/>
+    <w:nsid w:val="61891C85"/>
     <w:multiLevelType w:val="hybridMultilevel"/>
-    <w:tmpl w:val="F67A2A30"/>
-    <w:lvl w:ilvl="0" w:tplc="C2002D34" w:tentative="1">
+    <w:tmpl w:val="8FAAFC4A"/>
+    <w:lvl w:ilvl="0" w:tplc="5184A90A" w:tentative="1">
       <w:start w:val="1"/>
       <w:numFmt w:val="decimal"/>
       <w:lvlText w:val="%1."/>
@@ -40802,52 +41252,52 @@
         <w:bCs/>
       </w:rPr>
     </w:lvl>
-    <w:lvl w:ilvl="1" w:tplc="90404F8A">
+    <w:lvl w:ilvl="1" w:tplc="6C487460">
       <w:numFmt w:val="decimal"/>
       <w:lvlText w:val=""/>
       <w:lvlJc w:val="left"/>
     </w:lvl>
-    <w:lvl w:ilvl="2" w:tplc="F3022078">
+    <w:lvl w:ilvl="2" w:tplc="0C7A13F6">
       <w:numFmt w:val="decimal"/>
       <w:lvlText w:val=""/>
       <w:lvlJc w:val="left"/>
     </w:lvl>
-    <w:lvl w:ilvl="3" w:tplc="167E5B20">
+    <w:lvl w:ilvl="3" w:tplc="44828B0E">
       <w:numFmt w:val="decimal"/>
       <w:lvlText w:val=""/>
       <w:lvlJc w:val="left"/>
     </w:lvl>
-    <w:lvl w:ilvl="4" w:tplc="58DC4426">
+    <w:lvl w:ilvl="4" w:tplc="FEA00B30">
       <w:numFmt w:val="decimal"/>
       <w:lvlText w:val=""/>
       <w:lvlJc w:val="left"/>
     </w:lvl>
-    <w:lvl w:ilvl="5" w:tplc="C7A8263E">
+    <w:lvl w:ilvl="5" w:tplc="B0A2D7DC">
       <w:numFmt w:val="decimal"/>
       <w:lvlText w:val=""/>
       <w:lvlJc w:val="left"/>
     </w:lvl>
-    <w:lvl w:ilvl="6" w:tplc="8ED86B1A">
+    <w:lvl w:ilvl="6" w:tplc="B1FED516">
       <w:numFmt w:val="decimal"/>
       <w:lvlText w:val=""/>
       <w:lvlJc w:val="left"/>
     </w:lvl>
-    <w:lvl w:ilvl="7" w:tplc="32869BB2">
+    <w:lvl w:ilvl="7" w:tplc="290C096A">
       <w:numFmt w:val="decimal"/>
       <w:lvlText w:val=""/>
       <w:lvlJc w:val="left"/>
     </w:lvl>
-    <w:lvl w:ilvl="8" w:tplc="7D04A110">
+    <w:lvl w:ilvl="8" w:tplc="9064BF66">
       <w:numFmt w:val="decimal"/>
       <w:lvlText w:val=""/>
       <w:lvlJc w:val="left"/>
     </w:lvl>
   </w:abstractNum>
   <w:abstractNum w:abstractNumId="11" w15:restartNumberingAfterBreak="0">
-    <w:nsid w:val="736D79C7"/>
+    <w:nsid w:val="6FCD61A9"/>
     <w:multiLevelType w:val="hybridMultilevel"/>
-    <w:tmpl w:val="17D47BF8"/>
-    <w:lvl w:ilvl="0" w:tplc="4664C0F2" w:tentative="1">
+    <w:tmpl w:val="C91479C8"/>
+    <w:lvl w:ilvl="0" w:tplc="4D16C074" w:tentative="1">
       <w:start w:val="1"/>
       <w:numFmt w:val="decimal"/>
       <w:lvlText w:val="%1."/>
@@ -40860,52 +41310,138 @@
         <w:bCs/>
       </w:rPr>
     </w:lvl>
-    <w:lvl w:ilvl="1" w:tplc="7B2E0786">
+    <w:lvl w:ilvl="1" w:tplc="94A4C6A6">
       <w:numFmt w:val="decimal"/>
       <w:lvlText w:val=""/>
       <w:lvlJc w:val="left"/>
     </w:lvl>
-    <w:lvl w:ilvl="2" w:tplc="01B624FC">
+    <w:lvl w:ilvl="2" w:tplc="83DC3168">
       <w:numFmt w:val="decimal"/>
       <w:lvlText w:val=""/>
       <w:lvlJc w:val="left"/>
     </w:lvl>
-    <w:lvl w:ilvl="3" w:tplc="21BC6F62">
+    <w:lvl w:ilvl="3" w:tplc="E870B730">
       <w:numFmt w:val="decimal"/>
       <w:lvlText w:val=""/>
       <w:lvlJc w:val="left"/>
     </w:lvl>
-    <w:lvl w:ilvl="4" w:tplc="90187122">
+    <w:lvl w:ilvl="4" w:tplc="1DEC43CE">
       <w:numFmt w:val="decimal"/>
       <w:lvlText w:val=""/>
       <w:lvlJc w:val="left"/>
     </w:lvl>
-    <w:lvl w:ilvl="5" w:tplc="A57894B4">
+    <w:lvl w:ilvl="5" w:tplc="8E2240D0">
       <w:numFmt w:val="decimal"/>
       <w:lvlText w:val=""/>
       <w:lvlJc w:val="left"/>
     </w:lvl>
-    <w:lvl w:ilvl="6" w:tplc="2A9E3C5E">
+    <w:lvl w:ilvl="6" w:tplc="CFF8F184">
       <w:numFmt w:val="decimal"/>
       <w:lvlText w:val=""/>
       <w:lvlJc w:val="left"/>
     </w:lvl>
-    <w:lvl w:ilvl="7" w:tplc="63147E28">
+    <w:lvl w:ilvl="7" w:tplc="D90E741A">
       <w:numFmt w:val="decimal"/>
       <w:lvlText w:val=""/>
       <w:lvlJc w:val="left"/>
     </w:lvl>
-    <w:lvl w:ilvl="8" w:tplc="6916D1E8">
+    <w:lvl w:ilvl="8" w:tplc="77684BF6">
       <w:numFmt w:val="decimal"/>
       <w:lvlText w:val=""/>
       <w:lvlJc w:val="left"/>
     </w:lvl>
   </w:abstractNum>
   <w:abstractNum w:abstractNumId="12" w15:restartNumberingAfterBreak="0">
-    <w:nsid w:val="77F82962"/>
+    <w:nsid w:val="72806F69"/>
     <w:multiLevelType w:val="hybridMultilevel"/>
-    <w:tmpl w:val="AD8EA4F4"/>
-    <w:lvl w:ilvl="0" w:tplc="BD2CC3FE" w:tentative="1">
+    <w:tmpl w:val="6ED8F072"/>
+    <w:lvl w:ilvl="0" w:tplc="CA9A13FC" w:tentative="1">
+      <w:start w:val="1"/>
+      <w:numFmt w:val="bullet"/>
+      <w:lvlText w:val="●"/>
+      <w:lvlJc w:val="left"/>
+      <w:pPr>
+        <w:ind w:left="720" w:hanging="360"/>
+      </w:pPr>
+    </w:lvl>
+    <w:lvl w:ilvl="1" w:tplc="EC204122" w:tentative="1">
+      <w:start w:val="1"/>
+      <w:numFmt w:val="bullet"/>
+      <w:lvlText w:val="○"/>
+      <w:lvlJc w:val="left"/>
+      <w:pPr>
+        <w:ind w:left="1440" w:hanging="360"/>
+      </w:pPr>
+    </w:lvl>
+    <w:lvl w:ilvl="2" w:tplc="286ADA2E" w:tentative="1">
+      <w:start w:val="1"/>
+      <w:numFmt w:val="bullet"/>
+      <w:lvlText w:val="■"/>
+      <w:lvlJc w:val="left"/>
+      <w:pPr>
+        <w:ind w:left="2160" w:hanging="360"/>
+      </w:pPr>
+    </w:lvl>
+    <w:lvl w:ilvl="3" w:tplc="C9925B30" w:tentative="1">
+      <w:start w:val="1"/>
+      <w:numFmt w:val="bullet"/>
+      <w:lvlText w:val="●"/>
+      <w:lvlJc w:val="left"/>
+      <w:pPr>
+        <w:ind w:left="2880" w:hanging="360"/>
+      </w:pPr>
+    </w:lvl>
+    <w:lvl w:ilvl="4" w:tplc="B20AABD8" w:tentative="1">
+      <w:start w:val="1"/>
+      <w:numFmt w:val="bullet"/>
+      <w:lvlText w:val="○"/>
+      <w:lvlJc w:val="left"/>
+      <w:pPr>
+        <w:ind w:left="3600" w:hanging="360"/>
+      </w:pPr>
+    </w:lvl>
+    <w:lvl w:ilvl="5" w:tplc="F46A4374" w:tentative="1">
+      <w:start w:val="1"/>
+      <w:numFmt w:val="bullet"/>
+      <w:lvlText w:val="■"/>
+      <w:lvlJc w:val="left"/>
+      <w:pPr>
+        <w:ind w:left="4320" w:hanging="360"/>
+      </w:pPr>
+    </w:lvl>
+    <w:lvl w:ilvl="6" w:tplc="246EFEA2" w:tentative="1">
+      <w:start w:val="1"/>
+      <w:numFmt w:val="bullet"/>
+      <w:lvlText w:val="●"/>
+      <w:lvlJc w:val="left"/>
+      <w:pPr>
+        <w:ind w:left="5040" w:hanging="360"/>
+      </w:pPr>
+    </w:lvl>
+    <w:lvl w:ilvl="7" w:tplc="23EEC772" w:tentative="1">
+      <w:start w:val="1"/>
+      <w:numFmt w:val="bullet"/>
+      <w:lvlText w:val="●"/>
+      <w:lvlJc w:val="left"/>
+      <w:pPr>
+        <w:ind w:left="5760" w:hanging="360"/>
+      </w:pPr>
+    </w:lvl>
+    <w:lvl w:ilvl="8" w:tplc="E3B2A694" w:tentative="1">
+      <w:start w:val="1"/>
+      <w:numFmt w:val="bullet"/>
+      <w:lvlText w:val="●"/>
+      <w:lvlJc w:val="left"/>
+      <w:pPr>
+        <w:ind w:left="6480" w:hanging="360"/>
+      </w:pPr>
+    </w:lvl>
+  </w:abstractNum>
+  <w:abstractNum w:abstractNumId="13" w15:restartNumberingAfterBreak="0">
+    <w:nsid w:val="72AF7D03"/>
+    <w:multiLevelType w:val="hybridMultilevel"/>
+    <w:tmpl w:val="8356D7C8"/>
+    <w:lvl w:ilvl="0" w:tplc="B9DC9DD6" w:tentative="1">
       <w:start w:val="1"/>
       <w:numFmt w:val="decimal"/>
       <w:lvlText w:val="%1."/>
@@ -40918,110 +41454,52 @@
         <w:bCs/>
       </w:rPr>
     </w:lvl>
-    <w:lvl w:ilvl="1" w:tplc="5C1C17AE">
+    <w:lvl w:ilvl="1" w:tplc="A5E27124">
       <w:numFmt w:val="decimal"/>
       <w:lvlText w:val=""/>
       <w:lvlJc w:val="left"/>
     </w:lvl>
-    <w:lvl w:ilvl="2" w:tplc="E5D495B4">
+    <w:lvl w:ilvl="2" w:tplc="0FCC6F6C">
       <w:numFmt w:val="decimal"/>
       <w:lvlText w:val=""/>
       <w:lvlJc w:val="left"/>
     </w:lvl>
-    <w:lvl w:ilvl="3" w:tplc="B3847306">
+    <w:lvl w:ilvl="3" w:tplc="004000A0">
       <w:numFmt w:val="decimal"/>
       <w:lvlText w:val=""/>
       <w:lvlJc w:val="left"/>
     </w:lvl>
-    <w:lvl w:ilvl="4" w:tplc="3B605FE4">
+    <w:lvl w:ilvl="4" w:tplc="6D68A0AA">
       <w:numFmt w:val="decimal"/>
       <w:lvlText w:val=""/>
       <w:lvlJc w:val="left"/>
     </w:lvl>
-    <w:lvl w:ilvl="5" w:tplc="3566E8CC">
+    <w:lvl w:ilvl="5" w:tplc="1732202C">
       <w:numFmt w:val="decimal"/>
       <w:lvlText w:val=""/>
       <w:lvlJc w:val="left"/>
     </w:lvl>
-    <w:lvl w:ilvl="6" w:tplc="84C4FB78">
+    <w:lvl w:ilvl="6" w:tplc="7B12DC0E">
       <w:numFmt w:val="decimal"/>
       <w:lvlText w:val=""/>
       <w:lvlJc w:val="left"/>
     </w:lvl>
-    <w:lvl w:ilvl="7" w:tplc="BA82ACA4">
+    <w:lvl w:ilvl="7" w:tplc="98BE4E18">
       <w:numFmt w:val="decimal"/>
       <w:lvlText w:val=""/>
       <w:lvlJc w:val="left"/>
     </w:lvl>
-    <w:lvl w:ilvl="8" w:tplc="BEA0810A">
-      <w:numFmt w:val="decimal"/>
-      <w:lvlText w:val=""/>
-      <w:lvlJc w:val="left"/>
-    </w:lvl>
-  </w:abstractNum>
-  <w:abstractNum w:abstractNumId="13" w15:restartNumberingAfterBreak="0">
-    <w:nsid w:val="792E2B93"/>
-    <w:multiLevelType w:val="hybridMultilevel"/>
-    <w:tmpl w:val="E15C484C"/>
-    <w:lvl w:ilvl="0" w:tplc="1CA2C878">
-      <w:start w:val="1"/>
-      <w:numFmt w:val="bullet"/>
-      <w:lvlText w:val="•"/>
-      <w:lvlJc w:val="left"/>
-      <w:pPr>
-        <w:ind w:left="500" w:hanging="280"/>
-      </w:pPr>
-    </w:lvl>
-    <w:lvl w:ilvl="1" w:tplc="3B269A72" w:tentative="1">
-      <w:start w:val="1"/>
-      <w:numFmt w:val="bullet"/>
-      <w:lvlText w:val="–"/>
-      <w:lvlJc w:val="left"/>
-      <w:pPr>
-        <w:ind w:left="950" w:hanging="280"/>
-      </w:pPr>
-    </w:lvl>
-    <w:lvl w:ilvl="2" w:tplc="9F8C44BE">
-      <w:numFmt w:val="decimal"/>
-      <w:lvlText w:val=""/>
-      <w:lvlJc w:val="left"/>
-    </w:lvl>
-    <w:lvl w:ilvl="3" w:tplc="B054F30A">
-      <w:numFmt w:val="decimal"/>
-      <w:lvlText w:val=""/>
-      <w:lvlJc w:val="left"/>
-    </w:lvl>
-    <w:lvl w:ilvl="4" w:tplc="8ADE105E">
-      <w:numFmt w:val="decimal"/>
-      <w:lvlText w:val=""/>
-      <w:lvlJc w:val="left"/>
-    </w:lvl>
-    <w:lvl w:ilvl="5" w:tplc="410841E6">
-      <w:numFmt w:val="decimal"/>
-      <w:lvlText w:val=""/>
-      <w:lvlJc w:val="left"/>
-    </w:lvl>
-    <w:lvl w:ilvl="6" w:tplc="900CB7DA">
-      <w:numFmt w:val="decimal"/>
-      <w:lvlText w:val=""/>
-      <w:lvlJc w:val="left"/>
-    </w:lvl>
-    <w:lvl w:ilvl="7" w:tplc="C8F63DF8">
-      <w:numFmt w:val="decimal"/>
-      <w:lvlText w:val=""/>
-      <w:lvlJc w:val="left"/>
-    </w:lvl>
-    <w:lvl w:ilvl="8" w:tplc="D0CA6992">
+    <w:lvl w:ilvl="8" w:tplc="71C069D0">
       <w:numFmt w:val="decimal"/>
       <w:lvlText w:val=""/>
       <w:lvlJc w:val="left"/>
     </w:lvl>
   </w:abstractNum>
   <w:abstractNum w:abstractNumId="14" w15:restartNumberingAfterBreak="0">
-    <w:nsid w:val="7C6B586E"/>
+    <w:nsid w:val="74BE7914"/>
     <w:multiLevelType w:val="hybridMultilevel"/>
-    <w:tmpl w:val="845A05E8"/>
-    <w:lvl w:ilvl="0" w:tplc="E90ABEBE">
+    <w:tmpl w:val="6BC01B50"/>
+    <w:lvl w:ilvl="0" w:tplc="31364A10" w:tentative="1">
       <w:start w:val="1"/>
       <w:numFmt w:val="decimal"/>
       <w:lvlText w:val="%1."/>
@@ -41034,73 +41512,73 @@
         <w:bCs/>
       </w:rPr>
     </w:lvl>
-    <w:lvl w:ilvl="1" w:tplc="13DC39EA">
+    <w:lvl w:ilvl="1" w:tplc="A2A89D62">
       <w:numFmt w:val="decimal"/>
       <w:lvlText w:val=""/>
       <w:lvlJc w:val="left"/>
     </w:lvl>
-    <w:lvl w:ilvl="2" w:tplc="1804AADA">
+    <w:lvl w:ilvl="2" w:tplc="25AEFC92">
       <w:numFmt w:val="decimal"/>
       <w:lvlText w:val=""/>
       <w:lvlJc w:val="left"/>
     </w:lvl>
-    <w:lvl w:ilvl="3" w:tplc="0810B7A2">
+    <w:lvl w:ilvl="3" w:tplc="231EBDE6">
       <w:numFmt w:val="decimal"/>
       <w:lvlText w:val=""/>
       <w:lvlJc w:val="left"/>
     </w:lvl>
-    <w:lvl w:ilvl="4" w:tplc="49688F84">
+    <w:lvl w:ilvl="4" w:tplc="BF8045D4">
       <w:numFmt w:val="decimal"/>
       <w:lvlText w:val=""/>
       <w:lvlJc w:val="left"/>
     </w:lvl>
-    <w:lvl w:ilvl="5" w:tplc="4F283972">
+    <w:lvl w:ilvl="5" w:tplc="35A2E60A">
       <w:numFmt w:val="decimal"/>
       <w:lvlText w:val=""/>
       <w:lvlJc w:val="left"/>
     </w:lvl>
-    <w:lvl w:ilvl="6" w:tplc="596A9CCA">
+    <w:lvl w:ilvl="6" w:tplc="9BB8689E">
       <w:numFmt w:val="decimal"/>
       <w:lvlText w:val=""/>
       <w:lvlJc w:val="left"/>
     </w:lvl>
-    <w:lvl w:ilvl="7" w:tplc="839A115E">
+    <w:lvl w:ilvl="7" w:tplc="E6225C46">
       <w:numFmt w:val="decimal"/>
       <w:lvlText w:val=""/>
       <w:lvlJc w:val="left"/>
     </w:lvl>
-    <w:lvl w:ilvl="8" w:tplc="B7C6AD9A">
+    <w:lvl w:ilvl="8" w:tplc="5A6A1990">
       <w:numFmt w:val="decimal"/>
       <w:lvlText w:val=""/>
       <w:lvlJc w:val="left"/>
     </w:lvl>
   </w:abstractNum>
-  <w:num w:numId="1" w16cid:durableId="1526821988">
-    <w:abstractNumId w:val="8"/>
+  <w:num w:numId="1" w16cid:durableId="1358002789">
+    <w:abstractNumId w:val="12"/>
     <w:lvlOverride w:ilvl="0">
       <w:startOverride w:val="1"/>
     </w:lvlOverride>
   </w:num>
-  <w:num w:numId="2" w16cid:durableId="842865855">
-    <w:abstractNumId w:val="13"/>
+  <w:num w:numId="2" w16cid:durableId="1078526765">
+    <w:abstractNumId w:val="2"/>
     <w:lvlOverride w:ilvl="0">
       <w:startOverride w:val="1"/>
     </w:lvlOverride>
   </w:num>
-  <w:num w:numId="3" w16cid:durableId="1998071476">
-    <w:abstractNumId w:val="14"/>
+  <w:num w:numId="3" w16cid:durableId="1513370818">
+    <w:abstractNumId w:val="0"/>
     <w:lvlOverride w:ilvl="0">
       <w:startOverride w:val="1"/>
     </w:lvlOverride>
   </w:num>
-  <w:num w:numId="4" w16cid:durableId="615063490">
-    <w:abstractNumId w:val="7"/>
+  <w:num w:numId="4" w16cid:durableId="2073000352">
+    <w:abstractNumId w:val="6"/>
     <w:lvlOverride w:ilvl="0">
       <w:startOverride w:val="1"/>
     </w:lvlOverride>
   </w:num>
-  <w:num w:numId="5" w16cid:durableId="402457102">
-    <w:abstractNumId w:val="4"/>
+  <w:num w:numId="5" w16cid:durableId="695622191">
+    <w:abstractNumId w:val="8"/>
     <w:lvlOverride w:ilvl="0">
       <w:startOverride w:val="1"/>
     </w:lvlOverride>
@@ -41798,7 +42276,7 @@
     <w:autoRedefine/>
     <w:uiPriority w:val="39"/>
     <w:unhideWhenUsed/>
-    <w:rsid w:val="00597628"/>
+    <w:rsid w:val="00B6324D"/>
     <w:pPr>
       <w:spacing w:after="100"/>
     </w:pPr>
@@ -41810,7 +42288,7 @@
     <w:autoRedefine/>
     <w:uiPriority w:val="39"/>
     <w:unhideWhenUsed/>
-    <w:rsid w:val="00597628"/>
+    <w:rsid w:val="00B6324D"/>
     <w:pPr>
       <w:spacing w:after="100"/>
       <w:ind w:left="220"/>

</xml_diff>